<commit_message>
V1.12.1 - enriched industry vertical list
</commit_message>
<xml_diff>
--- a/planet_it_maturity_assessment_template.docx
+++ b/planet_it_maturity_assessment_template.docx
@@ -11,7 +11,79 @@
           <w:noProof/>
         </w:rPr>
         <w:drawing>
-          <wp:anchor distT="0" distB="0" distL="114300" distR="114300" simplePos="0" relativeHeight="251657218" behindDoc="0" locked="0" layoutInCell="1" allowOverlap="1" wp14:anchorId="52E05962" wp14:editId="1F7E8E59">
+          <wp:anchor distT="0" distB="0" distL="114300" distR="114300" simplePos="0" relativeHeight="251657216" behindDoc="0" locked="0" layoutInCell="1" allowOverlap="1" wp14:anchorId="4F2D5C5B" wp14:editId="0A7E8430">
+            <wp:simplePos x="0" y="0"/>
+            <wp:positionH relativeFrom="column">
+              <wp:posOffset>-977265</wp:posOffset>
+            </wp:positionH>
+            <wp:positionV relativeFrom="paragraph">
+              <wp:posOffset>-1261110</wp:posOffset>
+            </wp:positionV>
+            <wp:extent cx="7619365" cy="10748645"/>
+            <wp:effectExtent l="0" t="0" r="635" b="0"/>
+            <wp:wrapNone/>
+            <wp:docPr id="3" name="Picture 3"/>
+            <wp:cNvGraphicFramePr>
+              <a:graphicFrameLocks xmlns:a="http://schemas.openxmlformats.org/drawingml/2006/main" noChangeAspect="1"/>
+            </wp:cNvGraphicFramePr>
+            <a:graphic xmlns:a="http://schemas.openxmlformats.org/drawingml/2006/main">
+              <a:graphicData uri="http://schemas.openxmlformats.org/drawingml/2006/picture">
+                <pic:pic xmlns:pic="http://schemas.openxmlformats.org/drawingml/2006/picture">
+                  <pic:nvPicPr>
+                    <pic:cNvPr id="3" name="Picture 3"/>
+                    <pic:cNvPicPr>
+                      <a:picLocks noChangeAspect="1"/>
+                    </pic:cNvPicPr>
+                  </pic:nvPicPr>
+                  <pic:blipFill>
+                    <a:blip r:embed="rId11">
+                      <a:extLst>
+                        <a:ext uri="{28A0092B-C50C-407E-A947-70E740481C1C}">
+                          <a14:useLocalDpi xmlns:a14="http://schemas.microsoft.com/office/drawing/2010/main" val="0"/>
+                        </a:ext>
+                      </a:extLst>
+                    </a:blip>
+                    <a:srcRect t="34" b="34"/>
+                    <a:stretch>
+                      <a:fillRect/>
+                    </a:stretch>
+                  </pic:blipFill>
+                  <pic:spPr bwMode="auto">
+                    <a:xfrm>
+                      <a:off x="0" y="0"/>
+                      <a:ext cx="7619365" cy="10748645"/>
+                    </a:xfrm>
+                    <a:prstGeom prst="rect">
+                      <a:avLst/>
+                    </a:prstGeom>
+                    <a:ln>
+                      <a:noFill/>
+                    </a:ln>
+                    <a:extLst>
+                      <a:ext uri="{53640926-AAD7-44D8-BBD7-CCE9431645EC}">
+                        <a14:shadowObscured xmlns:a14="http://schemas.microsoft.com/office/drawing/2010/main"/>
+                      </a:ext>
+                    </a:extLst>
+                  </pic:spPr>
+                </pic:pic>
+              </a:graphicData>
+            </a:graphic>
+            <wp14:sizeRelH relativeFrom="margin">
+              <wp14:pctWidth>0</wp14:pctWidth>
+            </wp14:sizeRelH>
+            <wp14:sizeRelV relativeFrom="margin">
+              <wp14:pctHeight>0</wp14:pctHeight>
+            </wp14:sizeRelV>
+          </wp:anchor>
+        </w:drawing>
+      </w:r>
+      <w:r>
+        <w:rPr>
+          <w:bCs/>
+          <w:noProof/>
+        </w:rPr>
+        <w:drawing>
+          <wp:anchor distT="0" distB="0" distL="114300" distR="114300" simplePos="0" relativeHeight="251657218" behindDoc="0" locked="0" layoutInCell="1" allowOverlap="1" wp14:anchorId="52E05962" wp14:editId="492AD01B">
             <wp:simplePos x="0" y="0"/>
             <wp:positionH relativeFrom="column">
               <wp:posOffset>-99695</wp:posOffset>
@@ -34,7 +106,7 @@
                     <pic:cNvPicPr/>
                   </pic:nvPicPr>
                   <pic:blipFill>
-                    <a:blip r:embed="rId11">
+                    <a:blip r:embed="rId12">
                       <a:extLst>
                         <a:ext uri="{28A0092B-C50C-407E-A947-70E740481C1C}">
                           <a14:useLocalDpi xmlns:a14="http://schemas.microsoft.com/office/drawing/2010/main" val="0"/>
@@ -61,180 +133,6 @@
               <wp14:pctWidth>0</wp14:pctWidth>
             </wp14:sizeRelH>
             <wp14:sizeRelV relativeFrom="page">
-              <wp14:pctHeight>0</wp14:pctHeight>
-            </wp14:sizeRelV>
-          </wp:anchor>
-        </w:drawing>
-      </w:r>
-      <w:r>
-        <w:rPr>
-          <w:bCs/>
-          <w:noProof/>
-        </w:rPr>
-        <mc:AlternateContent>
-          <mc:Choice Requires="wps">
-            <w:drawing>
-              <wp:anchor distT="0" distB="0" distL="114300" distR="114300" simplePos="0" relativeHeight="251657217" behindDoc="0" locked="0" layoutInCell="1" allowOverlap="1" wp14:anchorId="315D2796" wp14:editId="1CB24A56">
-                <wp:simplePos x="0" y="0"/>
-                <wp:positionH relativeFrom="page">
-                  <wp:posOffset>-53431</wp:posOffset>
-                </wp:positionH>
-                <wp:positionV relativeFrom="paragraph">
-                  <wp:posOffset>-1224280</wp:posOffset>
-                </wp:positionV>
-                <wp:extent cx="7622540" cy="10981690"/>
-                <wp:effectExtent l="0" t="0" r="0" b="3810"/>
-                <wp:wrapNone/>
-                <wp:docPr id="1" name="Rectangle 1"/>
-                <wp:cNvGraphicFramePr/>
-                <a:graphic xmlns:a="http://schemas.openxmlformats.org/drawingml/2006/main">
-                  <a:graphicData uri="http://schemas.microsoft.com/office/word/2010/wordprocessingShape">
-                    <wps:wsp>
-                      <wps:cNvSpPr/>
-                      <wps:spPr>
-                        <a:xfrm>
-                          <a:off x="0" y="0"/>
-                          <a:ext cx="7622540" cy="10981690"/>
-                        </a:xfrm>
-                        <a:prstGeom prst="rect">
-                          <a:avLst/>
-                        </a:prstGeom>
-                        <a:solidFill>
-                          <a:srgbClr val="03546E">
-                            <a:alpha val="74902"/>
-                          </a:srgbClr>
-                        </a:solidFill>
-                        <a:ln>
-                          <a:noFill/>
-                        </a:ln>
-                      </wps:spPr>
-                      <wps:style>
-                        <a:lnRef idx="2">
-                          <a:schemeClr val="accent1">
-                            <a:shade val="50000"/>
-                          </a:schemeClr>
-                        </a:lnRef>
-                        <a:fillRef idx="1">
-                          <a:schemeClr val="accent1"/>
-                        </a:fillRef>
-                        <a:effectRef idx="0">
-                          <a:schemeClr val="accent1"/>
-                        </a:effectRef>
-                        <a:fontRef idx="minor">
-                          <a:schemeClr val="lt1"/>
-                        </a:fontRef>
-                      </wps:style>
-                      <wps:txbx>
-                        <w:txbxContent>
-                          <w:p>
-                            <w:pPr>
-                              <w:jc w:val="center"/>
-                            </w:pPr>
-                          </w:p>
-                        </w:txbxContent>
-                      </wps:txbx>
-                      <wps:bodyPr rot="0" spcFirstLastPara="0" vertOverflow="overflow" horzOverflow="overflow" vert="horz" wrap="square" lIns="91440" tIns="45720" rIns="91440" bIns="45720" numCol="1" spcCol="0" rtlCol="0" fromWordArt="0" anchor="ctr" anchorCtr="0" forceAA="0" compatLnSpc="1">
-                        <a:prstTxWarp prst="textNoShape">
-                          <a:avLst/>
-                        </a:prstTxWarp>
-                        <a:noAutofit/>
-                      </wps:bodyPr>
-                    </wps:wsp>
-                  </a:graphicData>
-                </a:graphic>
-                <wp14:sizeRelH relativeFrom="margin">
-                  <wp14:pctWidth>0</wp14:pctWidth>
-                </wp14:sizeRelH>
-                <wp14:sizeRelV relativeFrom="margin">
-                  <wp14:pctHeight>0</wp14:pctHeight>
-                </wp14:sizeRelV>
-              </wp:anchor>
-            </w:drawing>
-          </mc:Choice>
-          <mc:Fallback>
-            <w:pict>
-              <v:rect w14:anchorId="315D2796" id="Rectangle 1" o:spid="_x0000_s1026" style="position:absolute;margin-left:-4.2pt;margin-top:-96.4pt;width:600.2pt;height:864.7pt;z-index:251657217;visibility:visible;mso-wrap-style:square;mso-width-percent:0;mso-height-percent:0;mso-wrap-distance-left:9pt;mso-wrap-distance-top:0;mso-wrap-distance-right:9pt;mso-wrap-distance-bottom:0;mso-position-horizontal:absolute;mso-position-horizontal-relative:page;mso-position-vertical:absolute;mso-position-vertical-relative:text;mso-width-percent:0;mso-height-percent:0;mso-width-relative:margin;mso-height-relative:margin;v-text-anchor:middle" o:gfxdata="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" fillcolor="#03546e" stroked="f" strokeweight="1pt">
-                <v:fill opacity="49087f"/>
-                <v:textbox>
-                  <w:txbxContent>
-                    <w:p>
-                      <w:pPr>
-                        <w:jc w:val="center"/>
-                      </w:pPr>
-                    </w:p>
-                  </w:txbxContent>
-                </v:textbox>
-                <w10:wrap anchorx="page"/>
-              </v:rect>
-            </w:pict>
-          </mc:Fallback>
-        </mc:AlternateContent>
-      </w:r>
-      <w:r>
-        <w:rPr>
-          <w:bCs/>
-          <w:noProof/>
-        </w:rPr>
-        <w:drawing>
-          <wp:anchor distT="0" distB="0" distL="114300" distR="114300" simplePos="0" relativeHeight="251657216" behindDoc="0" locked="0" layoutInCell="1" allowOverlap="1" wp14:anchorId="4F2D5C5B" wp14:editId="3335E138">
-            <wp:simplePos x="0" y="0"/>
-            <wp:positionH relativeFrom="column">
-              <wp:posOffset>-982291</wp:posOffset>
-            </wp:positionH>
-            <wp:positionV relativeFrom="paragraph">
-              <wp:posOffset>-1264758</wp:posOffset>
-            </wp:positionV>
-            <wp:extent cx="7619365" cy="10748645"/>
-            <wp:effectExtent l="0" t="0" r="635" b="0"/>
-            <wp:wrapNone/>
-            <wp:docPr id="3" name="Picture 3"/>
-            <wp:cNvGraphicFramePr>
-              <a:graphicFrameLocks xmlns:a="http://schemas.openxmlformats.org/drawingml/2006/main" noChangeAspect="1"/>
-            </wp:cNvGraphicFramePr>
-            <a:graphic xmlns:a="http://schemas.openxmlformats.org/drawingml/2006/main">
-              <a:graphicData uri="http://schemas.openxmlformats.org/drawingml/2006/picture">
-                <pic:pic xmlns:pic="http://schemas.openxmlformats.org/drawingml/2006/picture">
-                  <pic:nvPicPr>
-                    <pic:cNvPr id="3" name="Picture 3"/>
-                    <pic:cNvPicPr>
-                      <a:picLocks noChangeAspect="1"/>
-                    </pic:cNvPicPr>
-                  </pic:nvPicPr>
-                  <pic:blipFill rotWithShape="1">
-                    <a:blip r:embed="rId12" cstate="print">
-                      <a:extLst>
-                        <a:ext uri="{28A0092B-C50C-407E-A947-70E740481C1C}">
-                          <a14:useLocalDpi xmlns:a14="http://schemas.microsoft.com/office/drawing/2010/main" val="0"/>
-                        </a:ext>
-                      </a:extLst>
-                    </a:blip>
-                    <a:srcRect l="49302" r="3316"/>
-                    <a:stretch/>
-                  </pic:blipFill>
-                  <pic:spPr bwMode="auto">
-                    <a:xfrm>
-                      <a:off x="0" y="0"/>
-                      <a:ext cx="7619365" cy="10748645"/>
-                    </a:xfrm>
-                    <a:prstGeom prst="rect">
-                      <a:avLst/>
-                    </a:prstGeom>
-                    <a:ln>
-                      <a:noFill/>
-                    </a:ln>
-                    <a:extLst>
-                      <a:ext uri="{53640926-AAD7-44D8-BBD7-CCE9431645EC}">
-                        <a14:shadowObscured xmlns:a14="http://schemas.microsoft.com/office/drawing/2010/main"/>
-                      </a:ext>
-                    </a:extLst>
-                  </pic:spPr>
-                </pic:pic>
-              </a:graphicData>
-            </a:graphic>
-            <wp14:sizeRelH relativeFrom="margin">
-              <wp14:pctWidth>0</wp14:pctWidth>
-            </wp14:sizeRelH>
-            <wp14:sizeRelV relativeFrom="margin">
               <wp14:pctHeight>0</wp14:pctHeight>
             </wp14:sizeRelV>
           </wp:anchor>
@@ -14632,6 +14530,50 @@
 </file>
 
 <file path=customXml/item1.xml><?xml version="1.0" encoding="utf-8"?>
+<p:properties xmlns:p="http://schemas.microsoft.com/office/2006/metadata/properties" xmlns:xsi="http://www.w3.org/2001/XMLSchema-instance" xmlns:pc="http://schemas.microsoft.com/office/infopath/2007/PartnerControls">
+  <documentManagement>
+    <_ip_UnifiedCompliancePolicyUIAction xmlns="http://schemas.microsoft.com/sharepoint/v3" xsi:nil="true"/>
+    <_ip_UnifiedCompliancePolicyProperties xmlns="http://schemas.microsoft.com/sharepoint/v3" xsi:nil="true"/>
+    <lcf76f155ced4ddcb4097134ff3c332f xmlns="bc555557-3e8b-4e67-83dc-4a843c87bf48">
+      <Terms xmlns="http://schemas.microsoft.com/office/infopath/2007/PartnerControls"/>
+    </lcf76f155ced4ddcb4097134ff3c332f>
+    <TaxCatchAll xmlns="13e5e634-19bb-4da3-8eb1-d732f895062a" xsi:nil="true"/>
+    <SharedWithUsers xmlns="13e5e634-19bb-4da3-8eb1-d732f895062a">
+      <UserInfo>
+        <DisplayName>James Dell</DisplayName>
+        <AccountId>10</AccountId>
+        <AccountType/>
+      </UserInfo>
+      <UserInfo>
+        <DisplayName>Luke Finch</DisplayName>
+        <AccountId>44</AccountId>
+        <AccountType/>
+      </UserInfo>
+      <UserInfo>
+        <DisplayName>Sam Wray</DisplayName>
+        <AccountId>39</AccountId>
+        <AccountType/>
+      </UserInfo>
+      <UserInfo>
+        <DisplayName>Nick Johns</DisplayName>
+        <AccountId>18</AccountId>
+        <AccountType/>
+      </UserInfo>
+      <UserInfo>
+        <DisplayName>Justin Towle</DisplayName>
+        <AccountId>70</AccountId>
+        <AccountType/>
+      </UserInfo>
+    </SharedWithUsers>
+  </documentManagement>
+</p:properties>
+</file>
+
+<file path=customXml/item2.xml><?xml version="1.0" encoding="utf-8"?>
+<b:Sources xmlns:b="http://schemas.openxmlformats.org/officeDocument/2006/bibliography" xmlns="http://schemas.openxmlformats.org/officeDocument/2006/bibliography" SelectedStyle="\APASixthEditionOfficeOnline.xsl" StyleName="APA" Version="6"/>
+</file>
+
+<file path=customXml/item3.xml><?xml version="1.0" encoding="utf-8"?>
 <?mso-contentType ?>
 <FormTemplates xmlns="http://schemas.microsoft.com/sharepoint/v3/contenttype/forms">
   <Display>DocumentLibraryForm</Display>
@@ -14640,7 +14582,7 @@
 </FormTemplates>
 </file>
 
-<file path=customXml/item2.xml><?xml version="1.0" encoding="utf-8"?>
+<file path=customXml/item4.xml><?xml version="1.0" encoding="utf-8"?>
 <ct:contentTypeSchema xmlns:ct="http://schemas.microsoft.com/office/2006/metadata/contentType" xmlns:ma="http://schemas.microsoft.com/office/2006/metadata/properties/metaAttributes" ct:_="" ma:_="" ma:contentTypeName="Document" ma:contentTypeID="0x01010035785702D987474A98E5EB52BEDD3AA6" ma:contentTypeVersion="19" ma:contentTypeDescription="Create a new document." ma:contentTypeScope="" ma:versionID="7475e8a14b23e3b44613142ca3702c71">
   <xsd:schema xmlns:xsd="http://www.w3.org/2001/XMLSchema" xmlns:xs="http://www.w3.org/2001/XMLSchema" xmlns:p="http://schemas.microsoft.com/office/2006/metadata/properties" xmlns:ns1="http://schemas.microsoft.com/sharepoint/v3" xmlns:ns2="bc555557-3e8b-4e67-83dc-4a843c87bf48" xmlns:ns3="13e5e634-19bb-4da3-8eb1-d732f895062a" targetNamespace="http://schemas.microsoft.com/office/2006/metadata/properties" ma:root="true" ma:fieldsID="a0e591cb8f16aef1e2d445ad70521c76" ns1:_="" ns2:_="" ns3:_="">
     <xsd:import namespace="http://schemas.microsoft.com/sharepoint/v3"/>
@@ -14898,51 +14840,27 @@
 </ct:contentTypeSchema>
 </file>
 
-<file path=customXml/item3.xml><?xml version="1.0" encoding="utf-8"?>
-<b:Sources xmlns:b="http://schemas.openxmlformats.org/officeDocument/2006/bibliography" xmlns="http://schemas.openxmlformats.org/officeDocument/2006/bibliography" SelectedStyle="\APASixthEditionOfficeOnline.xsl" StyleName="APA" Version="6"/>
+<file path=customXml/itemProps1.xml><?xml version="1.0" encoding="utf-8"?>
+<ds:datastoreItem xmlns:ds="http://schemas.openxmlformats.org/officeDocument/2006/customXml" ds:itemID="{EDF12601-A8A7-4B7A-9481-1111248E774A}">
+  <ds:schemaRefs>
+    <ds:schemaRef ds:uri="http://schemas.microsoft.com/office/2006/metadata/properties"/>
+    <ds:schemaRef ds:uri="http://schemas.microsoft.com/office/infopath/2007/PartnerControls"/>
+    <ds:schemaRef ds:uri="http://schemas.microsoft.com/sharepoint/v3"/>
+    <ds:schemaRef ds:uri="bc555557-3e8b-4e67-83dc-4a843c87bf48"/>
+    <ds:schemaRef ds:uri="13e5e634-19bb-4da3-8eb1-d732f895062a"/>
+  </ds:schemaRefs>
+</ds:datastoreItem>
 </file>
 
-<file path=customXml/item4.xml><?xml version="1.0" encoding="utf-8"?>
-<p:properties xmlns:p="http://schemas.microsoft.com/office/2006/metadata/properties" xmlns:xsi="http://www.w3.org/2001/XMLSchema-instance" xmlns:pc="http://schemas.microsoft.com/office/infopath/2007/PartnerControls">
-  <documentManagement>
-    <_ip_UnifiedCompliancePolicyUIAction xmlns="http://schemas.microsoft.com/sharepoint/v3" xsi:nil="true"/>
-    <_ip_UnifiedCompliancePolicyProperties xmlns="http://schemas.microsoft.com/sharepoint/v3" xsi:nil="true"/>
-    <lcf76f155ced4ddcb4097134ff3c332f xmlns="bc555557-3e8b-4e67-83dc-4a843c87bf48">
-      <Terms xmlns="http://schemas.microsoft.com/office/infopath/2007/PartnerControls"/>
-    </lcf76f155ced4ddcb4097134ff3c332f>
-    <TaxCatchAll xmlns="13e5e634-19bb-4da3-8eb1-d732f895062a" xsi:nil="true"/>
-    <SharedWithUsers xmlns="13e5e634-19bb-4da3-8eb1-d732f895062a">
-      <UserInfo>
-        <DisplayName>James Dell</DisplayName>
-        <AccountId>10</AccountId>
-        <AccountType/>
-      </UserInfo>
-      <UserInfo>
-        <DisplayName>Luke Finch</DisplayName>
-        <AccountId>44</AccountId>
-        <AccountType/>
-      </UserInfo>
-      <UserInfo>
-        <DisplayName>Sam Wray</DisplayName>
-        <AccountId>39</AccountId>
-        <AccountType/>
-      </UserInfo>
-      <UserInfo>
-        <DisplayName>Nick Johns</DisplayName>
-        <AccountId>18</AccountId>
-        <AccountType/>
-      </UserInfo>
-      <UserInfo>
-        <DisplayName>Justin Towle</DisplayName>
-        <AccountId>70</AccountId>
-        <AccountType/>
-      </UserInfo>
-    </SharedWithUsers>
-  </documentManagement>
-</p:properties>
+<file path=customXml/itemProps2.xml><?xml version="1.0" encoding="utf-8"?>
+<ds:datastoreItem xmlns:ds="http://schemas.openxmlformats.org/officeDocument/2006/customXml" ds:itemID="{41B34B53-803B-4600-951E-8C7B6ABDE6A5}">
+  <ds:schemaRefs>
+    <ds:schemaRef ds:uri="http://schemas.openxmlformats.org/officeDocument/2006/bibliography"/>
+  </ds:schemaRefs>
+</ds:datastoreItem>
 </file>
 
-<file path=customXml/itemProps1.xml><?xml version="1.0" encoding="utf-8"?>
+<file path=customXml/itemProps3.xml><?xml version="1.0" encoding="utf-8"?>
 <ds:datastoreItem xmlns:ds="http://schemas.openxmlformats.org/officeDocument/2006/customXml" ds:itemID="{02C30E68-946A-4504-B925-FF5230B8A4C3}">
   <ds:schemaRefs>
     <ds:schemaRef ds:uri="http://schemas.microsoft.com/sharepoint/v3/contenttype/forms"/>
@@ -14950,7 +14868,7 @@
 </ds:datastoreItem>
 </file>
 
-<file path=customXml/itemProps2.xml><?xml version="1.0" encoding="utf-8"?>
+<file path=customXml/itemProps4.xml><?xml version="1.0" encoding="utf-8"?>
 <ds:datastoreItem xmlns:ds="http://schemas.openxmlformats.org/officeDocument/2006/customXml" ds:itemID="{7F9D1B01-7FEE-4553-9877-3B31209422E5}">
   <ds:schemaRefs>
     <ds:schemaRef ds:uri="http://schemas.microsoft.com/office/2006/metadata/contentType"/>
@@ -14968,24 +14886,4 @@
     <ds:schemaRef ds:uri="http://schemas.microsoft.com/internal/obd"/>
   </ds:schemaRefs>
 </ds:datastoreItem>
-</file>
-
-<file path=customXml/itemProps3.xml><?xml version="1.0" encoding="utf-8"?>
-<ds:datastoreItem xmlns:ds="http://schemas.openxmlformats.org/officeDocument/2006/customXml" ds:itemID="{41B34B53-803B-4600-951E-8C7B6ABDE6A5}">
-  <ds:schemaRefs>
-    <ds:schemaRef ds:uri="http://schemas.openxmlformats.org/officeDocument/2006/bibliography"/>
-  </ds:schemaRefs>
-</ds:datastoreItem>
-</file>
-
-<file path=customXml/itemProps4.xml><?xml version="1.0" encoding="utf-8"?>
-<ds:datastoreItem xmlns:ds="http://schemas.openxmlformats.org/officeDocument/2006/customXml" ds:itemID="{EDF12601-A8A7-4B7A-9481-1111248E774A}">
-  <ds:schemaRefs>
-    <ds:schemaRef ds:uri="http://schemas.microsoft.com/office/2006/metadata/properties"/>
-    <ds:schemaRef ds:uri="http://schemas.microsoft.com/office/infopath/2007/PartnerControls"/>
-    <ds:schemaRef ds:uri="http://schemas.microsoft.com/sharepoint/v3"/>
-    <ds:schemaRef ds:uri="bc555557-3e8b-4e67-83dc-4a843c87bf48"/>
-    <ds:schemaRef ds:uri="13e5e634-19bb-4da3-8eb1-d732f895062a"/>
-  </ds:schemaRefs>
-</ds:datastoreItem>
 </file>
</xml_diff>

<commit_message>
V1.12.3 - enhance threat scenario narrative with governance and testing options
</commit_message>
<xml_diff>
--- a/planet_it_maturity_assessment_template.docx
+++ b/planet_it_maturity_assessment_template.docx
@@ -1288,6 +1288,21 @@
     </w:p>
     <w:p/>
     <w:p>
+      <w:pPr>
+        <w:pStyle w:val="Heading2"/>
+      </w:pPr>
+    </w:p>
+    <w:p>
+      <w:pPr>
+        <w:pStyle w:val="Heading2"/>
+      </w:pPr>
+      <w:r>
+        <w:t>Current domain alignment</w:t>
+      </w:r>
+    </w:p>
+    <w:p/>
+    <w:p/>
+    <w:p>
       <w:r>
         <w:t>{{ radar</w:t>
       </w:r>
@@ -1333,7 +1348,6 @@
         <w:rPr>
           <w:noProof/>
         </w:rPr>
-        <w:lastRenderedPageBreak/>
         <mc:AlternateContent>
           <mc:Choice Requires="wps">
             <w:drawing>
@@ -5492,6 +5506,90 @@
       <w:pPr>
         <w:pStyle w:val="NormalWeb"/>
         <w:rPr>
+          <w:rStyle w:val="HTMLCode"/>
+        </w:rPr>
+      </w:pPr>
+    </w:p>
+    <w:p>
+      <w:pPr>
+        <w:spacing w:before="240" w:after="120"/>
+        <w:rPr>
+          <w:b/>
+          <w:sz w:val="26"/>
+        </w:rPr>
+      </w:pPr>
+      <w:r>
+        <w:rPr>
+          <w:b/>
+          <w:sz w:val="26"/>
+        </w:rPr>
+        <w:t>Simulated attack of current infrastructure</w:t>
+      </w:r>
+    </w:p>
+    <w:p>
+      <w:pPr>
+        <w:spacing w:before="240" w:after="120"/>
+        <w:rPr>
+          <w:bCs/>
+          <w:i/>
+          <w:iCs/>
+          <w:sz w:val="12"/>
+          <w:szCs w:val="12"/>
+        </w:rPr>
+      </w:pPr>
+      <w:r>
+        <w:rPr>
+          <w:bCs/>
+          <w:i/>
+          <w:iCs/>
+          <w:sz w:val="12"/>
+          <w:szCs w:val="12"/>
+        </w:rPr>
+        <w:t xml:space="preserve">Disclaimer: this is a fictional breach scenario leveraging threat intelligence and known threat actor activity mapped to the current technology stack and perceived security maturity of </w:t>
+      </w:r>
+      <w:r>
+        <w:rPr>
+          <w:bCs/>
+          <w:i/>
+          <w:iCs/>
+          <w:sz w:val="12"/>
+          <w:szCs w:val="12"/>
+        </w:rPr>
+        <w:t>{{ customer_name }</w:t>
+      </w:r>
+      <w:r>
+        <w:rPr>
+          <w:bCs/>
+          <w:i/>
+          <w:iCs/>
+          <w:sz w:val="12"/>
+          <w:szCs w:val="12"/>
+        </w:rPr>
+        <w:t xml:space="preserve">} </w:t>
+      </w:r>
+      <w:r>
+        <w:rPr>
+          <w:bCs/>
+          <w:i/>
+          <w:iCs/>
+          <w:sz w:val="12"/>
+          <w:szCs w:val="12"/>
+        </w:rPr>
+        <w:t>– this is meant as an illustration of potential risks only</w:t>
+      </w:r>
+    </w:p>
+    <w:p>
+      <w:pPr>
+        <w:pStyle w:val="NormalWeb"/>
+        <w:rPr>
+          <w:rStyle w:val="HTMLCode"/>
+        </w:rPr>
+      </w:pPr>
+    </w:p>
+    <w:p>
+      <w:pPr>
+        <w:pStyle w:val="NormalWeb"/>
+        <w:rPr>
           <w:rFonts w:ascii="Roboto" w:hAnsi="Roboto"/>
         </w:rPr>
       </w:pPr>
@@ -5549,6 +5647,7 @@
           <w:sz w:val="20"/>
           <w:szCs w:val="24"/>
         </w:rPr>
+        <w:lastRenderedPageBreak/>
         <w:t xml:space="preserve">Our </w:t>
       </w:r>
       <w:r>
@@ -5923,6 +6022,7 @@
     <w:p/>
     <w:p>
       <w:r>
+        <w:lastRenderedPageBreak/>
         <w:t xml:space="preserve">Since the beginning, we have built our business on first-class customer service and employing the best people available. We continue that ethos today, constantly building and maintaining our </w:t>
       </w:r>
     </w:p>
@@ -9753,7 +9853,10 @@
           </w:tcPr>
           <w:p>
             <w:r>
-              <w:t xml:space="preserve"> [TA NAME]</w:t>
+              <w:t xml:space="preserve"> </w:t>
+            </w:r>
+            <w:r>
+              <w:t>{{ consultant_name }}</w:t>
             </w:r>
           </w:p>
         </w:tc>
@@ -9870,10 +9973,7 @@
           </w:tcPr>
           <w:p>
             <w:r>
-              <w:t xml:space="preserve"> </w:t>
-            </w:r>
-            <w:r>
-              <w:t>James Dell</w:t>
+              <w:t xml:space="preserve"> Mike Bellido</w:t>
             </w:r>
           </w:p>
         </w:tc>
@@ -10523,7 +10623,7 @@
           </w:tcPr>
           <w:p>
             <w:r>
-              <w:t>[TA NAME]</w:t>
+              <w:t>{{ consultant_name }}</w:t>
             </w:r>
           </w:p>
         </w:tc>
@@ -10718,9 +10818,10 @@
           </w:tcPr>
           <w:p>
             <w:r>
-              <w:t>[CUSTOMER NAME]</w:t>
-            </w:r>
-          </w:p>
+              <w:t>{{ customer_name }}</w:t>
+            </w:r>
+          </w:p>
+          <w:p/>
         </w:tc>
       </w:tr>
     </w:tbl>
@@ -14530,6 +14631,19 @@
 </file>
 
 <file path=customXml/item1.xml><?xml version="1.0" encoding="utf-8"?>
+<?mso-contentType ?>
+<FormTemplates xmlns="http://schemas.microsoft.com/sharepoint/v3/contenttype/forms">
+  <Display>DocumentLibraryForm</Display>
+  <Edit>DocumentLibraryForm</Edit>
+  <New>DocumentLibraryForm</New>
+</FormTemplates>
+</file>
+
+<file path=customXml/item2.xml><?xml version="1.0" encoding="utf-8"?>
+<b:Sources xmlns:b="http://schemas.openxmlformats.org/officeDocument/2006/bibliography" xmlns="http://schemas.openxmlformats.org/officeDocument/2006/bibliography" SelectedStyle="\APASixthEditionOfficeOnline.xsl" StyleName="APA" Version="6"/>
+</file>
+
+<file path=customXml/item3.xml><?xml version="1.0" encoding="utf-8"?>
 <p:properties xmlns:p="http://schemas.microsoft.com/office/2006/metadata/properties" xmlns:xsi="http://www.w3.org/2001/XMLSchema-instance" xmlns:pc="http://schemas.microsoft.com/office/infopath/2007/PartnerControls">
   <documentManagement>
     <_ip_UnifiedCompliancePolicyUIAction xmlns="http://schemas.microsoft.com/sharepoint/v3" xsi:nil="true"/>
@@ -14567,19 +14681,6 @@
     </SharedWithUsers>
   </documentManagement>
 </p:properties>
-</file>
-
-<file path=customXml/item2.xml><?xml version="1.0" encoding="utf-8"?>
-<b:Sources xmlns:b="http://schemas.openxmlformats.org/officeDocument/2006/bibliography" xmlns="http://schemas.openxmlformats.org/officeDocument/2006/bibliography" SelectedStyle="\APASixthEditionOfficeOnline.xsl" StyleName="APA" Version="6"/>
-</file>
-
-<file path=customXml/item3.xml><?xml version="1.0" encoding="utf-8"?>
-<?mso-contentType ?>
-<FormTemplates xmlns="http://schemas.microsoft.com/sharepoint/v3/contenttype/forms">
-  <Display>DocumentLibraryForm</Display>
-  <Edit>DocumentLibraryForm</Edit>
-  <New>DocumentLibraryForm</New>
-</FormTemplates>
 </file>
 
 <file path=customXml/item4.xml><?xml version="1.0" encoding="utf-8"?>
@@ -14841,13 +14942,9 @@
 </file>
 
 <file path=customXml/itemProps1.xml><?xml version="1.0" encoding="utf-8"?>
-<ds:datastoreItem xmlns:ds="http://schemas.openxmlformats.org/officeDocument/2006/customXml" ds:itemID="{EDF12601-A8A7-4B7A-9481-1111248E774A}">
+<ds:datastoreItem xmlns:ds="http://schemas.openxmlformats.org/officeDocument/2006/customXml" ds:itemID="{02C30E68-946A-4504-B925-FF5230B8A4C3}">
   <ds:schemaRefs>
-    <ds:schemaRef ds:uri="http://schemas.microsoft.com/office/2006/metadata/properties"/>
-    <ds:schemaRef ds:uri="http://schemas.microsoft.com/office/infopath/2007/PartnerControls"/>
-    <ds:schemaRef ds:uri="http://schemas.microsoft.com/sharepoint/v3"/>
-    <ds:schemaRef ds:uri="bc555557-3e8b-4e67-83dc-4a843c87bf48"/>
-    <ds:schemaRef ds:uri="13e5e634-19bb-4da3-8eb1-d732f895062a"/>
+    <ds:schemaRef ds:uri="http://schemas.microsoft.com/sharepoint/v3/contenttype/forms"/>
   </ds:schemaRefs>
 </ds:datastoreItem>
 </file>
@@ -14861,9 +14958,13 @@
 </file>
 
 <file path=customXml/itemProps3.xml><?xml version="1.0" encoding="utf-8"?>
-<ds:datastoreItem xmlns:ds="http://schemas.openxmlformats.org/officeDocument/2006/customXml" ds:itemID="{02C30E68-946A-4504-B925-FF5230B8A4C3}">
+<ds:datastoreItem xmlns:ds="http://schemas.openxmlformats.org/officeDocument/2006/customXml" ds:itemID="{EDF12601-A8A7-4B7A-9481-1111248E774A}">
   <ds:schemaRefs>
-    <ds:schemaRef ds:uri="http://schemas.microsoft.com/sharepoint/v3/contenttype/forms"/>
+    <ds:schemaRef ds:uri="http://schemas.microsoft.com/office/2006/metadata/properties"/>
+    <ds:schemaRef ds:uri="http://schemas.microsoft.com/office/infopath/2007/PartnerControls"/>
+    <ds:schemaRef ds:uri="http://schemas.microsoft.com/sharepoint/v3"/>
+    <ds:schemaRef ds:uri="bc555557-3e8b-4e67-83dc-4a843c87bf48"/>
+    <ds:schemaRef ds:uri="13e5e634-19bb-4da3-8eb1-d732f895062a"/>
   </ds:schemaRefs>
 </ds:datastoreItem>
 </file>

</xml_diff>

<commit_message>
V1.15 - added new pydantic tag for executive summary top 3 actions
</commit_message>
<xml_diff>
--- a/planet_it_maturity_assessment_template.docx
+++ b/planet_it_maturity_assessment_template.docx
@@ -1274,11 +1274,27 @@
     </w:p>
     <w:p/>
     <w:p>
+      <w:r>
+        <w:t xml:space="preserve">{{ </w:t>
+      </w:r>
+      <w:r>
+        <w:t>executive_summary_actions</w:t>
+      </w:r>
+      <w:r>
+        <w:t>_word</w:t>
+      </w:r>
+      <w:r>
+        <w:t xml:space="preserve"> }}</w:t>
+      </w:r>
+    </w:p>
+    <w:p/>
+    <w:p/>
+    <w:p>
       <w:pPr>
         <w:pStyle w:val="Heading2"/>
       </w:pPr>
       <w:r>
-        <w:t xml:space="preserve">Current Posture Overview </w:t>
+        <w:t>Executive Commentary</w:t>
       </w:r>
     </w:p>
     <w:p>
@@ -14631,59 +14647,6 @@
 </file>
 
 <file path=customXml/item1.xml><?xml version="1.0" encoding="utf-8"?>
-<?mso-contentType ?>
-<FormTemplates xmlns="http://schemas.microsoft.com/sharepoint/v3/contenttype/forms">
-  <Display>DocumentLibraryForm</Display>
-  <Edit>DocumentLibraryForm</Edit>
-  <New>DocumentLibraryForm</New>
-</FormTemplates>
-</file>
-
-<file path=customXml/item2.xml><?xml version="1.0" encoding="utf-8"?>
-<b:Sources xmlns:b="http://schemas.openxmlformats.org/officeDocument/2006/bibliography" xmlns="http://schemas.openxmlformats.org/officeDocument/2006/bibliography" SelectedStyle="\APASixthEditionOfficeOnline.xsl" StyleName="APA" Version="6"/>
-</file>
-
-<file path=customXml/item3.xml><?xml version="1.0" encoding="utf-8"?>
-<p:properties xmlns:p="http://schemas.microsoft.com/office/2006/metadata/properties" xmlns:xsi="http://www.w3.org/2001/XMLSchema-instance" xmlns:pc="http://schemas.microsoft.com/office/infopath/2007/PartnerControls">
-  <documentManagement>
-    <_ip_UnifiedCompliancePolicyUIAction xmlns="http://schemas.microsoft.com/sharepoint/v3" xsi:nil="true"/>
-    <_ip_UnifiedCompliancePolicyProperties xmlns="http://schemas.microsoft.com/sharepoint/v3" xsi:nil="true"/>
-    <lcf76f155ced4ddcb4097134ff3c332f xmlns="bc555557-3e8b-4e67-83dc-4a843c87bf48">
-      <Terms xmlns="http://schemas.microsoft.com/office/infopath/2007/PartnerControls"/>
-    </lcf76f155ced4ddcb4097134ff3c332f>
-    <TaxCatchAll xmlns="13e5e634-19bb-4da3-8eb1-d732f895062a" xsi:nil="true"/>
-    <SharedWithUsers xmlns="13e5e634-19bb-4da3-8eb1-d732f895062a">
-      <UserInfo>
-        <DisplayName>James Dell</DisplayName>
-        <AccountId>10</AccountId>
-        <AccountType/>
-      </UserInfo>
-      <UserInfo>
-        <DisplayName>Luke Finch</DisplayName>
-        <AccountId>44</AccountId>
-        <AccountType/>
-      </UserInfo>
-      <UserInfo>
-        <DisplayName>Sam Wray</DisplayName>
-        <AccountId>39</AccountId>
-        <AccountType/>
-      </UserInfo>
-      <UserInfo>
-        <DisplayName>Nick Johns</DisplayName>
-        <AccountId>18</AccountId>
-        <AccountType/>
-      </UserInfo>
-      <UserInfo>
-        <DisplayName>Justin Towle</DisplayName>
-        <AccountId>70</AccountId>
-        <AccountType/>
-      </UserInfo>
-    </SharedWithUsers>
-  </documentManagement>
-</p:properties>
-</file>
-
-<file path=customXml/item4.xml><?xml version="1.0" encoding="utf-8"?>
 <ct:contentTypeSchema xmlns:ct="http://schemas.microsoft.com/office/2006/metadata/contentType" xmlns:ma="http://schemas.microsoft.com/office/2006/metadata/properties/metaAttributes" ct:_="" ma:_="" ma:contentTypeName="Document" ma:contentTypeID="0x01010035785702D987474A98E5EB52BEDD3AA6" ma:contentTypeVersion="19" ma:contentTypeDescription="Create a new document." ma:contentTypeScope="" ma:versionID="7475e8a14b23e3b44613142ca3702c71">
   <xsd:schema xmlns:xsd="http://www.w3.org/2001/XMLSchema" xmlns:xs="http://www.w3.org/2001/XMLSchema" xmlns:p="http://schemas.microsoft.com/office/2006/metadata/properties" xmlns:ns1="http://schemas.microsoft.com/sharepoint/v3" xmlns:ns2="bc555557-3e8b-4e67-83dc-4a843c87bf48" xmlns:ns3="13e5e634-19bb-4da3-8eb1-d732f895062a" targetNamespace="http://schemas.microsoft.com/office/2006/metadata/properties" ma:root="true" ma:fieldsID="a0e591cb8f16aef1e2d445ad70521c76" ns1:_="" ns2:_="" ns3:_="">
     <xsd:import namespace="http://schemas.microsoft.com/sharepoint/v3"/>
@@ -14941,18 +14904,83 @@
 </ct:contentTypeSchema>
 </file>
 
+<file path=customXml/item2.xml><?xml version="1.0" encoding="utf-8"?>
+<?mso-contentType ?>
+<FormTemplates xmlns="http://schemas.microsoft.com/sharepoint/v3/contenttype/forms">
+  <Display>DocumentLibraryForm</Display>
+  <Edit>DocumentLibraryForm</Edit>
+  <New>DocumentLibraryForm</New>
+</FormTemplates>
+</file>
+
+<file path=customXml/item3.xml><?xml version="1.0" encoding="utf-8"?>
+<p:properties xmlns:p="http://schemas.microsoft.com/office/2006/metadata/properties" xmlns:xsi="http://www.w3.org/2001/XMLSchema-instance" xmlns:pc="http://schemas.microsoft.com/office/infopath/2007/PartnerControls">
+  <documentManagement>
+    <_ip_UnifiedCompliancePolicyUIAction xmlns="http://schemas.microsoft.com/sharepoint/v3" xsi:nil="true"/>
+    <_ip_UnifiedCompliancePolicyProperties xmlns="http://schemas.microsoft.com/sharepoint/v3" xsi:nil="true"/>
+    <lcf76f155ced4ddcb4097134ff3c332f xmlns="bc555557-3e8b-4e67-83dc-4a843c87bf48">
+      <Terms xmlns="http://schemas.microsoft.com/office/infopath/2007/PartnerControls"/>
+    </lcf76f155ced4ddcb4097134ff3c332f>
+    <TaxCatchAll xmlns="13e5e634-19bb-4da3-8eb1-d732f895062a" xsi:nil="true"/>
+    <SharedWithUsers xmlns="13e5e634-19bb-4da3-8eb1-d732f895062a">
+      <UserInfo>
+        <DisplayName>James Dell</DisplayName>
+        <AccountId>10</AccountId>
+        <AccountType/>
+      </UserInfo>
+      <UserInfo>
+        <DisplayName>Luke Finch</DisplayName>
+        <AccountId>44</AccountId>
+        <AccountType/>
+      </UserInfo>
+      <UserInfo>
+        <DisplayName>Sam Wray</DisplayName>
+        <AccountId>39</AccountId>
+        <AccountType/>
+      </UserInfo>
+      <UserInfo>
+        <DisplayName>Nick Johns</DisplayName>
+        <AccountId>18</AccountId>
+        <AccountType/>
+      </UserInfo>
+      <UserInfo>
+        <DisplayName>Justin Towle</DisplayName>
+        <AccountId>70</AccountId>
+        <AccountType/>
+      </UserInfo>
+    </SharedWithUsers>
+  </documentManagement>
+</p:properties>
+</file>
+
+<file path=customXml/item4.xml><?xml version="1.0" encoding="utf-8"?>
+<b:Sources xmlns:b="http://schemas.openxmlformats.org/officeDocument/2006/bibliography" xmlns="http://schemas.openxmlformats.org/officeDocument/2006/bibliography" SelectedStyle="\APASixthEditionOfficeOnline.xsl" StyleName="APA" Version="6"/>
+</file>
+
 <file path=customXml/itemProps1.xml><?xml version="1.0" encoding="utf-8"?>
-<ds:datastoreItem xmlns:ds="http://schemas.openxmlformats.org/officeDocument/2006/customXml" ds:itemID="{02C30E68-946A-4504-B925-FF5230B8A4C3}">
+<ds:datastoreItem xmlns:ds="http://schemas.openxmlformats.org/officeDocument/2006/customXml" ds:itemID="{7F9D1B01-7FEE-4553-9877-3B31209422E5}">
   <ds:schemaRefs>
-    <ds:schemaRef ds:uri="http://schemas.microsoft.com/sharepoint/v3/contenttype/forms"/>
+    <ds:schemaRef ds:uri="http://schemas.microsoft.com/office/2006/metadata/contentType"/>
+    <ds:schemaRef ds:uri="http://schemas.microsoft.com/office/2006/metadata/properties/metaAttributes"/>
+    <ds:schemaRef ds:uri="http://www.w3.org/2001/XMLSchema"/>
+    <ds:schemaRef ds:uri="http://schemas.microsoft.com/office/2006/metadata/properties"/>
+    <ds:schemaRef ds:uri="http://schemas.microsoft.com/sharepoint/v3"/>
+    <ds:schemaRef ds:uri="bc555557-3e8b-4e67-83dc-4a843c87bf48"/>
+    <ds:schemaRef ds:uri="13e5e634-19bb-4da3-8eb1-d732f895062a"/>
+    <ds:schemaRef ds:uri="http://schemas.microsoft.com/office/2006/documentManagement/types"/>
+    <ds:schemaRef ds:uri="http://schemas.microsoft.com/office/infopath/2007/PartnerControls"/>
+    <ds:schemaRef ds:uri="http://schemas.openxmlformats.org/package/2006/metadata/core-properties"/>
+    <ds:schemaRef ds:uri="http://purl.org/dc/elements/1.1/"/>
+    <ds:schemaRef ds:uri="http://purl.org/dc/terms/"/>
+    <ds:schemaRef ds:uri="http://schemas.microsoft.com/internal/obd"/>
   </ds:schemaRefs>
 </ds:datastoreItem>
 </file>
 
 <file path=customXml/itemProps2.xml><?xml version="1.0" encoding="utf-8"?>
-<ds:datastoreItem xmlns:ds="http://schemas.openxmlformats.org/officeDocument/2006/customXml" ds:itemID="{41B34B53-803B-4600-951E-8C7B6ABDE6A5}">
+<ds:datastoreItem xmlns:ds="http://schemas.openxmlformats.org/officeDocument/2006/customXml" ds:itemID="{02C30E68-946A-4504-B925-FF5230B8A4C3}">
   <ds:schemaRefs>
-    <ds:schemaRef ds:uri="http://schemas.openxmlformats.org/officeDocument/2006/bibliography"/>
+    <ds:schemaRef ds:uri="http://schemas.microsoft.com/sharepoint/v3/contenttype/forms"/>
   </ds:schemaRefs>
 </ds:datastoreItem>
 </file>
@@ -14970,21 +14998,9 @@
 </file>
 
 <file path=customXml/itemProps4.xml><?xml version="1.0" encoding="utf-8"?>
-<ds:datastoreItem xmlns:ds="http://schemas.openxmlformats.org/officeDocument/2006/customXml" ds:itemID="{7F9D1B01-7FEE-4553-9877-3B31209422E5}">
+<ds:datastoreItem xmlns:ds="http://schemas.openxmlformats.org/officeDocument/2006/customXml" ds:itemID="{41B34B53-803B-4600-951E-8C7B6ABDE6A5}">
   <ds:schemaRefs>
-    <ds:schemaRef ds:uri="http://schemas.microsoft.com/office/2006/metadata/contentType"/>
-    <ds:schemaRef ds:uri="http://schemas.microsoft.com/office/2006/metadata/properties/metaAttributes"/>
-    <ds:schemaRef ds:uri="http://www.w3.org/2001/XMLSchema"/>
-    <ds:schemaRef ds:uri="http://schemas.microsoft.com/office/2006/metadata/properties"/>
-    <ds:schemaRef ds:uri="http://schemas.microsoft.com/sharepoint/v3"/>
-    <ds:schemaRef ds:uri="bc555557-3e8b-4e67-83dc-4a843c87bf48"/>
-    <ds:schemaRef ds:uri="13e5e634-19bb-4da3-8eb1-d732f895062a"/>
-    <ds:schemaRef ds:uri="http://schemas.microsoft.com/office/2006/documentManagement/types"/>
-    <ds:schemaRef ds:uri="http://schemas.microsoft.com/office/infopath/2007/PartnerControls"/>
-    <ds:schemaRef ds:uri="http://schemas.openxmlformats.org/package/2006/metadata/core-properties"/>
-    <ds:schemaRef ds:uri="http://purl.org/dc/elements/1.1/"/>
-    <ds:schemaRef ds:uri="http://purl.org/dc/terms/"/>
-    <ds:schemaRef ds:uri="http://schemas.microsoft.com/internal/obd"/>
+    <ds:schemaRef ds:uri="http://schemas.openxmlformats.org/officeDocument/2006/bibliography"/>
   </ds:schemaRefs>
 </ds:datastoreItem>
 </file>
</xml_diff>

<commit_message>
V1.16.0 - added new doughnut chart for overall maturity level
</commit_message>
<xml_diff>
--- a/planet_it_maturity_assessment_template.docx
+++ b/planet_it_maturity_assessment_template.docx
@@ -1,6 +1,6 @@
 
 <file path=word/document.xml><?xml version="1.0" encoding="utf-8"?>
-<w:document xmlns:wpc="http://schemas.microsoft.com/office/word/2010/wordprocessingCanvas" xmlns:cx="http://schemas.microsoft.com/office/drawing/2014/chartex" xmlns:cx1="http://schemas.microsoft.com/office/drawing/2015/9/8/chartex" xmlns:cx2="http://schemas.microsoft.com/office/drawing/2015/10/21/chartex" xmlns:cx3="http://schemas.microsoft.com/office/drawing/2016/5/9/chartex" xmlns:cx4="http://schemas.microsoft.com/office/drawing/2016/5/10/chartex" xmlns:cx5="http://schemas.microsoft.com/office/drawing/2016/5/11/chartex" xmlns:cx6="http://schemas.microsoft.com/office/drawing/2016/5/12/chartex" xmlns:cx7="http://schemas.microsoft.com/office/drawing/2016/5/13/chartex" xmlns:cx8="http://schemas.microsoft.com/office/drawing/2016/5/14/chartex" xmlns:mc="http://schemas.openxmlformats.org/markup-compatibility/2006" xmlns:m="http://schemas.openxmlformats.org/officeDocument/2006/math" xmlns:aink="http://schemas.microsoft.com/office/drawing/2016/ink" xmlns:am3d="http://schemas.microsoft.com/office/drawing/2017/model3d" xmlns:oel="http://schemas.microsoft.com/office/2019/extlst" xmlns:r="http://schemas.openxmlformats.org/officeDocument/2006/relationships" xmlns:wp14="http://schemas.microsoft.com/office/word/2010/wordprocessingDrawing" xmlns:wp="http://schemas.openxmlformats.org/drawingml/2006/wordprocessingDrawing" xmlns:wpg="http://schemas.microsoft.com/office/word/2010/wordprocessingGroup" xmlns:wpi="http://schemas.microsoft.com/office/word/2010/wordprocessingInk" xmlns:wps="http://schemas.microsoft.com/office/word/2010/wordprocessingShape" xmlns:o="urn:schemas-microsoft-com:office:office" xmlns:v="urn:schemas-microsoft-com:vml" xmlns:w10="urn:schemas-microsoft-com:office:word" xmlns:w="http://schemas.openxmlformats.org/wordprocessingml/2006/main" xmlns:w14="http://schemas.microsoft.com/office/word/2010/wordml" xmlns:w15="http://schemas.microsoft.com/office/word/2012/wordml" xmlns:w16cex="http://schemas.microsoft.com/office/word/2018/wordml/cex" xmlns:w16cid="http://schemas.microsoft.com/office/word/2016/wordml/cid" xmlns:w16="http://schemas.microsoft.com/office/word/2018/wordml" xmlns:w16sdtdh="http://schemas.microsoft.com/office/word/2020/wordml/sdtdatahash" xmlns:w16sdtfl="http://schemas.microsoft.com/office/word/2024/wordml/sdtformatlock" xmlns:w16se="http://schemas.microsoft.com/office/word/2015/wordml/symex" xmlns:w16du="http://schemas.microsoft.com/office/word/2023/wordml/word16du" xmlns:wne="http://schemas.microsoft.com/office/word/2006/wordml" mc:Ignorable="w14 w15 w16se w16cid w16 w16cex w16sdtdh w16sdtfl w16du wp14">
+<w:document xmlns:wpc="http://schemas.microsoft.com/office/word/2010/wordprocessingCanvas" xmlns:cx="http://schemas.microsoft.com/office/drawing/2014/chartex" xmlns:cx1="http://schemas.microsoft.com/office/drawing/2015/9/8/chartex" xmlns:cx2="http://schemas.microsoft.com/office/drawing/2015/10/21/chartex" xmlns:cx3="http://schemas.microsoft.com/office/drawing/2016/5/9/chartex" xmlns:cx4="http://schemas.microsoft.com/office/drawing/2016/5/10/chartex" xmlns:cx5="http://schemas.microsoft.com/office/drawing/2016/5/11/chartex" xmlns:cx6="http://schemas.microsoft.com/office/drawing/2016/5/12/chartex" xmlns:cx7="http://schemas.microsoft.com/office/drawing/2016/5/13/chartex" xmlns:cx8="http://schemas.microsoft.com/office/drawing/2016/5/14/chartex" xmlns:mc="http://schemas.openxmlformats.org/markup-compatibility/2006" xmlns:m="http://schemas.openxmlformats.org/officeDocument/2006/math" xmlns:aink="http://schemas.microsoft.com/office/drawing/2016/ink" xmlns:am3d="http://schemas.microsoft.com/office/drawing/2017/model3d" xmlns:oel="http://schemas.microsoft.com/office/2019/extlst" xmlns:r="http://schemas.openxmlformats.org/officeDocument/2006/relationships" xmlns:wp14="http://schemas.microsoft.com/office/word/2010/wordprocessingDrawing" xmlns:wp="http://schemas.openxmlformats.org/drawingml/2006/wordprocessingDrawing" xmlns:wpg="http://schemas.microsoft.com/office/word/2010/wordprocessingGroup" xmlns:wpi="http://schemas.microsoft.com/office/word/2010/wordprocessingInk" xmlns:wps="http://schemas.microsoft.com/office/word/2010/wordprocessingShape" xmlns:o="urn:schemas-microsoft-com:office:office" xmlns:v="urn:schemas-microsoft-com:vml" xmlns:w10="urn:schemas-microsoft-com:office:word" xmlns:w="http://schemas.openxmlformats.org/wordprocessingml/2006/main" xmlns:w14="http://schemas.microsoft.com/office/word/2010/wordml" xmlns:w15="http://schemas.microsoft.com/office/word/2012/wordml" xmlns:w16cei="http://schemas.microsoft.com/office/word/2026/wordml/cei" xmlns:w16cex="http://schemas.microsoft.com/office/word/2018/wordml/cex" xmlns:w16cid="http://schemas.microsoft.com/office/word/2016/wordml/cid" xmlns:w16="http://schemas.microsoft.com/office/word/2018/wordml" xmlns:w16sdtdh="http://schemas.microsoft.com/office/word/2020/wordml/sdtdatahash" xmlns:w16sdtfl="http://schemas.microsoft.com/office/word/2024/wordml/sdtformatlock" xmlns:w16se="http://schemas.microsoft.com/office/word/2015/wordml/symex" xmlns:w16du="http://schemas.microsoft.com/office/word/2023/wordml/word16du" xmlns:wne="http://schemas.microsoft.com/office/word/2006/wordml" mc:Ignorable="w14 w15 w16se w16cid w16 w16cex w16sdtdh w16sdtfl w16du wp14">
   <w:body>
     <w:p>
       <w:bookmarkStart w:id="0" w:name="_Toc530485983"/>
@@ -1274,6 +1274,28 @@
     </w:p>
     <w:p/>
     <w:p>
+      <w:pPr>
+        <w:tabs>
+          <w:tab w:val="num" w:pos="720"/>
+        </w:tabs>
+      </w:pPr>
+      <w:r>
+        <w:t xml:space="preserve">{{ maturity_gauge }} {{ maturity_score }} </w:t>
+      </w:r>
+    </w:p>
+    <w:p>
+      <w:pPr>
+        <w:tabs>
+          <w:tab w:val="num" w:pos="720"/>
+        </w:tabs>
+      </w:pPr>
+      <w:r>
+        <w:t>{{ maturity_score_category }}</w:t>
+      </w:r>
+    </w:p>
+    <w:p/>
+    <w:p/>
+    <w:p>
       <w:r>
         <w:t xml:space="preserve">{{ </w:t>
       </w:r>
@@ -1797,6 +1819,7 @@
         <w:rPr>
           <w:bdr w:val="none" w:sz="0" w:space="0" w:color="auto" w:frame="1"/>
         </w:rPr>
+        <w:lastRenderedPageBreak/>
         <w:br w:type="page"/>
       </w:r>
     </w:p>
@@ -12340,7 +12363,7 @@
 </file>
 
 <file path=word/comments.xml><?xml version="1.0" encoding="utf-8"?>
-<w:comments xmlns:wpc="http://schemas.microsoft.com/office/word/2010/wordprocessingCanvas" xmlns:cx="http://schemas.microsoft.com/office/drawing/2014/chartex" xmlns:cx1="http://schemas.microsoft.com/office/drawing/2015/9/8/chartex" xmlns:cx2="http://schemas.microsoft.com/office/drawing/2015/10/21/chartex" xmlns:cx3="http://schemas.microsoft.com/office/drawing/2016/5/9/chartex" xmlns:cx4="http://schemas.microsoft.com/office/drawing/2016/5/10/chartex" xmlns:cx5="http://schemas.microsoft.com/office/drawing/2016/5/11/chartex" xmlns:cx6="http://schemas.microsoft.com/office/drawing/2016/5/12/chartex" xmlns:cx7="http://schemas.microsoft.com/office/drawing/2016/5/13/chartex" xmlns:cx8="http://schemas.microsoft.com/office/drawing/2016/5/14/chartex" xmlns:mc="http://schemas.openxmlformats.org/markup-compatibility/2006" xmlns:m="http://schemas.openxmlformats.org/officeDocument/2006/math" xmlns:aink="http://schemas.microsoft.com/office/drawing/2016/ink" xmlns:am3d="http://schemas.microsoft.com/office/drawing/2017/model3d" xmlns:oel="http://schemas.microsoft.com/office/2019/extlst" xmlns:r="http://schemas.openxmlformats.org/officeDocument/2006/relationships" xmlns:wp14="http://schemas.microsoft.com/office/word/2010/wordprocessingDrawing" xmlns:wp="http://schemas.openxmlformats.org/drawingml/2006/wordprocessingDrawing" xmlns:wpg="http://schemas.microsoft.com/office/word/2010/wordprocessingGroup" xmlns:wpi="http://schemas.microsoft.com/office/word/2010/wordprocessingInk" xmlns:wps="http://schemas.microsoft.com/office/word/2010/wordprocessingShape" xmlns:o="urn:schemas-microsoft-com:office:office" xmlns:v="urn:schemas-microsoft-com:vml" xmlns:w10="urn:schemas-microsoft-com:office:word" xmlns:w="http://schemas.openxmlformats.org/wordprocessingml/2006/main" xmlns:w14="http://schemas.microsoft.com/office/word/2010/wordml" xmlns:w15="http://schemas.microsoft.com/office/word/2012/wordml" xmlns:w16cex="http://schemas.microsoft.com/office/word/2018/wordml/cex" xmlns:w16cid="http://schemas.microsoft.com/office/word/2016/wordml/cid" xmlns:w16="http://schemas.microsoft.com/office/word/2018/wordml" xmlns:w16sdtdh="http://schemas.microsoft.com/office/word/2020/wordml/sdtdatahash" xmlns:w16sdtfl="http://schemas.microsoft.com/office/word/2024/wordml/sdtformatlock" xmlns:w16se="http://schemas.microsoft.com/office/word/2015/wordml/symex" xmlns:w16du="http://schemas.microsoft.com/office/word/2023/wordml/word16du" xmlns:wne="http://schemas.microsoft.com/office/word/2006/wordml" mc:Ignorable="w14 w15 w16se w16cid w16 w16cex w16sdtdh w16sdtfl w16du wp14">
+<w:comments xmlns:wpc="http://schemas.microsoft.com/office/word/2010/wordprocessingCanvas" xmlns:cx="http://schemas.microsoft.com/office/drawing/2014/chartex" xmlns:cx1="http://schemas.microsoft.com/office/drawing/2015/9/8/chartex" xmlns:cx2="http://schemas.microsoft.com/office/drawing/2015/10/21/chartex" xmlns:cx3="http://schemas.microsoft.com/office/drawing/2016/5/9/chartex" xmlns:cx4="http://schemas.microsoft.com/office/drawing/2016/5/10/chartex" xmlns:cx5="http://schemas.microsoft.com/office/drawing/2016/5/11/chartex" xmlns:cx6="http://schemas.microsoft.com/office/drawing/2016/5/12/chartex" xmlns:cx7="http://schemas.microsoft.com/office/drawing/2016/5/13/chartex" xmlns:cx8="http://schemas.microsoft.com/office/drawing/2016/5/14/chartex" xmlns:mc="http://schemas.openxmlformats.org/markup-compatibility/2006" xmlns:m="http://schemas.openxmlformats.org/officeDocument/2006/math" xmlns:aink="http://schemas.microsoft.com/office/drawing/2016/ink" xmlns:am3d="http://schemas.microsoft.com/office/drawing/2017/model3d" xmlns:oel="http://schemas.microsoft.com/office/2019/extlst" xmlns:r="http://schemas.openxmlformats.org/officeDocument/2006/relationships" xmlns:wp14="http://schemas.microsoft.com/office/word/2010/wordprocessingDrawing" xmlns:wp="http://schemas.openxmlformats.org/drawingml/2006/wordprocessingDrawing" xmlns:wpg="http://schemas.microsoft.com/office/word/2010/wordprocessingGroup" xmlns:wpi="http://schemas.microsoft.com/office/word/2010/wordprocessingInk" xmlns:wps="http://schemas.microsoft.com/office/word/2010/wordprocessingShape" xmlns:o="urn:schemas-microsoft-com:office:office" xmlns:v="urn:schemas-microsoft-com:vml" xmlns:w10="urn:schemas-microsoft-com:office:word" xmlns:w="http://schemas.openxmlformats.org/wordprocessingml/2006/main" xmlns:w14="http://schemas.microsoft.com/office/word/2010/wordml" xmlns:w15="http://schemas.microsoft.com/office/word/2012/wordml" xmlns:w16cei="http://schemas.microsoft.com/office/word/2026/wordml/cei" xmlns:w16cex="http://schemas.microsoft.com/office/word/2018/wordml/cex" xmlns:w16cid="http://schemas.microsoft.com/office/word/2016/wordml/cid" xmlns:w16="http://schemas.microsoft.com/office/word/2018/wordml" xmlns:w16sdtdh="http://schemas.microsoft.com/office/word/2020/wordml/sdtdatahash" xmlns:w16sdtfl="http://schemas.microsoft.com/office/word/2024/wordml/sdtformatlock" xmlns:w16se="http://schemas.microsoft.com/office/word/2015/wordml/symex" xmlns:w16du="http://schemas.microsoft.com/office/word/2023/wordml/word16du" xmlns:wne="http://schemas.microsoft.com/office/word/2006/wordml" mc:Ignorable="w14 w15 w16se w16cid w16 w16cex w16sdtdh w16sdtfl w16du wp14">
   <w:comment w:id="3" w:author="James Dell" w:date="2025-03-31T14:25:00Z" w:initials="JD">
     <w:p>
       <w:r>
@@ -12476,7 +12499,7 @@
 </file>
 
 <file path=word/commentsExtended.xml><?xml version="1.0" encoding="utf-8"?>
-<w15:commentsEx xmlns:wpc="http://schemas.microsoft.com/office/word/2010/wordprocessingCanvas" xmlns:cx="http://schemas.microsoft.com/office/drawing/2014/chartex" xmlns:cx1="http://schemas.microsoft.com/office/drawing/2015/9/8/chartex" xmlns:cx2="http://schemas.microsoft.com/office/drawing/2015/10/21/chartex" xmlns:cx3="http://schemas.microsoft.com/office/drawing/2016/5/9/chartex" xmlns:cx4="http://schemas.microsoft.com/office/drawing/2016/5/10/chartex" xmlns:cx5="http://schemas.microsoft.com/office/drawing/2016/5/11/chartex" xmlns:cx6="http://schemas.microsoft.com/office/drawing/2016/5/12/chartex" xmlns:cx7="http://schemas.microsoft.com/office/drawing/2016/5/13/chartex" xmlns:cx8="http://schemas.microsoft.com/office/drawing/2016/5/14/chartex" xmlns:mc="http://schemas.openxmlformats.org/markup-compatibility/2006" xmlns:m="http://schemas.openxmlformats.org/officeDocument/2006/math" xmlns:aink="http://schemas.microsoft.com/office/drawing/2016/ink" xmlns:am3d="http://schemas.microsoft.com/office/drawing/2017/model3d" xmlns:oel="http://schemas.microsoft.com/office/2019/extlst" xmlns:r="http://schemas.openxmlformats.org/officeDocument/2006/relationships" xmlns:wp14="http://schemas.microsoft.com/office/word/2010/wordprocessingDrawing" xmlns:wp="http://schemas.openxmlformats.org/drawingml/2006/wordprocessingDrawing" xmlns:wpg="http://schemas.microsoft.com/office/word/2010/wordprocessingGroup" xmlns:wpi="http://schemas.microsoft.com/office/word/2010/wordprocessingInk" xmlns:wps="http://schemas.microsoft.com/office/word/2010/wordprocessingShape" xmlns:o="urn:schemas-microsoft-com:office:office" xmlns:v="urn:schemas-microsoft-com:vml" xmlns:w10="urn:schemas-microsoft-com:office:word" xmlns:w="http://schemas.openxmlformats.org/wordprocessingml/2006/main" xmlns:w14="http://schemas.microsoft.com/office/word/2010/wordml" xmlns:w15="http://schemas.microsoft.com/office/word/2012/wordml" xmlns:w16cex="http://schemas.microsoft.com/office/word/2018/wordml/cex" xmlns:w16cid="http://schemas.microsoft.com/office/word/2016/wordml/cid" xmlns:w16="http://schemas.microsoft.com/office/word/2018/wordml" xmlns:w16sdtdh="http://schemas.microsoft.com/office/word/2020/wordml/sdtdatahash" xmlns:w16sdtfl="http://schemas.microsoft.com/office/word/2024/wordml/sdtformatlock" xmlns:w16se="http://schemas.microsoft.com/office/word/2015/wordml/symex" xmlns:w16du="http://schemas.microsoft.com/office/word/2023/wordml/word16du" xmlns:wne="http://schemas.microsoft.com/office/word/2006/wordml" mc:Ignorable="w14 w15 w16se w16cid w16 w16cex w16sdtdh w16sdtfl w16du wp14">
+<w15:commentsEx xmlns:wpc="http://schemas.microsoft.com/office/word/2010/wordprocessingCanvas" xmlns:cx="http://schemas.microsoft.com/office/drawing/2014/chartex" xmlns:cx1="http://schemas.microsoft.com/office/drawing/2015/9/8/chartex" xmlns:cx2="http://schemas.microsoft.com/office/drawing/2015/10/21/chartex" xmlns:cx3="http://schemas.microsoft.com/office/drawing/2016/5/9/chartex" xmlns:cx4="http://schemas.microsoft.com/office/drawing/2016/5/10/chartex" xmlns:cx5="http://schemas.microsoft.com/office/drawing/2016/5/11/chartex" xmlns:cx6="http://schemas.microsoft.com/office/drawing/2016/5/12/chartex" xmlns:cx7="http://schemas.microsoft.com/office/drawing/2016/5/13/chartex" xmlns:cx8="http://schemas.microsoft.com/office/drawing/2016/5/14/chartex" xmlns:mc="http://schemas.openxmlformats.org/markup-compatibility/2006" xmlns:m="http://schemas.openxmlformats.org/officeDocument/2006/math" xmlns:aink="http://schemas.microsoft.com/office/drawing/2016/ink" xmlns:am3d="http://schemas.microsoft.com/office/drawing/2017/model3d" xmlns:oel="http://schemas.microsoft.com/office/2019/extlst" xmlns:r="http://schemas.openxmlformats.org/officeDocument/2006/relationships" xmlns:wp14="http://schemas.microsoft.com/office/word/2010/wordprocessingDrawing" xmlns:wp="http://schemas.openxmlformats.org/drawingml/2006/wordprocessingDrawing" xmlns:wpg="http://schemas.microsoft.com/office/word/2010/wordprocessingGroup" xmlns:wpi="http://schemas.microsoft.com/office/word/2010/wordprocessingInk" xmlns:wps="http://schemas.microsoft.com/office/word/2010/wordprocessingShape" xmlns:o="urn:schemas-microsoft-com:office:office" xmlns:v="urn:schemas-microsoft-com:vml" xmlns:w10="urn:schemas-microsoft-com:office:word" xmlns:w="http://schemas.openxmlformats.org/wordprocessingml/2006/main" xmlns:w14="http://schemas.microsoft.com/office/word/2010/wordml" xmlns:w15="http://schemas.microsoft.com/office/word/2012/wordml" xmlns:w16cei="http://schemas.microsoft.com/office/word/2026/wordml/cei" xmlns:w16cex="http://schemas.microsoft.com/office/word/2018/wordml/cex" xmlns:w16cid="http://schemas.microsoft.com/office/word/2016/wordml/cid" xmlns:w16="http://schemas.microsoft.com/office/word/2018/wordml" xmlns:w16sdtdh="http://schemas.microsoft.com/office/word/2020/wordml/sdtdatahash" xmlns:w16sdtfl="http://schemas.microsoft.com/office/word/2024/wordml/sdtformatlock" xmlns:w16se="http://schemas.microsoft.com/office/word/2015/wordml/symex" xmlns:w16du="http://schemas.microsoft.com/office/word/2023/wordml/word16du" xmlns:wne="http://schemas.microsoft.com/office/word/2006/wordml" mc:Ignorable="w14 w15 w16se w16cid w16 w16cex w16sdtdh w16sdtfl w16du wp14">
   <w15:commentEx w15:paraId="51F97860" w15:done="0"/>
   <w15:commentEx w15:paraId="55A6ECFB" w15:done="0"/>
   <w15:commentEx w15:paraId="4FBA6D35" w15:paraIdParent="55A6ECFB" w15:done="0"/>
@@ -12484,7 +12507,7 @@
 </file>
 
 <file path=word/commentsExtensible.xml><?xml version="1.0" encoding="utf-8"?>
-<w16cex:commentsExtensible xmlns:wpc="http://schemas.microsoft.com/office/word/2010/wordprocessingCanvas" xmlns:cx="http://schemas.microsoft.com/office/drawing/2014/chartex" xmlns:cx1="http://schemas.microsoft.com/office/drawing/2015/9/8/chartex" xmlns:cx2="http://schemas.microsoft.com/office/drawing/2015/10/21/chartex" xmlns:cx3="http://schemas.microsoft.com/office/drawing/2016/5/9/chartex" xmlns:cx4="http://schemas.microsoft.com/office/drawing/2016/5/10/chartex" xmlns:cx5="http://schemas.microsoft.com/office/drawing/2016/5/11/chartex" xmlns:cx6="http://schemas.microsoft.com/office/drawing/2016/5/12/chartex" xmlns:cx7="http://schemas.microsoft.com/office/drawing/2016/5/13/chartex" xmlns:cx8="http://schemas.microsoft.com/office/drawing/2016/5/14/chartex" xmlns:cr="http://schemas.microsoft.com/office/comments/2020/reactions" xmlns:mc="http://schemas.openxmlformats.org/markup-compatibility/2006" xmlns:m="http://schemas.openxmlformats.org/officeDocument/2006/math" xmlns:aink="http://schemas.microsoft.com/office/drawing/2016/ink" xmlns:am3d="http://schemas.microsoft.com/office/drawing/2017/model3d" xmlns:oel="http://schemas.microsoft.com/office/2019/extlst" xmlns:r="http://schemas.openxmlformats.org/officeDocument/2006/relationships" xmlns:wp14="http://schemas.microsoft.com/office/word/2010/wordprocessingDrawing" xmlns:wp="http://schemas.openxmlformats.org/drawingml/2006/wordprocessingDrawing" xmlns:wpg="http://schemas.microsoft.com/office/word/2010/wordprocessingGroup" xmlns:wpi="http://schemas.microsoft.com/office/word/2010/wordprocessingInk" xmlns:wps="http://schemas.microsoft.com/office/word/2010/wordprocessingShape" xmlns:o="urn:schemas-microsoft-com:office:office" xmlns:v="urn:schemas-microsoft-com:vml" xmlns:w10="urn:schemas-microsoft-com:office:word" xmlns:w="http://schemas.openxmlformats.org/wordprocessingml/2006/main" xmlns:w14="http://schemas.microsoft.com/office/word/2010/wordml" xmlns:w15="http://schemas.microsoft.com/office/word/2012/wordml" xmlns:w16cex="http://schemas.microsoft.com/office/word/2018/wordml/cex" xmlns:w16cid="http://schemas.microsoft.com/office/word/2016/wordml/cid" xmlns:w16="http://schemas.microsoft.com/office/word/2018/wordml" xmlns:w16sdtdh="http://schemas.microsoft.com/office/word/2020/wordml/sdtdatahash" xmlns:w16sdtfl="http://schemas.microsoft.com/office/word/2024/wordml/sdtformatlock" xmlns:w16se="http://schemas.microsoft.com/office/word/2015/wordml/symex" xmlns:w16du="http://schemas.microsoft.com/office/word/2023/wordml/word16du" xmlns:wne="http://schemas.microsoft.com/office/word/2006/wordml" mc:Ignorable="w14 w15 w16se w16cid w16 w16cex w16sdtdh w16sdtfl cr w16du wp14">
+<w16cex:commentsExtensible xmlns:wpc="http://schemas.microsoft.com/office/word/2010/wordprocessingCanvas" xmlns:cx="http://schemas.microsoft.com/office/drawing/2014/chartex" xmlns:cx1="http://schemas.microsoft.com/office/drawing/2015/9/8/chartex" xmlns:cx2="http://schemas.microsoft.com/office/drawing/2015/10/21/chartex" xmlns:cx3="http://schemas.microsoft.com/office/drawing/2016/5/9/chartex" xmlns:cx4="http://schemas.microsoft.com/office/drawing/2016/5/10/chartex" xmlns:cx5="http://schemas.microsoft.com/office/drawing/2016/5/11/chartex" xmlns:cx6="http://schemas.microsoft.com/office/drawing/2016/5/12/chartex" xmlns:cx7="http://schemas.microsoft.com/office/drawing/2016/5/13/chartex" xmlns:cx8="http://schemas.microsoft.com/office/drawing/2016/5/14/chartex" xmlns:cr="http://schemas.microsoft.com/office/comments/2020/reactions" xmlns:mc="http://schemas.openxmlformats.org/markup-compatibility/2006" xmlns:m="http://schemas.openxmlformats.org/officeDocument/2006/math" xmlns:aink="http://schemas.microsoft.com/office/drawing/2016/ink" xmlns:am3d="http://schemas.microsoft.com/office/drawing/2017/model3d" xmlns:oel="http://schemas.microsoft.com/office/2019/extlst" xmlns:r="http://schemas.openxmlformats.org/officeDocument/2006/relationships" xmlns:wp14="http://schemas.microsoft.com/office/word/2010/wordprocessingDrawing" xmlns:wp="http://schemas.openxmlformats.org/drawingml/2006/wordprocessingDrawing" xmlns:wpg="http://schemas.microsoft.com/office/word/2010/wordprocessingGroup" xmlns:wpi="http://schemas.microsoft.com/office/word/2010/wordprocessingInk" xmlns:wps="http://schemas.microsoft.com/office/word/2010/wordprocessingShape" xmlns:o="urn:schemas-microsoft-com:office:office" xmlns:v="urn:schemas-microsoft-com:vml" xmlns:w10="urn:schemas-microsoft-com:office:word" xmlns:w="http://schemas.openxmlformats.org/wordprocessingml/2006/main" xmlns:w14="http://schemas.microsoft.com/office/word/2010/wordml" xmlns:w15="http://schemas.microsoft.com/office/word/2012/wordml" xmlns:w16cei="http://schemas.microsoft.com/office/word/2026/wordml/cei" xmlns:w16cex="http://schemas.microsoft.com/office/word/2018/wordml/cex" xmlns:w16cid="http://schemas.microsoft.com/office/word/2016/wordml/cid" xmlns:w16="http://schemas.microsoft.com/office/word/2018/wordml" xmlns:w16sdtdh="http://schemas.microsoft.com/office/word/2020/wordml/sdtdatahash" xmlns:w16sdtfl="http://schemas.microsoft.com/office/word/2024/wordml/sdtformatlock" xmlns:w16se="http://schemas.microsoft.com/office/word/2015/wordml/symex" xmlns:w16du="http://schemas.microsoft.com/office/word/2023/wordml/word16du" xmlns:wne="http://schemas.microsoft.com/office/word/2006/wordml" mc:Ignorable="w14 w15 w16se w16cid w16 w16cex w16sdtdh w16sdtfl cr w16du wp14">
   <w16cex:commentExtensible w16cex:durableId="0CF9A057" w16cex:dateUtc="2025-03-31T13:25:00Z"/>
   <w16cex:commentExtensible w16cex:durableId="5B0D66D0" w16cex:dateUtc="2025-03-31T13:25:00Z"/>
   <w16cex:commentExtensible w16cex:durableId="0E38F10B" w16cex:dateUtc="2025-03-31T13:29:00Z"/>
@@ -12492,7 +12515,7 @@
 </file>
 
 <file path=word/commentsIds.xml><?xml version="1.0" encoding="utf-8"?>
-<w16cid:commentsIds xmlns:wpc="http://schemas.microsoft.com/office/word/2010/wordprocessingCanvas" xmlns:cx="http://schemas.microsoft.com/office/drawing/2014/chartex" xmlns:cx1="http://schemas.microsoft.com/office/drawing/2015/9/8/chartex" xmlns:cx2="http://schemas.microsoft.com/office/drawing/2015/10/21/chartex" xmlns:cx3="http://schemas.microsoft.com/office/drawing/2016/5/9/chartex" xmlns:cx4="http://schemas.microsoft.com/office/drawing/2016/5/10/chartex" xmlns:cx5="http://schemas.microsoft.com/office/drawing/2016/5/11/chartex" xmlns:cx6="http://schemas.microsoft.com/office/drawing/2016/5/12/chartex" xmlns:cx7="http://schemas.microsoft.com/office/drawing/2016/5/13/chartex" xmlns:cx8="http://schemas.microsoft.com/office/drawing/2016/5/14/chartex" xmlns:mc="http://schemas.openxmlformats.org/markup-compatibility/2006" xmlns:m="http://schemas.openxmlformats.org/officeDocument/2006/math" xmlns:aink="http://schemas.microsoft.com/office/drawing/2016/ink" xmlns:am3d="http://schemas.microsoft.com/office/drawing/2017/model3d" xmlns:oel="http://schemas.microsoft.com/office/2019/extlst" xmlns:r="http://schemas.openxmlformats.org/officeDocument/2006/relationships" xmlns:wp14="http://schemas.microsoft.com/office/word/2010/wordprocessingDrawing" xmlns:wp="http://schemas.openxmlformats.org/drawingml/2006/wordprocessingDrawing" xmlns:wpg="http://schemas.microsoft.com/office/word/2010/wordprocessingGroup" xmlns:wpi="http://schemas.microsoft.com/office/word/2010/wordprocessingInk" xmlns:wps="http://schemas.microsoft.com/office/word/2010/wordprocessingShape" xmlns:o="urn:schemas-microsoft-com:office:office" xmlns:v="urn:schemas-microsoft-com:vml" xmlns:w10="urn:schemas-microsoft-com:office:word" xmlns:w="http://schemas.openxmlformats.org/wordprocessingml/2006/main" xmlns:w14="http://schemas.microsoft.com/office/word/2010/wordml" xmlns:w15="http://schemas.microsoft.com/office/word/2012/wordml" xmlns:w16cex="http://schemas.microsoft.com/office/word/2018/wordml/cex" xmlns:w16cid="http://schemas.microsoft.com/office/word/2016/wordml/cid" xmlns:w16="http://schemas.microsoft.com/office/word/2018/wordml" xmlns:w16sdtdh="http://schemas.microsoft.com/office/word/2020/wordml/sdtdatahash" xmlns:w16sdtfl="http://schemas.microsoft.com/office/word/2024/wordml/sdtformatlock" xmlns:w16se="http://schemas.microsoft.com/office/word/2015/wordml/symex" xmlns:w16du="http://schemas.microsoft.com/office/word/2023/wordml/word16du" xmlns:wne="http://schemas.microsoft.com/office/word/2006/wordml" mc:Ignorable="w14 w15 w16se w16cid w16 w16cex w16sdtdh w16sdtfl w16du wp14">
+<w16cid:commentsIds xmlns:wpc="http://schemas.microsoft.com/office/word/2010/wordprocessingCanvas" xmlns:cx="http://schemas.microsoft.com/office/drawing/2014/chartex" xmlns:cx1="http://schemas.microsoft.com/office/drawing/2015/9/8/chartex" xmlns:cx2="http://schemas.microsoft.com/office/drawing/2015/10/21/chartex" xmlns:cx3="http://schemas.microsoft.com/office/drawing/2016/5/9/chartex" xmlns:cx4="http://schemas.microsoft.com/office/drawing/2016/5/10/chartex" xmlns:cx5="http://schemas.microsoft.com/office/drawing/2016/5/11/chartex" xmlns:cx6="http://schemas.microsoft.com/office/drawing/2016/5/12/chartex" xmlns:cx7="http://schemas.microsoft.com/office/drawing/2016/5/13/chartex" xmlns:cx8="http://schemas.microsoft.com/office/drawing/2016/5/14/chartex" xmlns:mc="http://schemas.openxmlformats.org/markup-compatibility/2006" xmlns:m="http://schemas.openxmlformats.org/officeDocument/2006/math" xmlns:aink="http://schemas.microsoft.com/office/drawing/2016/ink" xmlns:am3d="http://schemas.microsoft.com/office/drawing/2017/model3d" xmlns:oel="http://schemas.microsoft.com/office/2019/extlst" xmlns:r="http://schemas.openxmlformats.org/officeDocument/2006/relationships" xmlns:wp14="http://schemas.microsoft.com/office/word/2010/wordprocessingDrawing" xmlns:wp="http://schemas.openxmlformats.org/drawingml/2006/wordprocessingDrawing" xmlns:wpg="http://schemas.microsoft.com/office/word/2010/wordprocessingGroup" xmlns:wpi="http://schemas.microsoft.com/office/word/2010/wordprocessingInk" xmlns:wps="http://schemas.microsoft.com/office/word/2010/wordprocessingShape" xmlns:o="urn:schemas-microsoft-com:office:office" xmlns:v="urn:schemas-microsoft-com:vml" xmlns:w10="urn:schemas-microsoft-com:office:word" xmlns:w="http://schemas.openxmlformats.org/wordprocessingml/2006/main" xmlns:w14="http://schemas.microsoft.com/office/word/2010/wordml" xmlns:w15="http://schemas.microsoft.com/office/word/2012/wordml" xmlns:w16cei="http://schemas.microsoft.com/office/word/2026/wordml/cei" xmlns:w16cex="http://schemas.microsoft.com/office/word/2018/wordml/cex" xmlns:w16cid="http://schemas.microsoft.com/office/word/2016/wordml/cid" xmlns:w16="http://schemas.microsoft.com/office/word/2018/wordml" xmlns:w16sdtdh="http://schemas.microsoft.com/office/word/2020/wordml/sdtdatahash" xmlns:w16sdtfl="http://schemas.microsoft.com/office/word/2024/wordml/sdtformatlock" xmlns:w16se="http://schemas.microsoft.com/office/word/2015/wordml/symex" xmlns:w16du="http://schemas.microsoft.com/office/word/2023/wordml/word16du" xmlns:wne="http://schemas.microsoft.com/office/word/2006/wordml" mc:Ignorable="w14 w15 w16se w16cid w16 w16cex w16sdtdh w16sdtfl w16du wp14">
   <w16cid:commentId w16cid:paraId="51F97860" w16cid:durableId="0CF9A057"/>
   <w16cid:commentId w16cid:paraId="55A6ECFB" w16cid:durableId="5B0D66D0"/>
   <w16cid:commentId w16cid:paraId="4FBA6D35" w16cid:durableId="0E38F10B"/>
@@ -12500,7 +12523,7 @@
 </file>
 
 <file path=word/endnotes.xml><?xml version="1.0" encoding="utf-8"?>
-<w:endnotes xmlns:wpc="http://schemas.microsoft.com/office/word/2010/wordprocessingCanvas" xmlns:cx="http://schemas.microsoft.com/office/drawing/2014/chartex" xmlns:cx1="http://schemas.microsoft.com/office/drawing/2015/9/8/chartex" xmlns:cx2="http://schemas.microsoft.com/office/drawing/2015/10/21/chartex" xmlns:cx3="http://schemas.microsoft.com/office/drawing/2016/5/9/chartex" xmlns:cx4="http://schemas.microsoft.com/office/drawing/2016/5/10/chartex" xmlns:cx5="http://schemas.microsoft.com/office/drawing/2016/5/11/chartex" xmlns:cx6="http://schemas.microsoft.com/office/drawing/2016/5/12/chartex" xmlns:cx7="http://schemas.microsoft.com/office/drawing/2016/5/13/chartex" xmlns:cx8="http://schemas.microsoft.com/office/drawing/2016/5/14/chartex" xmlns:mc="http://schemas.openxmlformats.org/markup-compatibility/2006" xmlns:m="http://schemas.openxmlformats.org/officeDocument/2006/math" xmlns:aink="http://schemas.microsoft.com/office/drawing/2016/ink" xmlns:am3d="http://schemas.microsoft.com/office/drawing/2017/model3d" xmlns:oel="http://schemas.microsoft.com/office/2019/extlst" xmlns:r="http://schemas.openxmlformats.org/officeDocument/2006/relationships" xmlns:wp14="http://schemas.microsoft.com/office/word/2010/wordprocessingDrawing" xmlns:wp="http://schemas.openxmlformats.org/drawingml/2006/wordprocessingDrawing" xmlns:wpg="http://schemas.microsoft.com/office/word/2010/wordprocessingGroup" xmlns:wpi="http://schemas.microsoft.com/office/word/2010/wordprocessingInk" xmlns:wps="http://schemas.microsoft.com/office/word/2010/wordprocessingShape" xmlns:o="urn:schemas-microsoft-com:office:office" xmlns:v="urn:schemas-microsoft-com:vml" xmlns:w10="urn:schemas-microsoft-com:office:word" xmlns:w="http://schemas.openxmlformats.org/wordprocessingml/2006/main" xmlns:w14="http://schemas.microsoft.com/office/word/2010/wordml" xmlns:w15="http://schemas.microsoft.com/office/word/2012/wordml" xmlns:w16cex="http://schemas.microsoft.com/office/word/2018/wordml/cex" xmlns:w16cid="http://schemas.microsoft.com/office/word/2016/wordml/cid" xmlns:w16="http://schemas.microsoft.com/office/word/2018/wordml" xmlns:w16sdtdh="http://schemas.microsoft.com/office/word/2020/wordml/sdtdatahash" xmlns:w16sdtfl="http://schemas.microsoft.com/office/word/2024/wordml/sdtformatlock" xmlns:w16se="http://schemas.microsoft.com/office/word/2015/wordml/symex" xmlns:w16du="http://schemas.microsoft.com/office/word/2023/wordml/word16du" xmlns:wne="http://schemas.microsoft.com/office/word/2006/wordml" mc:Ignorable="w14 w15 w16se w16cid w16 w16cex w16sdtdh w16sdtfl w16du wp14">
+<w:endnotes xmlns:wpc="http://schemas.microsoft.com/office/word/2010/wordprocessingCanvas" xmlns:cx="http://schemas.microsoft.com/office/drawing/2014/chartex" xmlns:cx1="http://schemas.microsoft.com/office/drawing/2015/9/8/chartex" xmlns:cx2="http://schemas.microsoft.com/office/drawing/2015/10/21/chartex" xmlns:cx3="http://schemas.microsoft.com/office/drawing/2016/5/9/chartex" xmlns:cx4="http://schemas.microsoft.com/office/drawing/2016/5/10/chartex" xmlns:cx5="http://schemas.microsoft.com/office/drawing/2016/5/11/chartex" xmlns:cx6="http://schemas.microsoft.com/office/drawing/2016/5/12/chartex" xmlns:cx7="http://schemas.microsoft.com/office/drawing/2016/5/13/chartex" xmlns:cx8="http://schemas.microsoft.com/office/drawing/2016/5/14/chartex" xmlns:mc="http://schemas.openxmlformats.org/markup-compatibility/2006" xmlns:m="http://schemas.openxmlformats.org/officeDocument/2006/math" xmlns:aink="http://schemas.microsoft.com/office/drawing/2016/ink" xmlns:am3d="http://schemas.microsoft.com/office/drawing/2017/model3d" xmlns:oel="http://schemas.microsoft.com/office/2019/extlst" xmlns:r="http://schemas.openxmlformats.org/officeDocument/2006/relationships" xmlns:wp14="http://schemas.microsoft.com/office/word/2010/wordprocessingDrawing" xmlns:wp="http://schemas.openxmlformats.org/drawingml/2006/wordprocessingDrawing" xmlns:wpg="http://schemas.microsoft.com/office/word/2010/wordprocessingGroup" xmlns:wpi="http://schemas.microsoft.com/office/word/2010/wordprocessingInk" xmlns:wps="http://schemas.microsoft.com/office/word/2010/wordprocessingShape" xmlns:o="urn:schemas-microsoft-com:office:office" xmlns:v="urn:schemas-microsoft-com:vml" xmlns:w10="urn:schemas-microsoft-com:office:word" xmlns:w="http://schemas.openxmlformats.org/wordprocessingml/2006/main" xmlns:w14="http://schemas.microsoft.com/office/word/2010/wordml" xmlns:w15="http://schemas.microsoft.com/office/word/2012/wordml" xmlns:w16cei="http://schemas.microsoft.com/office/word/2026/wordml/cei" xmlns:w16cex="http://schemas.microsoft.com/office/word/2018/wordml/cex" xmlns:w16cid="http://schemas.microsoft.com/office/word/2016/wordml/cid" xmlns:w16="http://schemas.microsoft.com/office/word/2018/wordml" xmlns:w16sdtdh="http://schemas.microsoft.com/office/word/2020/wordml/sdtdatahash" xmlns:w16sdtfl="http://schemas.microsoft.com/office/word/2024/wordml/sdtformatlock" xmlns:w16se="http://schemas.microsoft.com/office/word/2015/wordml/symex" xmlns:w16du="http://schemas.microsoft.com/office/word/2023/wordml/word16du" xmlns:wne="http://schemas.microsoft.com/office/word/2006/wordml" mc:Ignorable="w14 w15 w16se w16cid w16 w16cex w16sdtdh w16sdtfl w16du wp14">
   <w:endnote w:type="separator" w:id="-1">
     <w:p>
       <w:r>
@@ -12522,7 +12545,7 @@
 </file>
 
 <file path=word/footnotes.xml><?xml version="1.0" encoding="utf-8"?>
-<w:footnotes xmlns:wpc="http://schemas.microsoft.com/office/word/2010/wordprocessingCanvas" xmlns:cx="http://schemas.microsoft.com/office/drawing/2014/chartex" xmlns:cx1="http://schemas.microsoft.com/office/drawing/2015/9/8/chartex" xmlns:cx2="http://schemas.microsoft.com/office/drawing/2015/10/21/chartex" xmlns:cx3="http://schemas.microsoft.com/office/drawing/2016/5/9/chartex" xmlns:cx4="http://schemas.microsoft.com/office/drawing/2016/5/10/chartex" xmlns:cx5="http://schemas.microsoft.com/office/drawing/2016/5/11/chartex" xmlns:cx6="http://schemas.microsoft.com/office/drawing/2016/5/12/chartex" xmlns:cx7="http://schemas.microsoft.com/office/drawing/2016/5/13/chartex" xmlns:cx8="http://schemas.microsoft.com/office/drawing/2016/5/14/chartex" xmlns:mc="http://schemas.openxmlformats.org/markup-compatibility/2006" xmlns:m="http://schemas.openxmlformats.org/officeDocument/2006/math" xmlns:aink="http://schemas.microsoft.com/office/drawing/2016/ink" xmlns:am3d="http://schemas.microsoft.com/office/drawing/2017/model3d" xmlns:oel="http://schemas.microsoft.com/office/2019/extlst" xmlns:r="http://schemas.openxmlformats.org/officeDocument/2006/relationships" xmlns:wp14="http://schemas.microsoft.com/office/word/2010/wordprocessingDrawing" xmlns:wp="http://schemas.openxmlformats.org/drawingml/2006/wordprocessingDrawing" xmlns:wpg="http://schemas.microsoft.com/office/word/2010/wordprocessingGroup" xmlns:wpi="http://schemas.microsoft.com/office/word/2010/wordprocessingInk" xmlns:wps="http://schemas.microsoft.com/office/word/2010/wordprocessingShape" xmlns:o="urn:schemas-microsoft-com:office:office" xmlns:v="urn:schemas-microsoft-com:vml" xmlns:w10="urn:schemas-microsoft-com:office:word" xmlns:w="http://schemas.openxmlformats.org/wordprocessingml/2006/main" xmlns:w14="http://schemas.microsoft.com/office/word/2010/wordml" xmlns:w15="http://schemas.microsoft.com/office/word/2012/wordml" xmlns:w16cex="http://schemas.microsoft.com/office/word/2018/wordml/cex" xmlns:w16cid="http://schemas.microsoft.com/office/word/2016/wordml/cid" xmlns:w16="http://schemas.microsoft.com/office/word/2018/wordml" xmlns:w16sdtdh="http://schemas.microsoft.com/office/word/2020/wordml/sdtdatahash" xmlns:w16sdtfl="http://schemas.microsoft.com/office/word/2024/wordml/sdtformatlock" xmlns:w16se="http://schemas.microsoft.com/office/word/2015/wordml/symex" xmlns:w16du="http://schemas.microsoft.com/office/word/2023/wordml/word16du" xmlns:wne="http://schemas.microsoft.com/office/word/2006/wordml" mc:Ignorable="w14 w15 w16se w16cid w16 w16cex w16sdtdh w16sdtfl w16du wp14">
+<w:footnotes xmlns:wpc="http://schemas.microsoft.com/office/word/2010/wordprocessingCanvas" xmlns:cx="http://schemas.microsoft.com/office/drawing/2014/chartex" xmlns:cx1="http://schemas.microsoft.com/office/drawing/2015/9/8/chartex" xmlns:cx2="http://schemas.microsoft.com/office/drawing/2015/10/21/chartex" xmlns:cx3="http://schemas.microsoft.com/office/drawing/2016/5/9/chartex" xmlns:cx4="http://schemas.microsoft.com/office/drawing/2016/5/10/chartex" xmlns:cx5="http://schemas.microsoft.com/office/drawing/2016/5/11/chartex" xmlns:cx6="http://schemas.microsoft.com/office/drawing/2016/5/12/chartex" xmlns:cx7="http://schemas.microsoft.com/office/drawing/2016/5/13/chartex" xmlns:cx8="http://schemas.microsoft.com/office/drawing/2016/5/14/chartex" xmlns:mc="http://schemas.openxmlformats.org/markup-compatibility/2006" xmlns:m="http://schemas.openxmlformats.org/officeDocument/2006/math" xmlns:aink="http://schemas.microsoft.com/office/drawing/2016/ink" xmlns:am3d="http://schemas.microsoft.com/office/drawing/2017/model3d" xmlns:oel="http://schemas.microsoft.com/office/2019/extlst" xmlns:r="http://schemas.openxmlformats.org/officeDocument/2006/relationships" xmlns:wp14="http://schemas.microsoft.com/office/word/2010/wordprocessingDrawing" xmlns:wp="http://schemas.openxmlformats.org/drawingml/2006/wordprocessingDrawing" xmlns:wpg="http://schemas.microsoft.com/office/word/2010/wordprocessingGroup" xmlns:wpi="http://schemas.microsoft.com/office/word/2010/wordprocessingInk" xmlns:wps="http://schemas.microsoft.com/office/word/2010/wordprocessingShape" xmlns:o="urn:schemas-microsoft-com:office:office" xmlns:v="urn:schemas-microsoft-com:vml" xmlns:w10="urn:schemas-microsoft-com:office:word" xmlns:w="http://schemas.openxmlformats.org/wordprocessingml/2006/main" xmlns:w14="http://schemas.microsoft.com/office/word/2010/wordml" xmlns:w15="http://schemas.microsoft.com/office/word/2012/wordml" xmlns:w16cei="http://schemas.microsoft.com/office/word/2026/wordml/cei" xmlns:w16cex="http://schemas.microsoft.com/office/word/2018/wordml/cex" xmlns:w16cid="http://schemas.microsoft.com/office/word/2016/wordml/cid" xmlns:w16="http://schemas.microsoft.com/office/word/2018/wordml" xmlns:w16sdtdh="http://schemas.microsoft.com/office/word/2020/wordml/sdtdatahash" xmlns:w16sdtfl="http://schemas.microsoft.com/office/word/2024/wordml/sdtformatlock" xmlns:w16se="http://schemas.microsoft.com/office/word/2015/wordml/symex" xmlns:w16du="http://schemas.microsoft.com/office/word/2023/wordml/word16du" xmlns:wne="http://schemas.microsoft.com/office/word/2006/wordml" mc:Ignorable="w14 w15 w16se w16cid w16 w16cex w16sdtdh w16sdtfl w16du wp14">
   <w:footnote w:type="separator" w:id="-1">
     <w:p>
       <w:r>
@@ -12544,7 +12567,7 @@
 </file>
 
 <file path=word/header1.xml><?xml version="1.0" encoding="utf-8"?>
-<w:hdr xmlns:wpc="http://schemas.microsoft.com/office/word/2010/wordprocessingCanvas" xmlns:cx="http://schemas.microsoft.com/office/drawing/2014/chartex" xmlns:cx1="http://schemas.microsoft.com/office/drawing/2015/9/8/chartex" xmlns:cx2="http://schemas.microsoft.com/office/drawing/2015/10/21/chartex" xmlns:cx3="http://schemas.microsoft.com/office/drawing/2016/5/9/chartex" xmlns:cx4="http://schemas.microsoft.com/office/drawing/2016/5/10/chartex" xmlns:cx5="http://schemas.microsoft.com/office/drawing/2016/5/11/chartex" xmlns:cx6="http://schemas.microsoft.com/office/drawing/2016/5/12/chartex" xmlns:cx7="http://schemas.microsoft.com/office/drawing/2016/5/13/chartex" xmlns:cx8="http://schemas.microsoft.com/office/drawing/2016/5/14/chartex" xmlns:mc="http://schemas.openxmlformats.org/markup-compatibility/2006" xmlns:m="http://schemas.openxmlformats.org/officeDocument/2006/math" xmlns:aink="http://schemas.microsoft.com/office/drawing/2016/ink" xmlns:am3d="http://schemas.microsoft.com/office/drawing/2017/model3d" xmlns:oel="http://schemas.microsoft.com/office/2019/extlst" xmlns:r="http://schemas.openxmlformats.org/officeDocument/2006/relationships" xmlns:wp14="http://schemas.microsoft.com/office/word/2010/wordprocessingDrawing" xmlns:wp="http://schemas.openxmlformats.org/drawingml/2006/wordprocessingDrawing" xmlns:wpg="http://schemas.microsoft.com/office/word/2010/wordprocessingGroup" xmlns:wpi="http://schemas.microsoft.com/office/word/2010/wordprocessingInk" xmlns:wps="http://schemas.microsoft.com/office/word/2010/wordprocessingShape" xmlns:o="urn:schemas-microsoft-com:office:office" xmlns:v="urn:schemas-microsoft-com:vml" xmlns:w10="urn:schemas-microsoft-com:office:word" xmlns:w="http://schemas.openxmlformats.org/wordprocessingml/2006/main" xmlns:w14="http://schemas.microsoft.com/office/word/2010/wordml" xmlns:w15="http://schemas.microsoft.com/office/word/2012/wordml" xmlns:w16cex="http://schemas.microsoft.com/office/word/2018/wordml/cex" xmlns:w16cid="http://schemas.microsoft.com/office/word/2016/wordml/cid" xmlns:w16="http://schemas.microsoft.com/office/word/2018/wordml" xmlns:w16sdtdh="http://schemas.microsoft.com/office/word/2020/wordml/sdtdatahash" xmlns:w16sdtfl="http://schemas.microsoft.com/office/word/2024/wordml/sdtformatlock" xmlns:w16se="http://schemas.microsoft.com/office/word/2015/wordml/symex" xmlns:w16du="http://schemas.microsoft.com/office/word/2023/wordml/word16du" xmlns:wne="http://schemas.microsoft.com/office/word/2006/wordml" mc:Ignorable="w14 w15 w16se w16cid w16 w16cex w16sdtdh w16sdtfl w16du wp14">
+<w:hdr xmlns:wpc="http://schemas.microsoft.com/office/word/2010/wordprocessingCanvas" xmlns:cx="http://schemas.microsoft.com/office/drawing/2014/chartex" xmlns:cx1="http://schemas.microsoft.com/office/drawing/2015/9/8/chartex" xmlns:cx2="http://schemas.microsoft.com/office/drawing/2015/10/21/chartex" xmlns:cx3="http://schemas.microsoft.com/office/drawing/2016/5/9/chartex" xmlns:cx4="http://schemas.microsoft.com/office/drawing/2016/5/10/chartex" xmlns:cx5="http://schemas.microsoft.com/office/drawing/2016/5/11/chartex" xmlns:cx6="http://schemas.microsoft.com/office/drawing/2016/5/12/chartex" xmlns:cx7="http://schemas.microsoft.com/office/drawing/2016/5/13/chartex" xmlns:cx8="http://schemas.microsoft.com/office/drawing/2016/5/14/chartex" xmlns:mc="http://schemas.openxmlformats.org/markup-compatibility/2006" xmlns:m="http://schemas.openxmlformats.org/officeDocument/2006/math" xmlns:aink="http://schemas.microsoft.com/office/drawing/2016/ink" xmlns:am3d="http://schemas.microsoft.com/office/drawing/2017/model3d" xmlns:oel="http://schemas.microsoft.com/office/2019/extlst" xmlns:r="http://schemas.openxmlformats.org/officeDocument/2006/relationships" xmlns:wp14="http://schemas.microsoft.com/office/word/2010/wordprocessingDrawing" xmlns:wp="http://schemas.openxmlformats.org/drawingml/2006/wordprocessingDrawing" xmlns:wpg="http://schemas.microsoft.com/office/word/2010/wordprocessingGroup" xmlns:wpi="http://schemas.microsoft.com/office/word/2010/wordprocessingInk" xmlns:wps="http://schemas.microsoft.com/office/word/2010/wordprocessingShape" xmlns:o="urn:schemas-microsoft-com:office:office" xmlns:v="urn:schemas-microsoft-com:vml" xmlns:w10="urn:schemas-microsoft-com:office:word" xmlns:w="http://schemas.openxmlformats.org/wordprocessingml/2006/main" xmlns:w14="http://schemas.microsoft.com/office/word/2010/wordml" xmlns:w15="http://schemas.microsoft.com/office/word/2012/wordml" xmlns:w16cei="http://schemas.microsoft.com/office/word/2026/wordml/cei" xmlns:w16cex="http://schemas.microsoft.com/office/word/2018/wordml/cex" xmlns:w16cid="http://schemas.microsoft.com/office/word/2016/wordml/cid" xmlns:w16="http://schemas.microsoft.com/office/word/2018/wordml" xmlns:w16sdtdh="http://schemas.microsoft.com/office/word/2020/wordml/sdtdatahash" xmlns:w16sdtfl="http://schemas.microsoft.com/office/word/2024/wordml/sdtformatlock" xmlns:w16se="http://schemas.microsoft.com/office/word/2015/wordml/symex" xmlns:w16du="http://schemas.microsoft.com/office/word/2023/wordml/word16du" xmlns:wne="http://schemas.microsoft.com/office/word/2006/wordml" mc:Ignorable="w14 w15 w16se w16cid w16 w16cex w16sdtdh w16sdtfl w16du wp14">
   <w:p>
     <w:pPr>
       <w:pStyle w:val="Header"/>
@@ -12614,7 +12637,7 @@
 </file>
 
 <file path=word/header2.xml><?xml version="1.0" encoding="utf-8"?>
-<w:hdr xmlns:wpc="http://schemas.microsoft.com/office/word/2010/wordprocessingCanvas" xmlns:cx="http://schemas.microsoft.com/office/drawing/2014/chartex" xmlns:cx1="http://schemas.microsoft.com/office/drawing/2015/9/8/chartex" xmlns:cx2="http://schemas.microsoft.com/office/drawing/2015/10/21/chartex" xmlns:cx3="http://schemas.microsoft.com/office/drawing/2016/5/9/chartex" xmlns:cx4="http://schemas.microsoft.com/office/drawing/2016/5/10/chartex" xmlns:cx5="http://schemas.microsoft.com/office/drawing/2016/5/11/chartex" xmlns:cx6="http://schemas.microsoft.com/office/drawing/2016/5/12/chartex" xmlns:cx7="http://schemas.microsoft.com/office/drawing/2016/5/13/chartex" xmlns:cx8="http://schemas.microsoft.com/office/drawing/2016/5/14/chartex" xmlns:mc="http://schemas.openxmlformats.org/markup-compatibility/2006" xmlns:m="http://schemas.openxmlformats.org/officeDocument/2006/math" xmlns:aink="http://schemas.microsoft.com/office/drawing/2016/ink" xmlns:am3d="http://schemas.microsoft.com/office/drawing/2017/model3d" xmlns:oel="http://schemas.microsoft.com/office/2019/extlst" xmlns:r="http://schemas.openxmlformats.org/officeDocument/2006/relationships" xmlns:wp14="http://schemas.microsoft.com/office/word/2010/wordprocessingDrawing" xmlns:wp="http://schemas.openxmlformats.org/drawingml/2006/wordprocessingDrawing" xmlns:wpg="http://schemas.microsoft.com/office/word/2010/wordprocessingGroup" xmlns:wpi="http://schemas.microsoft.com/office/word/2010/wordprocessingInk" xmlns:wps="http://schemas.microsoft.com/office/word/2010/wordprocessingShape" xmlns:o="urn:schemas-microsoft-com:office:office" xmlns:v="urn:schemas-microsoft-com:vml" xmlns:w10="urn:schemas-microsoft-com:office:word" xmlns:w="http://schemas.openxmlformats.org/wordprocessingml/2006/main" xmlns:w14="http://schemas.microsoft.com/office/word/2010/wordml" xmlns:w15="http://schemas.microsoft.com/office/word/2012/wordml" xmlns:w16cex="http://schemas.microsoft.com/office/word/2018/wordml/cex" xmlns:w16cid="http://schemas.microsoft.com/office/word/2016/wordml/cid" xmlns:w16="http://schemas.microsoft.com/office/word/2018/wordml" xmlns:w16sdtdh="http://schemas.microsoft.com/office/word/2020/wordml/sdtdatahash" xmlns:w16sdtfl="http://schemas.microsoft.com/office/word/2024/wordml/sdtformatlock" xmlns:w16se="http://schemas.microsoft.com/office/word/2015/wordml/symex" xmlns:w16du="http://schemas.microsoft.com/office/word/2023/wordml/word16du" xmlns:wne="http://schemas.microsoft.com/office/word/2006/wordml" mc:Ignorable="w14 w15 w16se w16cid w16 w16cex w16sdtdh w16sdtfl w16du wp14">
+<w:hdr xmlns:wpc="http://schemas.microsoft.com/office/word/2010/wordprocessingCanvas" xmlns:cx="http://schemas.microsoft.com/office/drawing/2014/chartex" xmlns:cx1="http://schemas.microsoft.com/office/drawing/2015/9/8/chartex" xmlns:cx2="http://schemas.microsoft.com/office/drawing/2015/10/21/chartex" xmlns:cx3="http://schemas.microsoft.com/office/drawing/2016/5/9/chartex" xmlns:cx4="http://schemas.microsoft.com/office/drawing/2016/5/10/chartex" xmlns:cx5="http://schemas.microsoft.com/office/drawing/2016/5/11/chartex" xmlns:cx6="http://schemas.microsoft.com/office/drawing/2016/5/12/chartex" xmlns:cx7="http://schemas.microsoft.com/office/drawing/2016/5/13/chartex" xmlns:cx8="http://schemas.microsoft.com/office/drawing/2016/5/14/chartex" xmlns:mc="http://schemas.openxmlformats.org/markup-compatibility/2006" xmlns:m="http://schemas.openxmlformats.org/officeDocument/2006/math" xmlns:aink="http://schemas.microsoft.com/office/drawing/2016/ink" xmlns:am3d="http://schemas.microsoft.com/office/drawing/2017/model3d" xmlns:oel="http://schemas.microsoft.com/office/2019/extlst" xmlns:r="http://schemas.openxmlformats.org/officeDocument/2006/relationships" xmlns:wp14="http://schemas.microsoft.com/office/word/2010/wordprocessingDrawing" xmlns:wp="http://schemas.openxmlformats.org/drawingml/2006/wordprocessingDrawing" xmlns:wpg="http://schemas.microsoft.com/office/word/2010/wordprocessingGroup" xmlns:wpi="http://schemas.microsoft.com/office/word/2010/wordprocessingInk" xmlns:wps="http://schemas.microsoft.com/office/word/2010/wordprocessingShape" xmlns:o="urn:schemas-microsoft-com:office:office" xmlns:v="urn:schemas-microsoft-com:vml" xmlns:w10="urn:schemas-microsoft-com:office:word" xmlns:w="http://schemas.openxmlformats.org/wordprocessingml/2006/main" xmlns:w14="http://schemas.microsoft.com/office/word/2010/wordml" xmlns:w15="http://schemas.microsoft.com/office/word/2012/wordml" xmlns:w16cei="http://schemas.microsoft.com/office/word/2026/wordml/cei" xmlns:w16cex="http://schemas.microsoft.com/office/word/2018/wordml/cex" xmlns:w16cid="http://schemas.microsoft.com/office/word/2016/wordml/cid" xmlns:w16="http://schemas.microsoft.com/office/word/2018/wordml" xmlns:w16sdtdh="http://schemas.microsoft.com/office/word/2020/wordml/sdtdatahash" xmlns:w16sdtfl="http://schemas.microsoft.com/office/word/2024/wordml/sdtformatlock" xmlns:w16se="http://schemas.microsoft.com/office/word/2015/wordml/symex" xmlns:w16du="http://schemas.microsoft.com/office/word/2023/wordml/word16du" xmlns:wne="http://schemas.microsoft.com/office/word/2006/wordml" mc:Ignorable="w14 w15 w16se w16cid w16 w16cex w16sdtdh w16sdtfl w16du wp14">
   <w:p>
     <w:pPr>
       <w:pStyle w:val="Header"/>
@@ -12699,7 +12722,7 @@
 </file>
 
 <file path=word/numbering.xml><?xml version="1.0" encoding="utf-8"?>
-<w:numbering xmlns:wpc="http://schemas.microsoft.com/office/word/2010/wordprocessingCanvas" xmlns:cx="http://schemas.microsoft.com/office/drawing/2014/chartex" xmlns:cx1="http://schemas.microsoft.com/office/drawing/2015/9/8/chartex" xmlns:cx2="http://schemas.microsoft.com/office/drawing/2015/10/21/chartex" xmlns:cx3="http://schemas.microsoft.com/office/drawing/2016/5/9/chartex" xmlns:cx4="http://schemas.microsoft.com/office/drawing/2016/5/10/chartex" xmlns:cx5="http://schemas.microsoft.com/office/drawing/2016/5/11/chartex" xmlns:cx6="http://schemas.microsoft.com/office/drawing/2016/5/12/chartex" xmlns:cx7="http://schemas.microsoft.com/office/drawing/2016/5/13/chartex" xmlns:cx8="http://schemas.microsoft.com/office/drawing/2016/5/14/chartex" xmlns:mc="http://schemas.openxmlformats.org/markup-compatibility/2006" xmlns:m="http://schemas.openxmlformats.org/officeDocument/2006/math" xmlns:aink="http://schemas.microsoft.com/office/drawing/2016/ink" xmlns:am3d="http://schemas.microsoft.com/office/drawing/2017/model3d" xmlns:oel="http://schemas.microsoft.com/office/2019/extlst" xmlns:r="http://schemas.openxmlformats.org/officeDocument/2006/relationships" xmlns:wp14="http://schemas.microsoft.com/office/word/2010/wordprocessingDrawing" xmlns:wp="http://schemas.openxmlformats.org/drawingml/2006/wordprocessingDrawing" xmlns:wpg="http://schemas.microsoft.com/office/word/2010/wordprocessingGroup" xmlns:wpi="http://schemas.microsoft.com/office/word/2010/wordprocessingInk" xmlns:wps="http://schemas.microsoft.com/office/word/2010/wordprocessingShape" xmlns:o="urn:schemas-microsoft-com:office:office" xmlns:v="urn:schemas-microsoft-com:vml" xmlns:w10="urn:schemas-microsoft-com:office:word" xmlns:w="http://schemas.openxmlformats.org/wordprocessingml/2006/main" xmlns:w14="http://schemas.microsoft.com/office/word/2010/wordml" xmlns:w15="http://schemas.microsoft.com/office/word/2012/wordml" xmlns:w16cex="http://schemas.microsoft.com/office/word/2018/wordml/cex" xmlns:w16cid="http://schemas.microsoft.com/office/word/2016/wordml/cid" xmlns:w16="http://schemas.microsoft.com/office/word/2018/wordml" xmlns:w16sdtdh="http://schemas.microsoft.com/office/word/2020/wordml/sdtdatahash" xmlns:w16sdtfl="http://schemas.microsoft.com/office/word/2024/wordml/sdtformatlock" xmlns:w16se="http://schemas.microsoft.com/office/word/2015/wordml/symex" xmlns:w16du="http://schemas.microsoft.com/office/word/2023/wordml/word16du" xmlns:wne="http://schemas.microsoft.com/office/word/2006/wordml" mc:Ignorable="w14 w15 w16se w16cid w16 w16cex w16sdtdh w16sdtfl w16du wp14">
+<w:numbering xmlns:wpc="http://schemas.microsoft.com/office/word/2010/wordprocessingCanvas" xmlns:cx="http://schemas.microsoft.com/office/drawing/2014/chartex" xmlns:cx1="http://schemas.microsoft.com/office/drawing/2015/9/8/chartex" xmlns:cx2="http://schemas.microsoft.com/office/drawing/2015/10/21/chartex" xmlns:cx3="http://schemas.microsoft.com/office/drawing/2016/5/9/chartex" xmlns:cx4="http://schemas.microsoft.com/office/drawing/2016/5/10/chartex" xmlns:cx5="http://schemas.microsoft.com/office/drawing/2016/5/11/chartex" xmlns:cx6="http://schemas.microsoft.com/office/drawing/2016/5/12/chartex" xmlns:cx7="http://schemas.microsoft.com/office/drawing/2016/5/13/chartex" xmlns:cx8="http://schemas.microsoft.com/office/drawing/2016/5/14/chartex" xmlns:mc="http://schemas.openxmlformats.org/markup-compatibility/2006" xmlns:m="http://schemas.openxmlformats.org/officeDocument/2006/math" xmlns:aink="http://schemas.microsoft.com/office/drawing/2016/ink" xmlns:am3d="http://schemas.microsoft.com/office/drawing/2017/model3d" xmlns:oel="http://schemas.microsoft.com/office/2019/extlst" xmlns:r="http://schemas.openxmlformats.org/officeDocument/2006/relationships" xmlns:wp14="http://schemas.microsoft.com/office/word/2010/wordprocessingDrawing" xmlns:wp="http://schemas.openxmlformats.org/drawingml/2006/wordprocessingDrawing" xmlns:wpg="http://schemas.microsoft.com/office/word/2010/wordprocessingGroup" xmlns:wpi="http://schemas.microsoft.com/office/word/2010/wordprocessingInk" xmlns:wps="http://schemas.microsoft.com/office/word/2010/wordprocessingShape" xmlns:o="urn:schemas-microsoft-com:office:office" xmlns:v="urn:schemas-microsoft-com:vml" xmlns:w10="urn:schemas-microsoft-com:office:word" xmlns:w="http://schemas.openxmlformats.org/wordprocessingml/2006/main" xmlns:w14="http://schemas.microsoft.com/office/word/2010/wordml" xmlns:w15="http://schemas.microsoft.com/office/word/2012/wordml" xmlns:w16cei="http://schemas.microsoft.com/office/word/2026/wordml/cei" xmlns:w16cex="http://schemas.microsoft.com/office/word/2018/wordml/cex" xmlns:w16cid="http://schemas.microsoft.com/office/word/2016/wordml/cid" xmlns:w16="http://schemas.microsoft.com/office/word/2018/wordml" xmlns:w16sdtdh="http://schemas.microsoft.com/office/word/2020/wordml/sdtdatahash" xmlns:w16sdtfl="http://schemas.microsoft.com/office/word/2024/wordml/sdtformatlock" xmlns:w16se="http://schemas.microsoft.com/office/word/2015/wordml/symex" xmlns:w16du="http://schemas.microsoft.com/office/word/2023/wordml/word16du" xmlns:wne="http://schemas.microsoft.com/office/word/2006/wordml" mc:Ignorable="w14 w15 w16se w16cid w16 w16cex w16sdtdh w16sdtfl w16du wp14">
   <w:abstractNum w:abstractNumId="0" w15:restartNumberingAfterBreak="0">
     <w:nsid w:val="15145751"/>
     <w:multiLevelType w:val="hybridMultilevel"/>
@@ -13258,7 +13281,7 @@
 </file>
 
 <file path=word/people.xml><?xml version="1.0" encoding="utf-8"?>
-<w15:people xmlns:wpc="http://schemas.microsoft.com/office/word/2010/wordprocessingCanvas" xmlns:cx="http://schemas.microsoft.com/office/drawing/2014/chartex" xmlns:cx1="http://schemas.microsoft.com/office/drawing/2015/9/8/chartex" xmlns:cx2="http://schemas.microsoft.com/office/drawing/2015/10/21/chartex" xmlns:cx3="http://schemas.microsoft.com/office/drawing/2016/5/9/chartex" xmlns:cx4="http://schemas.microsoft.com/office/drawing/2016/5/10/chartex" xmlns:cx5="http://schemas.microsoft.com/office/drawing/2016/5/11/chartex" xmlns:cx6="http://schemas.microsoft.com/office/drawing/2016/5/12/chartex" xmlns:cx7="http://schemas.microsoft.com/office/drawing/2016/5/13/chartex" xmlns:cx8="http://schemas.microsoft.com/office/drawing/2016/5/14/chartex" xmlns:mc="http://schemas.openxmlformats.org/markup-compatibility/2006" xmlns:m="http://schemas.openxmlformats.org/officeDocument/2006/math" xmlns:aink="http://schemas.microsoft.com/office/drawing/2016/ink" xmlns:am3d="http://schemas.microsoft.com/office/drawing/2017/model3d" xmlns:oel="http://schemas.microsoft.com/office/2019/extlst" xmlns:r="http://schemas.openxmlformats.org/officeDocument/2006/relationships" xmlns:wp14="http://schemas.microsoft.com/office/word/2010/wordprocessingDrawing" xmlns:wp="http://schemas.openxmlformats.org/drawingml/2006/wordprocessingDrawing" xmlns:wpg="http://schemas.microsoft.com/office/word/2010/wordprocessingGroup" xmlns:wpi="http://schemas.microsoft.com/office/word/2010/wordprocessingInk" xmlns:wps="http://schemas.microsoft.com/office/word/2010/wordprocessingShape" xmlns:o="urn:schemas-microsoft-com:office:office" xmlns:v="urn:schemas-microsoft-com:vml" xmlns:w10="urn:schemas-microsoft-com:office:word" xmlns:w="http://schemas.openxmlformats.org/wordprocessingml/2006/main" xmlns:w14="http://schemas.microsoft.com/office/word/2010/wordml" xmlns:w15="http://schemas.microsoft.com/office/word/2012/wordml" xmlns:w16cex="http://schemas.microsoft.com/office/word/2018/wordml/cex" xmlns:w16cid="http://schemas.microsoft.com/office/word/2016/wordml/cid" xmlns:w16="http://schemas.microsoft.com/office/word/2018/wordml" xmlns:w16sdtdh="http://schemas.microsoft.com/office/word/2020/wordml/sdtdatahash" xmlns:w16sdtfl="http://schemas.microsoft.com/office/word/2024/wordml/sdtformatlock" xmlns:w16se="http://schemas.microsoft.com/office/word/2015/wordml/symex" xmlns:w16du="http://schemas.microsoft.com/office/word/2023/wordml/word16du" xmlns:wne="http://schemas.microsoft.com/office/word/2006/wordml" mc:Ignorable="w14 w15 w16se w16cid w16 w16cex w16sdtdh w16sdtfl w16du wp14">
+<w15:people xmlns:wpc="http://schemas.microsoft.com/office/word/2010/wordprocessingCanvas" xmlns:cx="http://schemas.microsoft.com/office/drawing/2014/chartex" xmlns:cx1="http://schemas.microsoft.com/office/drawing/2015/9/8/chartex" xmlns:cx2="http://schemas.microsoft.com/office/drawing/2015/10/21/chartex" xmlns:cx3="http://schemas.microsoft.com/office/drawing/2016/5/9/chartex" xmlns:cx4="http://schemas.microsoft.com/office/drawing/2016/5/10/chartex" xmlns:cx5="http://schemas.microsoft.com/office/drawing/2016/5/11/chartex" xmlns:cx6="http://schemas.microsoft.com/office/drawing/2016/5/12/chartex" xmlns:cx7="http://schemas.microsoft.com/office/drawing/2016/5/13/chartex" xmlns:cx8="http://schemas.microsoft.com/office/drawing/2016/5/14/chartex" xmlns:mc="http://schemas.openxmlformats.org/markup-compatibility/2006" xmlns:m="http://schemas.openxmlformats.org/officeDocument/2006/math" xmlns:aink="http://schemas.microsoft.com/office/drawing/2016/ink" xmlns:am3d="http://schemas.microsoft.com/office/drawing/2017/model3d" xmlns:oel="http://schemas.microsoft.com/office/2019/extlst" xmlns:r="http://schemas.openxmlformats.org/officeDocument/2006/relationships" xmlns:wp14="http://schemas.microsoft.com/office/word/2010/wordprocessingDrawing" xmlns:wp="http://schemas.openxmlformats.org/drawingml/2006/wordprocessingDrawing" xmlns:wpg="http://schemas.microsoft.com/office/word/2010/wordprocessingGroup" xmlns:wpi="http://schemas.microsoft.com/office/word/2010/wordprocessingInk" xmlns:wps="http://schemas.microsoft.com/office/word/2010/wordprocessingShape" xmlns:o="urn:schemas-microsoft-com:office:office" xmlns:v="urn:schemas-microsoft-com:vml" xmlns:w10="urn:schemas-microsoft-com:office:word" xmlns:w="http://schemas.openxmlformats.org/wordprocessingml/2006/main" xmlns:w14="http://schemas.microsoft.com/office/word/2010/wordml" xmlns:w15="http://schemas.microsoft.com/office/word/2012/wordml" xmlns:w16cei="http://schemas.microsoft.com/office/word/2026/wordml/cei" xmlns:w16cex="http://schemas.microsoft.com/office/word/2018/wordml/cex" xmlns:w16cid="http://schemas.microsoft.com/office/word/2016/wordml/cid" xmlns:w16="http://schemas.microsoft.com/office/word/2018/wordml" xmlns:w16sdtdh="http://schemas.microsoft.com/office/word/2020/wordml/sdtdatahash" xmlns:w16sdtfl="http://schemas.microsoft.com/office/word/2024/wordml/sdtformatlock" xmlns:w16se="http://schemas.microsoft.com/office/word/2015/wordml/symex" xmlns:w16du="http://schemas.microsoft.com/office/word/2023/wordml/word16du" xmlns:wne="http://schemas.microsoft.com/office/word/2006/wordml" mc:Ignorable="w14 w15 w16se w16cid w16 w16cex w16sdtdh w16sdtfl w16du wp14">
   <w15:person w15:author="James Dell">
     <w15:presenceInfo w15:providerId="AD" w15:userId="S::James.Dell@planet-it.net::473c7a0d-619f-4459-a135-45d1413fbe4c"/>
   </w15:person>
@@ -14647,6 +14670,50 @@
 </file>
 
 <file path=customXml/item1.xml><?xml version="1.0" encoding="utf-8"?>
+<b:Sources xmlns:b="http://schemas.openxmlformats.org/officeDocument/2006/bibliography" xmlns="http://schemas.openxmlformats.org/officeDocument/2006/bibliography" SelectedStyle="\APASixthEditionOfficeOnline.xsl" StyleName="APA" Version="6"/>
+</file>
+
+<file path=customXml/item2.xml><?xml version="1.0" encoding="utf-8"?>
+<p:properties xmlns:p="http://schemas.microsoft.com/office/2006/metadata/properties" xmlns:xsi="http://www.w3.org/2001/XMLSchema-instance" xmlns:pc="http://schemas.microsoft.com/office/infopath/2007/PartnerControls">
+  <documentManagement>
+    <_ip_UnifiedCompliancePolicyUIAction xmlns="http://schemas.microsoft.com/sharepoint/v3" xsi:nil="true"/>
+    <_ip_UnifiedCompliancePolicyProperties xmlns="http://schemas.microsoft.com/sharepoint/v3" xsi:nil="true"/>
+    <lcf76f155ced4ddcb4097134ff3c332f xmlns="bc555557-3e8b-4e67-83dc-4a843c87bf48">
+      <Terms xmlns="http://schemas.microsoft.com/office/infopath/2007/PartnerControls"/>
+    </lcf76f155ced4ddcb4097134ff3c332f>
+    <TaxCatchAll xmlns="13e5e634-19bb-4da3-8eb1-d732f895062a" xsi:nil="true"/>
+    <SharedWithUsers xmlns="13e5e634-19bb-4da3-8eb1-d732f895062a">
+      <UserInfo>
+        <DisplayName>James Dell</DisplayName>
+        <AccountId>10</AccountId>
+        <AccountType/>
+      </UserInfo>
+      <UserInfo>
+        <DisplayName>Luke Finch</DisplayName>
+        <AccountId>44</AccountId>
+        <AccountType/>
+      </UserInfo>
+      <UserInfo>
+        <DisplayName>Sam Wray</DisplayName>
+        <AccountId>39</AccountId>
+        <AccountType/>
+      </UserInfo>
+      <UserInfo>
+        <DisplayName>Nick Johns</DisplayName>
+        <AccountId>18</AccountId>
+        <AccountType/>
+      </UserInfo>
+      <UserInfo>
+        <DisplayName>Justin Towle</DisplayName>
+        <AccountId>70</AccountId>
+        <AccountType/>
+      </UserInfo>
+    </SharedWithUsers>
+  </documentManagement>
+</p:properties>
+</file>
+
+<file path=customXml/item3.xml><?xml version="1.0" encoding="utf-8"?>
 <ct:contentTypeSchema xmlns:ct="http://schemas.microsoft.com/office/2006/metadata/contentType" xmlns:ma="http://schemas.microsoft.com/office/2006/metadata/properties/metaAttributes" ct:_="" ma:_="" ma:contentTypeName="Document" ma:contentTypeID="0x01010035785702D987474A98E5EB52BEDD3AA6" ma:contentTypeVersion="19" ma:contentTypeDescription="Create a new document." ma:contentTypeScope="" ma:versionID="7475e8a14b23e3b44613142ca3702c71">
   <xsd:schema xmlns:xsd="http://www.w3.org/2001/XMLSchema" xmlns:xs="http://www.w3.org/2001/XMLSchema" xmlns:p="http://schemas.microsoft.com/office/2006/metadata/properties" xmlns:ns1="http://schemas.microsoft.com/sharepoint/v3" xmlns:ns2="bc555557-3e8b-4e67-83dc-4a843c87bf48" xmlns:ns3="13e5e634-19bb-4da3-8eb1-d732f895062a" targetNamespace="http://schemas.microsoft.com/office/2006/metadata/properties" ma:root="true" ma:fieldsID="a0e591cb8f16aef1e2d445ad70521c76" ns1:_="" ns2:_="" ns3:_="">
     <xsd:import namespace="http://schemas.microsoft.com/sharepoint/v3"/>
@@ -14904,7 +14971,7 @@
 </ct:contentTypeSchema>
 </file>
 
-<file path=customXml/item2.xml><?xml version="1.0" encoding="utf-8"?>
+<file path=customXml/item4.xml><?xml version="1.0" encoding="utf-8"?>
 <?mso-contentType ?>
 <FormTemplates xmlns="http://schemas.microsoft.com/sharepoint/v3/contenttype/forms">
   <Display>DocumentLibraryForm</Display>
@@ -14913,51 +14980,27 @@
 </FormTemplates>
 </file>
 
-<file path=customXml/item3.xml><?xml version="1.0" encoding="utf-8"?>
-<p:properties xmlns:p="http://schemas.microsoft.com/office/2006/metadata/properties" xmlns:xsi="http://www.w3.org/2001/XMLSchema-instance" xmlns:pc="http://schemas.microsoft.com/office/infopath/2007/PartnerControls">
-  <documentManagement>
-    <_ip_UnifiedCompliancePolicyUIAction xmlns="http://schemas.microsoft.com/sharepoint/v3" xsi:nil="true"/>
-    <_ip_UnifiedCompliancePolicyProperties xmlns="http://schemas.microsoft.com/sharepoint/v3" xsi:nil="true"/>
-    <lcf76f155ced4ddcb4097134ff3c332f xmlns="bc555557-3e8b-4e67-83dc-4a843c87bf48">
-      <Terms xmlns="http://schemas.microsoft.com/office/infopath/2007/PartnerControls"/>
-    </lcf76f155ced4ddcb4097134ff3c332f>
-    <TaxCatchAll xmlns="13e5e634-19bb-4da3-8eb1-d732f895062a" xsi:nil="true"/>
-    <SharedWithUsers xmlns="13e5e634-19bb-4da3-8eb1-d732f895062a">
-      <UserInfo>
-        <DisplayName>James Dell</DisplayName>
-        <AccountId>10</AccountId>
-        <AccountType/>
-      </UserInfo>
-      <UserInfo>
-        <DisplayName>Luke Finch</DisplayName>
-        <AccountId>44</AccountId>
-        <AccountType/>
-      </UserInfo>
-      <UserInfo>
-        <DisplayName>Sam Wray</DisplayName>
-        <AccountId>39</AccountId>
-        <AccountType/>
-      </UserInfo>
-      <UserInfo>
-        <DisplayName>Nick Johns</DisplayName>
-        <AccountId>18</AccountId>
-        <AccountType/>
-      </UserInfo>
-      <UserInfo>
-        <DisplayName>Justin Towle</DisplayName>
-        <AccountId>70</AccountId>
-        <AccountType/>
-      </UserInfo>
-    </SharedWithUsers>
-  </documentManagement>
-</p:properties>
+<file path=customXml/itemProps1.xml><?xml version="1.0" encoding="utf-8"?>
+<ds:datastoreItem xmlns:ds="http://schemas.openxmlformats.org/officeDocument/2006/customXml" ds:itemID="{41B34B53-803B-4600-951E-8C7B6ABDE6A5}">
+  <ds:schemaRefs>
+    <ds:schemaRef ds:uri="http://schemas.openxmlformats.org/officeDocument/2006/bibliography"/>
+  </ds:schemaRefs>
+</ds:datastoreItem>
 </file>
 
-<file path=customXml/item4.xml><?xml version="1.0" encoding="utf-8"?>
-<b:Sources xmlns:b="http://schemas.openxmlformats.org/officeDocument/2006/bibliography" xmlns="http://schemas.openxmlformats.org/officeDocument/2006/bibliography" SelectedStyle="\APASixthEditionOfficeOnline.xsl" StyleName="APA" Version="6"/>
+<file path=customXml/itemProps2.xml><?xml version="1.0" encoding="utf-8"?>
+<ds:datastoreItem xmlns:ds="http://schemas.openxmlformats.org/officeDocument/2006/customXml" ds:itemID="{EDF12601-A8A7-4B7A-9481-1111248E774A}">
+  <ds:schemaRefs>
+    <ds:schemaRef ds:uri="http://schemas.microsoft.com/office/2006/metadata/properties"/>
+    <ds:schemaRef ds:uri="http://schemas.microsoft.com/office/infopath/2007/PartnerControls"/>
+    <ds:schemaRef ds:uri="http://schemas.microsoft.com/sharepoint/v3"/>
+    <ds:schemaRef ds:uri="bc555557-3e8b-4e67-83dc-4a843c87bf48"/>
+    <ds:schemaRef ds:uri="13e5e634-19bb-4da3-8eb1-d732f895062a"/>
+  </ds:schemaRefs>
+</ds:datastoreItem>
 </file>
 
-<file path=customXml/itemProps1.xml><?xml version="1.0" encoding="utf-8"?>
+<file path=customXml/itemProps3.xml><?xml version="1.0" encoding="utf-8"?>
 <ds:datastoreItem xmlns:ds="http://schemas.openxmlformats.org/officeDocument/2006/customXml" ds:itemID="{7F9D1B01-7FEE-4553-9877-3B31209422E5}">
   <ds:schemaRefs>
     <ds:schemaRef ds:uri="http://schemas.microsoft.com/office/2006/metadata/contentType"/>
@@ -14977,30 +15020,10 @@
 </ds:datastoreItem>
 </file>
 
-<file path=customXml/itemProps2.xml><?xml version="1.0" encoding="utf-8"?>
+<file path=customXml/itemProps4.xml><?xml version="1.0" encoding="utf-8"?>
 <ds:datastoreItem xmlns:ds="http://schemas.openxmlformats.org/officeDocument/2006/customXml" ds:itemID="{02C30E68-946A-4504-B925-FF5230B8A4C3}">
   <ds:schemaRefs>
     <ds:schemaRef ds:uri="http://schemas.microsoft.com/sharepoint/v3/contenttype/forms"/>
   </ds:schemaRefs>
 </ds:datastoreItem>
-</file>
-
-<file path=customXml/itemProps3.xml><?xml version="1.0" encoding="utf-8"?>
-<ds:datastoreItem xmlns:ds="http://schemas.openxmlformats.org/officeDocument/2006/customXml" ds:itemID="{EDF12601-A8A7-4B7A-9481-1111248E774A}">
-  <ds:schemaRefs>
-    <ds:schemaRef ds:uri="http://schemas.microsoft.com/office/2006/metadata/properties"/>
-    <ds:schemaRef ds:uri="http://schemas.microsoft.com/office/infopath/2007/PartnerControls"/>
-    <ds:schemaRef ds:uri="http://schemas.microsoft.com/sharepoint/v3"/>
-    <ds:schemaRef ds:uri="bc555557-3e8b-4e67-83dc-4a843c87bf48"/>
-    <ds:schemaRef ds:uri="13e5e634-19bb-4da3-8eb1-d732f895062a"/>
-  </ds:schemaRefs>
-</ds:datastoreItem>
-</file>
-
-<file path=customXml/itemProps4.xml><?xml version="1.0" encoding="utf-8"?>
-<ds:datastoreItem xmlns:ds="http://schemas.openxmlformats.org/officeDocument/2006/customXml" ds:itemID="{41B34B53-803B-4600-951E-8C7B6ABDE6A5}">
-  <ds:schemaRefs>
-    <ds:schemaRef ds:uri="http://schemas.openxmlformats.org/officeDocument/2006/bibliography"/>
-  </ds:schemaRefs>
-</ds:datastoreItem>
 </file>
</xml_diff>

<commit_message>
V1.16.1 - fixed chart rendering
</commit_message>
<xml_diff>
--- a/planet_it_maturity_assessment_template.docx
+++ b/planet_it_maturity_assessment_template.docx
@@ -1293,6 +1293,45 @@
         <w:t>{{ maturity_score_category }}</w:t>
       </w:r>
     </w:p>
+    <w:p>
+      <w:pPr>
+        <w:tabs>
+          <w:tab w:val="num" w:pos="720"/>
+        </w:tabs>
+      </w:pPr>
+    </w:p>
+    <w:p>
+      <w:pPr>
+        <w:tabs>
+          <w:tab w:val="num" w:pos="720"/>
+        </w:tabs>
+      </w:pPr>
+      <w:r>
+        <w:t xml:space="preserve">{{ </w:t>
+      </w:r>
+      <w:r>
+        <w:t>domain_ratings_bullets</w:t>
+      </w:r>
+      <w:r>
+        <w:t xml:space="preserve"> }}</w:t>
+      </w:r>
+    </w:p>
+    <w:p>
+      <w:pPr>
+        <w:tabs>
+          <w:tab w:val="num" w:pos="720"/>
+        </w:tabs>
+      </w:pPr>
+      <w:r>
+        <w:t>{{</w:t>
+      </w:r>
+      <w:r>
+        <w:t>domain_ratings</w:t>
+      </w:r>
+      <w:r>
+        <w:t xml:space="preserve"> }}</w:t>
+      </w:r>
+    </w:p>
     <w:p/>
     <w:p/>
     <w:p>
@@ -1316,6 +1355,7 @@
         <w:pStyle w:val="Heading2"/>
       </w:pPr>
       <w:r>
+        <w:lastRenderedPageBreak/>
         <w:t>Executive Commentary</w:t>
       </w:r>
     </w:p>
@@ -1819,7 +1859,6 @@
         <w:rPr>
           <w:bdr w:val="none" w:sz="0" w:space="0" w:color="auto" w:frame="1"/>
         </w:rPr>
-        <w:lastRenderedPageBreak/>
         <w:br w:type="page"/>
       </w:r>
     </w:p>
@@ -13756,7 +13795,6 @@
   <w:style w:type="character" w:default="1" w:styleId="DefaultParagraphFont">
     <w:name w:val="Default Paragraph Font"/>
     <w:uiPriority w:val="1"/>
-    <w:semiHidden/>
     <w:unhideWhenUsed/>
   </w:style>
   <w:style w:type="table" w:default="1" w:styleId="TableNormal">
@@ -14670,10 +14708,6 @@
 </file>
 
 <file path=customXml/item1.xml><?xml version="1.0" encoding="utf-8"?>
-<b:Sources xmlns:b="http://schemas.openxmlformats.org/officeDocument/2006/bibliography" xmlns="http://schemas.openxmlformats.org/officeDocument/2006/bibliography" SelectedStyle="\APASixthEditionOfficeOnline.xsl" StyleName="APA" Version="6"/>
-</file>
-
-<file path=customXml/item2.xml><?xml version="1.0" encoding="utf-8"?>
 <p:properties xmlns:p="http://schemas.microsoft.com/office/2006/metadata/properties" xmlns:xsi="http://www.w3.org/2001/XMLSchema-instance" xmlns:pc="http://schemas.microsoft.com/office/infopath/2007/PartnerControls">
   <documentManagement>
     <_ip_UnifiedCompliancePolicyUIAction xmlns="http://schemas.microsoft.com/sharepoint/v3" xsi:nil="true"/>
@@ -14711,6 +14745,15 @@
     </SharedWithUsers>
   </documentManagement>
 </p:properties>
+</file>
+
+<file path=customXml/item2.xml><?xml version="1.0" encoding="utf-8"?>
+<?mso-contentType ?>
+<FormTemplates xmlns="http://schemas.microsoft.com/sharepoint/v3/contenttype/forms">
+  <Display>DocumentLibraryForm</Display>
+  <Edit>DocumentLibraryForm</Edit>
+  <New>DocumentLibraryForm</New>
+</FormTemplates>
 </file>
 
 <file path=customXml/item3.xml><?xml version="1.0" encoding="utf-8"?>
@@ -14972,23 +15015,10 @@
 </file>
 
 <file path=customXml/item4.xml><?xml version="1.0" encoding="utf-8"?>
-<?mso-contentType ?>
-<FormTemplates xmlns="http://schemas.microsoft.com/sharepoint/v3/contenttype/forms">
-  <Display>DocumentLibraryForm</Display>
-  <Edit>DocumentLibraryForm</Edit>
-  <New>DocumentLibraryForm</New>
-</FormTemplates>
+<b:Sources xmlns:b="http://schemas.openxmlformats.org/officeDocument/2006/bibliography" xmlns="http://schemas.openxmlformats.org/officeDocument/2006/bibliography" SelectedStyle="\APASixthEditionOfficeOnline.xsl" StyleName="APA" Version="6"/>
 </file>
 
 <file path=customXml/itemProps1.xml><?xml version="1.0" encoding="utf-8"?>
-<ds:datastoreItem xmlns:ds="http://schemas.openxmlformats.org/officeDocument/2006/customXml" ds:itemID="{41B34B53-803B-4600-951E-8C7B6ABDE6A5}">
-  <ds:schemaRefs>
-    <ds:schemaRef ds:uri="http://schemas.openxmlformats.org/officeDocument/2006/bibliography"/>
-  </ds:schemaRefs>
-</ds:datastoreItem>
-</file>
-
-<file path=customXml/itemProps2.xml><?xml version="1.0" encoding="utf-8"?>
 <ds:datastoreItem xmlns:ds="http://schemas.openxmlformats.org/officeDocument/2006/customXml" ds:itemID="{EDF12601-A8A7-4B7A-9481-1111248E774A}">
   <ds:schemaRefs>
     <ds:schemaRef ds:uri="http://schemas.microsoft.com/office/2006/metadata/properties"/>
@@ -14996,6 +15026,14 @@
     <ds:schemaRef ds:uri="http://schemas.microsoft.com/sharepoint/v3"/>
     <ds:schemaRef ds:uri="bc555557-3e8b-4e67-83dc-4a843c87bf48"/>
     <ds:schemaRef ds:uri="13e5e634-19bb-4da3-8eb1-d732f895062a"/>
+  </ds:schemaRefs>
+</ds:datastoreItem>
+</file>
+
+<file path=customXml/itemProps2.xml><?xml version="1.0" encoding="utf-8"?>
+<ds:datastoreItem xmlns:ds="http://schemas.openxmlformats.org/officeDocument/2006/customXml" ds:itemID="{02C30E68-946A-4504-B925-FF5230B8A4C3}">
+  <ds:schemaRefs>
+    <ds:schemaRef ds:uri="http://schemas.microsoft.com/sharepoint/v3/contenttype/forms"/>
   </ds:schemaRefs>
 </ds:datastoreItem>
 </file>
@@ -15021,9 +15059,9 @@
 </file>
 
 <file path=customXml/itemProps4.xml><?xml version="1.0" encoding="utf-8"?>
-<ds:datastoreItem xmlns:ds="http://schemas.openxmlformats.org/officeDocument/2006/customXml" ds:itemID="{02C30E68-946A-4504-B925-FF5230B8A4C3}">
+<ds:datastoreItem xmlns:ds="http://schemas.openxmlformats.org/officeDocument/2006/customXml" ds:itemID="{41B34B53-803B-4600-951E-8C7B6ABDE6A5}">
   <ds:schemaRefs>
-    <ds:schemaRef ds:uri="http://schemas.microsoft.com/sharepoint/v3/contenttype/forms"/>
+    <ds:schemaRef ds:uri="http://schemas.openxmlformats.org/officeDocument/2006/bibliography"/>
   </ds:schemaRefs>
 </ds:datastoreItem>
 </file>
</xml_diff>

<commit_message>
V1.20.0 - Implement first version of Monte Carlo risk simulation and integrate into maturity document generation and tuned humanisation
</commit_message>
<xml_diff>
--- a/planet_it_maturity_assessment_template.docx
+++ b/planet_it_maturity_assessment_template.docx
@@ -1768,12 +1768,42 @@
         <w:t>{{ threat_intelligence_context }}</w:t>
       </w:r>
     </w:p>
+    <w:p/>
     <w:p>
       <w:pPr>
+        <w:pStyle w:val="Heading2"/>
+      </w:pPr>
+      <w:r>
+        <w:t>Monte-Carlo Assessment</w:t>
+      </w:r>
+    </w:p>
+    <w:p>
+      <w:pPr>
         <w:rPr>
           <w:rStyle w:val="Heading2Char"/>
         </w:rPr>
       </w:pPr>
+    </w:p>
+    <w:p>
+      <w:pPr>
+        <w:pStyle w:val="BodyText"/>
+        <w:rPr>
+          <w:rStyle w:val="Heading2Char"/>
+          <w:rFonts w:ascii="Arial" w:hAnsi="Arial" w:cs="Arial"/>
+          <w:color w:val="auto"/>
+          <w:szCs w:val="20"/>
+        </w:rPr>
+      </w:pPr>
+      <w:r>
+        <w:rPr>
+          <w:rStyle w:val="Heading2Char"/>
+          <w:rFonts w:ascii="Arial" w:hAnsi="Arial" w:cs="Arial"/>
+          <w:color w:val="auto"/>
+          <w:szCs w:val="20"/>
+        </w:rPr>
+        <w:lastRenderedPageBreak/>
+        <w:t>{{ monte_carlo_section }}</w:t>
+      </w:r>
     </w:p>
     <w:p/>
     <w:p/>
@@ -14647,19 +14677,46 @@
 </file>
 
 <file path=customXml/item1.xml><?xml version="1.0" encoding="utf-8"?>
-<?mso-contentType ?>
-<FormTemplates xmlns="http://schemas.microsoft.com/sharepoint/v3/contenttype/forms">
-  <Display>DocumentLibraryForm</Display>
-  <Edit>DocumentLibraryForm</Edit>
-  <New>DocumentLibraryForm</New>
-</FormTemplates>
+<p:properties xmlns:p="http://schemas.microsoft.com/office/2006/metadata/properties" xmlns:xsi="http://www.w3.org/2001/XMLSchema-instance" xmlns:pc="http://schemas.microsoft.com/office/infopath/2007/PartnerControls">
+  <documentManagement>
+    <_ip_UnifiedCompliancePolicyUIAction xmlns="http://schemas.microsoft.com/sharepoint/v3" xsi:nil="true"/>
+    <_ip_UnifiedCompliancePolicyProperties xmlns="http://schemas.microsoft.com/sharepoint/v3" xsi:nil="true"/>
+    <lcf76f155ced4ddcb4097134ff3c332f xmlns="bc555557-3e8b-4e67-83dc-4a843c87bf48">
+      <Terms xmlns="http://schemas.microsoft.com/office/infopath/2007/PartnerControls"/>
+    </lcf76f155ced4ddcb4097134ff3c332f>
+    <TaxCatchAll xmlns="13e5e634-19bb-4da3-8eb1-d732f895062a" xsi:nil="true"/>
+    <SharedWithUsers xmlns="13e5e634-19bb-4da3-8eb1-d732f895062a">
+      <UserInfo>
+        <DisplayName>James Dell</DisplayName>
+        <AccountId>10</AccountId>
+        <AccountType/>
+      </UserInfo>
+      <UserInfo>
+        <DisplayName>Luke Finch</DisplayName>
+        <AccountId>44</AccountId>
+        <AccountType/>
+      </UserInfo>
+      <UserInfo>
+        <DisplayName>Sam Wray</DisplayName>
+        <AccountId>39</AccountId>
+        <AccountType/>
+      </UserInfo>
+      <UserInfo>
+        <DisplayName>Nick Johns</DisplayName>
+        <AccountId>18</AccountId>
+        <AccountType/>
+      </UserInfo>
+      <UserInfo>
+        <DisplayName>Justin Towle</DisplayName>
+        <AccountId>70</AccountId>
+        <AccountType/>
+      </UserInfo>
+    </SharedWithUsers>
+  </documentManagement>
+</p:properties>
 </file>
 
 <file path=customXml/item2.xml><?xml version="1.0" encoding="utf-8"?>
-<b:Sources xmlns:b="http://schemas.openxmlformats.org/officeDocument/2006/bibliography" xmlns="http://schemas.openxmlformats.org/officeDocument/2006/bibliography" SelectedStyle="\APASixthEditionOfficeOnline.xsl" StyleName="APA" Version="6"/>
-</file>
-
-<file path=customXml/item3.xml><?xml version="1.0" encoding="utf-8"?>
 <ct:contentTypeSchema xmlns:ct="http://schemas.microsoft.com/office/2006/metadata/contentType" xmlns:ma="http://schemas.microsoft.com/office/2006/metadata/properties/metaAttributes" ct:_="" ma:_="" ma:contentTypeName="Document" ma:contentTypeID="0x01010035785702D987474A98E5EB52BEDD3AA6" ma:contentTypeVersion="19" ma:contentTypeDescription="Create a new document." ma:contentTypeScope="" ma:versionID="7475e8a14b23e3b44613142ca3702c71">
   <xsd:schema xmlns:xsd="http://www.w3.org/2001/XMLSchema" xmlns:xs="http://www.w3.org/2001/XMLSchema" xmlns:p="http://schemas.microsoft.com/office/2006/metadata/properties" xmlns:ns1="http://schemas.microsoft.com/sharepoint/v3" xmlns:ns2="bc555557-3e8b-4e67-83dc-4a843c87bf48" xmlns:ns3="13e5e634-19bb-4da3-8eb1-d732f895062a" targetNamespace="http://schemas.microsoft.com/office/2006/metadata/properties" ma:root="true" ma:fieldsID="a0e591cb8f16aef1e2d445ad70521c76" ns1:_="" ns2:_="" ns3:_="">
     <xsd:import namespace="http://schemas.microsoft.com/sharepoint/v3"/>
@@ -14917,63 +14974,32 @@
 </ct:contentTypeSchema>
 </file>
 
+<file path=customXml/item3.xml><?xml version="1.0" encoding="utf-8"?>
+<?mso-contentType ?>
+<FormTemplates xmlns="http://schemas.microsoft.com/sharepoint/v3/contenttype/forms">
+  <Display>DocumentLibraryForm</Display>
+  <Edit>DocumentLibraryForm</Edit>
+  <New>DocumentLibraryForm</New>
+</FormTemplates>
+</file>
+
 <file path=customXml/item4.xml><?xml version="1.0" encoding="utf-8"?>
-<p:properties xmlns:p="http://schemas.microsoft.com/office/2006/metadata/properties" xmlns:xsi="http://www.w3.org/2001/XMLSchema-instance" xmlns:pc="http://schemas.microsoft.com/office/infopath/2007/PartnerControls">
-  <documentManagement>
-    <_ip_UnifiedCompliancePolicyUIAction xmlns="http://schemas.microsoft.com/sharepoint/v3" xsi:nil="true"/>
-    <_ip_UnifiedCompliancePolicyProperties xmlns="http://schemas.microsoft.com/sharepoint/v3" xsi:nil="true"/>
-    <lcf76f155ced4ddcb4097134ff3c332f xmlns="bc555557-3e8b-4e67-83dc-4a843c87bf48">
-      <Terms xmlns="http://schemas.microsoft.com/office/infopath/2007/PartnerControls"/>
-    </lcf76f155ced4ddcb4097134ff3c332f>
-    <TaxCatchAll xmlns="13e5e634-19bb-4da3-8eb1-d732f895062a" xsi:nil="true"/>
-    <SharedWithUsers xmlns="13e5e634-19bb-4da3-8eb1-d732f895062a">
-      <UserInfo>
-        <DisplayName>James Dell</DisplayName>
-        <AccountId>10</AccountId>
-        <AccountType/>
-      </UserInfo>
-      <UserInfo>
-        <DisplayName>Luke Finch</DisplayName>
-        <AccountId>44</AccountId>
-        <AccountType/>
-      </UserInfo>
-      <UserInfo>
-        <DisplayName>Sam Wray</DisplayName>
-        <AccountId>39</AccountId>
-        <AccountType/>
-      </UserInfo>
-      <UserInfo>
-        <DisplayName>Nick Johns</DisplayName>
-        <AccountId>18</AccountId>
-        <AccountType/>
-      </UserInfo>
-      <UserInfo>
-        <DisplayName>Justin Towle</DisplayName>
-        <AccountId>70</AccountId>
-        <AccountType/>
-      </UserInfo>
-    </SharedWithUsers>
-  </documentManagement>
-</p:properties>
+<b:Sources xmlns:b="http://schemas.openxmlformats.org/officeDocument/2006/bibliography" xmlns="http://schemas.openxmlformats.org/officeDocument/2006/bibliography" SelectedStyle="\APASixthEditionOfficeOnline.xsl" StyleName="APA" Version="6"/>
 </file>
 
 <file path=customXml/itemProps1.xml><?xml version="1.0" encoding="utf-8"?>
-<ds:datastoreItem xmlns:ds="http://schemas.openxmlformats.org/officeDocument/2006/customXml" ds:itemID="{02C30E68-946A-4504-B925-FF5230B8A4C3}">
+<ds:datastoreItem xmlns:ds="http://schemas.openxmlformats.org/officeDocument/2006/customXml" ds:itemID="{EDF12601-A8A7-4B7A-9481-1111248E774A}">
   <ds:schemaRefs>
-    <ds:schemaRef ds:uri="http://schemas.microsoft.com/sharepoint/v3/contenttype/forms"/>
+    <ds:schemaRef ds:uri="http://schemas.microsoft.com/office/2006/metadata/properties"/>
+    <ds:schemaRef ds:uri="http://schemas.microsoft.com/office/infopath/2007/PartnerControls"/>
+    <ds:schemaRef ds:uri="http://schemas.microsoft.com/sharepoint/v3"/>
+    <ds:schemaRef ds:uri="bc555557-3e8b-4e67-83dc-4a843c87bf48"/>
+    <ds:schemaRef ds:uri="13e5e634-19bb-4da3-8eb1-d732f895062a"/>
   </ds:schemaRefs>
 </ds:datastoreItem>
 </file>
 
 <file path=customXml/itemProps2.xml><?xml version="1.0" encoding="utf-8"?>
-<ds:datastoreItem xmlns:ds="http://schemas.openxmlformats.org/officeDocument/2006/customXml" ds:itemID="{41B34B53-803B-4600-951E-8C7B6ABDE6A5}">
-  <ds:schemaRefs>
-    <ds:schemaRef ds:uri="http://schemas.openxmlformats.org/officeDocument/2006/bibliography"/>
-  </ds:schemaRefs>
-</ds:datastoreItem>
-</file>
-
-<file path=customXml/itemProps3.xml><?xml version="1.0" encoding="utf-8"?>
 <ds:datastoreItem xmlns:ds="http://schemas.openxmlformats.org/officeDocument/2006/customXml" ds:itemID="{7F9D1B01-7FEE-4553-9877-3B31209422E5}">
   <ds:schemaRefs>
     <ds:schemaRef ds:uri="http://schemas.microsoft.com/office/2006/metadata/contentType"/>
@@ -14993,14 +15019,18 @@
 </ds:datastoreItem>
 </file>
 
+<file path=customXml/itemProps3.xml><?xml version="1.0" encoding="utf-8"?>
+<ds:datastoreItem xmlns:ds="http://schemas.openxmlformats.org/officeDocument/2006/customXml" ds:itemID="{02C30E68-946A-4504-B925-FF5230B8A4C3}">
+  <ds:schemaRefs>
+    <ds:schemaRef ds:uri="http://schemas.microsoft.com/sharepoint/v3/contenttype/forms"/>
+  </ds:schemaRefs>
+</ds:datastoreItem>
+</file>
+
 <file path=customXml/itemProps4.xml><?xml version="1.0" encoding="utf-8"?>
-<ds:datastoreItem xmlns:ds="http://schemas.openxmlformats.org/officeDocument/2006/customXml" ds:itemID="{EDF12601-A8A7-4B7A-9481-1111248E774A}">
+<ds:datastoreItem xmlns:ds="http://schemas.openxmlformats.org/officeDocument/2006/customXml" ds:itemID="{41B34B53-803B-4600-951E-8C7B6ABDE6A5}">
   <ds:schemaRefs>
-    <ds:schemaRef ds:uri="http://schemas.microsoft.com/office/2006/metadata/properties"/>
-    <ds:schemaRef ds:uri="http://schemas.microsoft.com/office/infopath/2007/PartnerControls"/>
-    <ds:schemaRef ds:uri="http://schemas.microsoft.com/sharepoint/v3"/>
-    <ds:schemaRef ds:uri="bc555557-3e8b-4e67-83dc-4a843c87bf48"/>
-    <ds:schemaRef ds:uri="13e5e634-19bb-4da3-8eb1-d732f895062a"/>
+    <ds:schemaRef ds:uri="http://schemas.openxmlformats.org/officeDocument/2006/bibliography"/>
   </ds:schemaRefs>
 </ds:datastoreItem>
 </file>
</xml_diff>

<commit_message>
V1.21.2 - optimised workflow, fixed broken .json import
</commit_message>
<xml_diff>
--- a/planet_it_maturity_assessment_template.docx
+++ b/planet_it_maturity_assessment_template.docx
@@ -1168,6 +1168,31 @@
           <w:b/>
           <w:bCs/>
         </w:rPr>
+        <w:t>AI Governance &amp; Control:</w:t>
+      </w:r>
+      <w:r>
+        <w:t xml:space="preserve"> </w:t>
+      </w:r>
+      <w:r>
+        <w:t>The strategies and controls in place</w:t>
+      </w:r>
+      <w:r>
+        <w:t xml:space="preserve"> to identify, govern and control access to approved AI systems as well as identification and control of shadow AI usage.</w:t>
+      </w:r>
+    </w:p>
+    <w:p>
+      <w:pPr>
+        <w:pStyle w:val="ListParagraph"/>
+        <w:numPr>
+          <w:ilvl w:val="0"/>
+          <w:numId w:val="3"/>
+        </w:numPr>
+      </w:pPr>
+      <w:r>
+        <w:rPr>
+          <w:b/>
+          <w:bCs/>
+        </w:rPr>
         <w:t>Governance, Risk &amp; Compliance (GRC):</w:t>
       </w:r>
       <w:r>
@@ -1293,7 +1318,6 @@
         <w:pStyle w:val="Heading2"/>
       </w:pPr>
       <w:r>
-        <w:lastRenderedPageBreak/>
         <w:t>Executive Commentary</w:t>
       </w:r>
     </w:p>
@@ -1774,6 +1798,7 @@
         <w:pStyle w:val="Heading2"/>
       </w:pPr>
       <w:r>
+        <w:lastRenderedPageBreak/>
         <w:t>Monte-Carlo Assessment</w:t>
       </w:r>
     </w:p>
@@ -1801,7 +1826,6 @@
           <w:color w:val="auto"/>
           <w:szCs w:val="20"/>
         </w:rPr>
-        <w:lastRenderedPageBreak/>
         <w:t>{{ monte_carlo_section }}</w:t>
       </w:r>
     </w:p>
@@ -12507,9 +12531,9 @@
 
 <file path=word/commentsExtended.xml><?xml version="1.0" encoding="utf-8"?>
 <w15:commentsEx xmlns:wpc="http://schemas.microsoft.com/office/word/2010/wordprocessingCanvas" xmlns:cx="http://schemas.microsoft.com/office/drawing/2014/chartex" xmlns:cx1="http://schemas.microsoft.com/office/drawing/2015/9/8/chartex" xmlns:cx2="http://schemas.microsoft.com/office/drawing/2015/10/21/chartex" xmlns:cx3="http://schemas.microsoft.com/office/drawing/2016/5/9/chartex" xmlns:cx4="http://schemas.microsoft.com/office/drawing/2016/5/10/chartex" xmlns:cx5="http://schemas.microsoft.com/office/drawing/2016/5/11/chartex" xmlns:cx6="http://schemas.microsoft.com/office/drawing/2016/5/12/chartex" xmlns:cx7="http://schemas.microsoft.com/office/drawing/2016/5/13/chartex" xmlns:cx8="http://schemas.microsoft.com/office/drawing/2016/5/14/chartex" xmlns:mc="http://schemas.openxmlformats.org/markup-compatibility/2006" xmlns:m="http://schemas.openxmlformats.org/officeDocument/2006/math" xmlns:aink="http://schemas.microsoft.com/office/drawing/2016/ink" xmlns:am3d="http://schemas.microsoft.com/office/drawing/2017/model3d" xmlns:oel="http://schemas.microsoft.com/office/2019/extlst" xmlns:r="http://schemas.openxmlformats.org/officeDocument/2006/relationships" xmlns:wp14="http://schemas.microsoft.com/office/word/2010/wordprocessingDrawing" xmlns:wp="http://schemas.openxmlformats.org/drawingml/2006/wordprocessingDrawing" xmlns:wpg="http://schemas.microsoft.com/office/word/2010/wordprocessingGroup" xmlns:wpi="http://schemas.microsoft.com/office/word/2010/wordprocessingInk" xmlns:wps="http://schemas.microsoft.com/office/word/2010/wordprocessingShape" xmlns:o="urn:schemas-microsoft-com:office:office" xmlns:v="urn:schemas-microsoft-com:vml" xmlns:w10="urn:schemas-microsoft-com:office:word" xmlns:w="http://schemas.openxmlformats.org/wordprocessingml/2006/main" xmlns:w14="http://schemas.microsoft.com/office/word/2010/wordml" xmlns:w15="http://schemas.microsoft.com/office/word/2012/wordml" xmlns:w16cei="http://schemas.microsoft.com/office/word/2026/wordml/cei" xmlns:w16cex="http://schemas.microsoft.com/office/word/2018/wordml/cex" xmlns:w16cid="http://schemas.microsoft.com/office/word/2016/wordml/cid" xmlns:w16="http://schemas.microsoft.com/office/word/2018/wordml" xmlns:w16sdtdh="http://schemas.microsoft.com/office/word/2020/wordml/sdtdatahash" xmlns:w16sdtfl="http://schemas.microsoft.com/office/word/2024/wordml/sdtformatlock" xmlns:w16se="http://schemas.microsoft.com/office/word/2015/wordml/symex" xmlns:w16du="http://schemas.microsoft.com/office/word/2023/wordml/word16du" xmlns:wne="http://schemas.microsoft.com/office/word/2006/wordml" mc:Ignorable="w14 w15 w16se w16cid w16 w16cex w16sdtdh w16sdtfl w16du wp14">
-  <w15:commentEx w15:paraId="51F97860" w15:done="0"/>
-  <w15:commentEx w15:paraId="55A6ECFB" w15:done="0"/>
-  <w15:commentEx w15:paraId="4FBA6D35" w15:paraIdParent="55A6ECFB" w15:done="0"/>
+  <w15:commentEx w15:paraId="51F97860" w15:done="1"/>
+  <w15:commentEx w15:paraId="55A6ECFB" w15:done="1"/>
+  <w15:commentEx w15:paraId="4FBA6D35" w15:paraIdParent="55A6ECFB" w15:done="1"/>
 </w15:commentsEx>
 </file>
 
@@ -14312,6 +14336,10 @@
         </t:Anchor>
         <t:SetTitle title="Do we want to change any of these @Barry O'Brien"/>
       </t:Event>
+      <t:Event id="{45A1512F-870E-224D-A19B-DB45289B3929}" time="2026-08-12T12:43:34.132Z">
+        <t:Attribution userId="S::Bradley.Collis@planet-it.net::c995d575-4a36-4d7a-ab80-9fae64ab9450" userProvider="AD" userName="Bradley Collis"/>
+        <t:Progress percentComplete="100"/>
+      </t:Event>
     </t:History>
   </t:Task>
   <t:Task id="{F947833D-949F-6741-A83F-32927F3C7D3A}">
@@ -14339,6 +14367,10 @@
           <t:Comment id="217686103"/>
         </t:Anchor>
         <t:SetTitle title="@Barry O'Brien do we have one of these with updated vendor logos? "/>
+      </t:Event>
+      <t:Event id="{FAD040C6-BDF4-2344-9222-93F394659EE5}" time="2026-08-12T12:43:37.622Z">
+        <t:Attribution userId="S::Bradley.Collis@planet-it.net::c995d575-4a36-4d7a-ab80-9fae64ab9450" userProvider="AD" userName="Bradley Collis"/>
+        <t:Progress percentComplete="100"/>
       </t:Event>
     </t:History>
   </t:Task>
@@ -14677,6 +14709,10 @@
 </file>
 
 <file path=customXml/item1.xml><?xml version="1.0" encoding="utf-8"?>
+<b:Sources xmlns:b="http://schemas.openxmlformats.org/officeDocument/2006/bibliography" xmlns="http://schemas.openxmlformats.org/officeDocument/2006/bibliography" SelectedStyle="\APASixthEditionOfficeOnline.xsl" StyleName="APA" Version="6"/>
+</file>
+
+<file path=customXml/item2.xml><?xml version="1.0" encoding="utf-8"?>
 <p:properties xmlns:p="http://schemas.microsoft.com/office/2006/metadata/properties" xmlns:xsi="http://www.w3.org/2001/XMLSchema-instance" xmlns:pc="http://schemas.microsoft.com/office/infopath/2007/PartnerControls">
   <documentManagement>
     <_ip_UnifiedCompliancePolicyUIAction xmlns="http://schemas.microsoft.com/sharepoint/v3" xsi:nil="true"/>
@@ -14716,7 +14752,16 @@
 </p:properties>
 </file>
 
-<file path=customXml/item2.xml><?xml version="1.0" encoding="utf-8"?>
+<file path=customXml/item3.xml><?xml version="1.0" encoding="utf-8"?>
+<?mso-contentType ?>
+<FormTemplates xmlns="http://schemas.microsoft.com/sharepoint/v3/contenttype/forms">
+  <Display>DocumentLibraryForm</Display>
+  <Edit>DocumentLibraryForm</Edit>
+  <New>DocumentLibraryForm</New>
+</FormTemplates>
+</file>
+
+<file path=customXml/item4.xml><?xml version="1.0" encoding="utf-8"?>
 <ct:contentTypeSchema xmlns:ct="http://schemas.microsoft.com/office/2006/metadata/contentType" xmlns:ma="http://schemas.microsoft.com/office/2006/metadata/properties/metaAttributes" ct:_="" ma:_="" ma:contentTypeName="Document" ma:contentTypeID="0x01010035785702D987474A98E5EB52BEDD3AA6" ma:contentTypeVersion="19" ma:contentTypeDescription="Create a new document." ma:contentTypeScope="" ma:versionID="7475e8a14b23e3b44613142ca3702c71">
   <xsd:schema xmlns:xsd="http://www.w3.org/2001/XMLSchema" xmlns:xs="http://www.w3.org/2001/XMLSchema" xmlns:p="http://schemas.microsoft.com/office/2006/metadata/properties" xmlns:ns1="http://schemas.microsoft.com/sharepoint/v3" xmlns:ns2="bc555557-3e8b-4e67-83dc-4a843c87bf48" xmlns:ns3="13e5e634-19bb-4da3-8eb1-d732f895062a" targetNamespace="http://schemas.microsoft.com/office/2006/metadata/properties" ma:root="true" ma:fieldsID="a0e591cb8f16aef1e2d445ad70521c76" ns1:_="" ns2:_="" ns3:_="">
     <xsd:import namespace="http://schemas.microsoft.com/sharepoint/v3"/>
@@ -14974,20 +15019,15 @@
 </ct:contentTypeSchema>
 </file>
 
-<file path=customXml/item3.xml><?xml version="1.0" encoding="utf-8"?>
-<?mso-contentType ?>
-<FormTemplates xmlns="http://schemas.microsoft.com/sharepoint/v3/contenttype/forms">
-  <Display>DocumentLibraryForm</Display>
-  <Edit>DocumentLibraryForm</Edit>
-  <New>DocumentLibraryForm</New>
-</FormTemplates>
+<file path=customXml/itemProps1.xml><?xml version="1.0" encoding="utf-8"?>
+<ds:datastoreItem xmlns:ds="http://schemas.openxmlformats.org/officeDocument/2006/customXml" ds:itemID="{41B34B53-803B-4600-951E-8C7B6ABDE6A5}">
+  <ds:schemaRefs>
+    <ds:schemaRef ds:uri="http://schemas.openxmlformats.org/officeDocument/2006/bibliography"/>
+  </ds:schemaRefs>
+</ds:datastoreItem>
 </file>
 
-<file path=customXml/item4.xml><?xml version="1.0" encoding="utf-8"?>
-<b:Sources xmlns:b="http://schemas.openxmlformats.org/officeDocument/2006/bibliography" xmlns="http://schemas.openxmlformats.org/officeDocument/2006/bibliography" SelectedStyle="\APASixthEditionOfficeOnline.xsl" StyleName="APA" Version="6"/>
-</file>
-
-<file path=customXml/itemProps1.xml><?xml version="1.0" encoding="utf-8"?>
+<file path=customXml/itemProps2.xml><?xml version="1.0" encoding="utf-8"?>
 <ds:datastoreItem xmlns:ds="http://schemas.openxmlformats.org/officeDocument/2006/customXml" ds:itemID="{EDF12601-A8A7-4B7A-9481-1111248E774A}">
   <ds:schemaRefs>
     <ds:schemaRef ds:uri="http://schemas.microsoft.com/office/2006/metadata/properties"/>
@@ -14999,7 +15039,15 @@
 </ds:datastoreItem>
 </file>
 
-<file path=customXml/itemProps2.xml><?xml version="1.0" encoding="utf-8"?>
+<file path=customXml/itemProps3.xml><?xml version="1.0" encoding="utf-8"?>
+<ds:datastoreItem xmlns:ds="http://schemas.openxmlformats.org/officeDocument/2006/customXml" ds:itemID="{02C30E68-946A-4504-B925-FF5230B8A4C3}">
+  <ds:schemaRefs>
+    <ds:schemaRef ds:uri="http://schemas.microsoft.com/sharepoint/v3/contenttype/forms"/>
+  </ds:schemaRefs>
+</ds:datastoreItem>
+</file>
+
+<file path=customXml/itemProps4.xml><?xml version="1.0" encoding="utf-8"?>
 <ds:datastoreItem xmlns:ds="http://schemas.openxmlformats.org/officeDocument/2006/customXml" ds:itemID="{7F9D1B01-7FEE-4553-9877-3B31209422E5}">
   <ds:schemaRefs>
     <ds:schemaRef ds:uri="http://schemas.microsoft.com/office/2006/metadata/contentType"/>
@@ -15017,20 +15065,4 @@
     <ds:schemaRef ds:uri="http://schemas.microsoft.com/internal/obd"/>
   </ds:schemaRefs>
 </ds:datastoreItem>
-</file>
-
-<file path=customXml/itemProps3.xml><?xml version="1.0" encoding="utf-8"?>
-<ds:datastoreItem xmlns:ds="http://schemas.openxmlformats.org/officeDocument/2006/customXml" ds:itemID="{02C30E68-946A-4504-B925-FF5230B8A4C3}">
-  <ds:schemaRefs>
-    <ds:schemaRef ds:uri="http://schemas.microsoft.com/sharepoint/v3/contenttype/forms"/>
-  </ds:schemaRefs>
-</ds:datastoreItem>
-</file>
-
-<file path=customXml/itemProps4.xml><?xml version="1.0" encoding="utf-8"?>
-<ds:datastoreItem xmlns:ds="http://schemas.openxmlformats.org/officeDocument/2006/customXml" ds:itemID="{41B34B53-803B-4600-951E-8C7B6ABDE6A5}">
-  <ds:schemaRefs>
-    <ds:schemaRef ds:uri="http://schemas.openxmlformats.org/officeDocument/2006/bibliography"/>
-  </ds:schemaRefs>
-</ds:datastoreItem>
 </file>
</xml_diff>

<commit_message>
V2.0.0 - significant upgrade and overhaul of security domains and context - reworking of report framework and all logic - multiple additional domains added and upgrade to report structure
</commit_message>
<xml_diff>
--- a/planet_it_maturity_assessment_template.docx
+++ b/planet_it_maturity_assessment_template.docx
@@ -611,6 +611,7 @@
                                 <w:szCs w:val="80"/>
                               </w:rPr>
                             </w:pPr>
+                            <w:proofErr w:type="gramStart"/>
                             <w:r>
                               <w:rPr>
                                 <w:rFonts w:cs="Consolas"/>
@@ -618,7 +619,57 @@
                                 <w:sz w:val="80"/>
                                 <w:szCs w:val="80"/>
                               </w:rPr>
-                              <w:t>{{ customer_name }}</w:t>
+                              <w:t xml:space="preserve">{{ </w:t>
+                            </w:r>
+                            <w:proofErr w:type="spellStart"/>
+                            <w:r>
+                              <w:rPr>
+                                <w:rFonts w:cs="Consolas"/>
+                                <w:color w:val="FFFFFF" w:themeColor="background1"/>
+                                <w:sz w:val="80"/>
+                                <w:szCs w:val="80"/>
+                              </w:rPr>
+                              <w:t>customer</w:t>
+                            </w:r>
+                            <w:proofErr w:type="gramEnd"/>
+                            <w:r>
+                              <w:rPr>
+                                <w:rFonts w:cs="Consolas"/>
+                                <w:color w:val="FFFFFF" w:themeColor="background1"/>
+                                <w:sz w:val="80"/>
+                                <w:szCs w:val="80"/>
+                              </w:rPr>
+                              <w:t>_</w:t>
+                            </w:r>
+                            <w:proofErr w:type="gramStart"/>
+                            <w:r>
+                              <w:rPr>
+                                <w:rFonts w:cs="Consolas"/>
+                                <w:color w:val="FFFFFF" w:themeColor="background1"/>
+                                <w:sz w:val="80"/>
+                                <w:szCs w:val="80"/>
+                              </w:rPr>
+                              <w:t>name</w:t>
+                            </w:r>
+                            <w:proofErr w:type="spellEnd"/>
+                            <w:r>
+                              <w:rPr>
+                                <w:rFonts w:cs="Consolas"/>
+                                <w:color w:val="FFFFFF" w:themeColor="background1"/>
+                                <w:sz w:val="80"/>
+                                <w:szCs w:val="80"/>
+                              </w:rPr>
+                              <w:t xml:space="preserve"> }</w:t>
+                            </w:r>
+                            <w:proofErr w:type="gramEnd"/>
+                            <w:r>
+                              <w:rPr>
+                                <w:rFonts w:cs="Consolas"/>
+                                <w:color w:val="FFFFFF" w:themeColor="background1"/>
+                                <w:sz w:val="80"/>
+                                <w:szCs w:val="80"/>
+                              </w:rPr>
+                              <w:t>}</w:t>
                             </w:r>
                           </w:p>
                           <w:p>
@@ -658,6 +709,7 @@
                               </w:rPr>
                               <w:t xml:space="preserve"> </w:t>
                             </w:r>
+                            <w:proofErr w:type="gramStart"/>
                             <w:r>
                               <w:rPr>
                                 <w:rFonts w:cs="Consolas"/>
@@ -665,7 +717,57 @@
                                 <w:sz w:val="80"/>
                                 <w:szCs w:val="80"/>
                               </w:rPr>
-                              <w:t>{{ consultant_name }}</w:t>
+                              <w:t xml:space="preserve">{{ </w:t>
+                            </w:r>
+                            <w:proofErr w:type="spellStart"/>
+                            <w:r>
+                              <w:rPr>
+                                <w:rFonts w:cs="Consolas"/>
+                                <w:color w:val="FFFFFF" w:themeColor="background1"/>
+                                <w:sz w:val="80"/>
+                                <w:szCs w:val="80"/>
+                              </w:rPr>
+                              <w:t>consultant</w:t>
+                            </w:r>
+                            <w:proofErr w:type="gramEnd"/>
+                            <w:r>
+                              <w:rPr>
+                                <w:rFonts w:cs="Consolas"/>
+                                <w:color w:val="FFFFFF" w:themeColor="background1"/>
+                                <w:sz w:val="80"/>
+                                <w:szCs w:val="80"/>
+                              </w:rPr>
+                              <w:t>_</w:t>
+                            </w:r>
+                            <w:proofErr w:type="gramStart"/>
+                            <w:r>
+                              <w:rPr>
+                                <w:rFonts w:cs="Consolas"/>
+                                <w:color w:val="FFFFFF" w:themeColor="background1"/>
+                                <w:sz w:val="80"/>
+                                <w:szCs w:val="80"/>
+                              </w:rPr>
+                              <w:t>name</w:t>
+                            </w:r>
+                            <w:proofErr w:type="spellEnd"/>
+                            <w:r>
+                              <w:rPr>
+                                <w:rFonts w:cs="Consolas"/>
+                                <w:color w:val="FFFFFF" w:themeColor="background1"/>
+                                <w:sz w:val="80"/>
+                                <w:szCs w:val="80"/>
+                              </w:rPr>
+                              <w:t xml:space="preserve"> }</w:t>
+                            </w:r>
+                            <w:proofErr w:type="gramEnd"/>
+                            <w:r>
+                              <w:rPr>
+                                <w:rFonts w:cs="Consolas"/>
+                                <w:color w:val="FFFFFF" w:themeColor="background1"/>
+                                <w:sz w:val="80"/>
+                                <w:szCs w:val="80"/>
+                              </w:rPr>
+                              <w:t>}</w:t>
                             </w:r>
                           </w:p>
                           <w:p>
@@ -925,7 +1027,61 @@
           <w:bCs/>
           <w:color w:val="EE0000"/>
         </w:rPr>
-        <w:t>{% for guide in consultant_discovery_guide %}• {{ guide }}</w:t>
+        <w:t xml:space="preserve">{% for guide in </w:t>
+      </w:r>
+      <w:proofErr w:type="spellStart"/>
+      <w:r>
+        <w:rPr>
+          <w:b/>
+          <w:bCs/>
+          <w:color w:val="EE0000"/>
+        </w:rPr>
+        <w:t>consultant_discovery_guide</w:t>
+      </w:r>
+      <w:proofErr w:type="spellEnd"/>
+      <w:r>
+        <w:rPr>
+          <w:b/>
+          <w:bCs/>
+          <w:color w:val="EE0000"/>
+        </w:rPr>
+        <w:t xml:space="preserve"> </w:t>
+      </w:r>
+      <w:proofErr w:type="gramStart"/>
+      <w:r>
+        <w:rPr>
+          <w:b/>
+          <w:bCs/>
+          <w:color w:val="EE0000"/>
+        </w:rPr>
+        <w:t>%}•</w:t>
+      </w:r>
+      <w:proofErr w:type="gramEnd"/>
+      <w:r>
+        <w:rPr>
+          <w:b/>
+          <w:bCs/>
+          <w:color w:val="EE0000"/>
+        </w:rPr>
+        <w:t xml:space="preserve"> </w:t>
+      </w:r>
+      <w:proofErr w:type="gramStart"/>
+      <w:r>
+        <w:rPr>
+          <w:b/>
+          <w:bCs/>
+          <w:color w:val="EE0000"/>
+        </w:rPr>
+        <w:t>{{ guide</w:t>
+      </w:r>
+      <w:proofErr w:type="gramEnd"/>
+      <w:r>
+        <w:rPr>
+          <w:b/>
+          <w:bCs/>
+          <w:color w:val="EE0000"/>
+        </w:rPr>
+        <w:t xml:space="preserve"> }}</w:t>
       </w:r>
     </w:p>
     <w:p>
@@ -942,7 +1098,25 @@
           <w:bCs/>
           <w:color w:val="EE0000"/>
         </w:rPr>
-        <w:t>{% endfor %}</w:t>
+        <w:t xml:space="preserve">{% </w:t>
+      </w:r>
+      <w:proofErr w:type="spellStart"/>
+      <w:r>
+        <w:rPr>
+          <w:b/>
+          <w:bCs/>
+          <w:color w:val="EE0000"/>
+        </w:rPr>
+        <w:t>endfor</w:t>
+      </w:r>
+      <w:proofErr w:type="spellEnd"/>
+      <w:r>
+        <w:rPr>
+          <w:b/>
+          <w:bCs/>
+          <w:color w:val="EE0000"/>
+        </w:rPr>
+        <w:t xml:space="preserve"> %}</w:t>
       </w:r>
     </w:p>
     <w:p/>
@@ -953,8 +1127,29 @@
         <w:pStyle w:val="Heading1"/>
         <w:spacing w:after="240"/>
       </w:pPr>
-      <w:r>
-        <w:t>{{ customer_name }}</w:t>
+      <w:proofErr w:type="gramStart"/>
+      <w:r>
+        <w:t xml:space="preserve">{{ </w:t>
+      </w:r>
+      <w:proofErr w:type="spellStart"/>
+      <w:r>
+        <w:t>customer</w:t>
+      </w:r>
+      <w:proofErr w:type="gramEnd"/>
+      <w:r>
+        <w:t>_</w:t>
+      </w:r>
+      <w:proofErr w:type="gramStart"/>
+      <w:r>
+        <w:t>name</w:t>
+      </w:r>
+      <w:proofErr w:type="spellEnd"/>
+      <w:r>
+        <w:t xml:space="preserve"> }</w:t>
+      </w:r>
+      <w:proofErr w:type="gramEnd"/>
+      <w:r>
+        <w:t>}</w:t>
       </w:r>
       <w:r>
         <w:t xml:space="preserve"> </w:t>
@@ -971,8 +1166,29 @@
     </w:p>
     <w:p/>
     <w:p>
-      <w:r>
-        <w:t>{{ customer_name }}</w:t>
+      <w:proofErr w:type="gramStart"/>
+      <w:r>
+        <w:t xml:space="preserve">{{ </w:t>
+      </w:r>
+      <w:proofErr w:type="spellStart"/>
+      <w:r>
+        <w:t>customer</w:t>
+      </w:r>
+      <w:proofErr w:type="gramEnd"/>
+      <w:r>
+        <w:t>_</w:t>
+      </w:r>
+      <w:proofErr w:type="gramStart"/>
+      <w:r>
+        <w:t>name</w:t>
+      </w:r>
+      <w:proofErr w:type="spellEnd"/>
+      <w:r>
+        <w:t xml:space="preserve"> }</w:t>
+      </w:r>
+      <w:proofErr w:type="gramEnd"/>
+      <w:r>
+        <w:t>}</w:t>
       </w:r>
       <w:r>
         <w:t xml:space="preserve"> have undergone a Security Maturity Assessment completed by Planet IT.  This comprehensive assessment of the </w:t>
@@ -980,8 +1196,29 @@
       <w:r>
         <w:t xml:space="preserve">current security implementation of </w:t>
       </w:r>
-      <w:r>
-        <w:t>{{ customer_name }}</w:t>
+      <w:proofErr w:type="gramStart"/>
+      <w:r>
+        <w:t xml:space="preserve">{{ </w:t>
+      </w:r>
+      <w:proofErr w:type="spellStart"/>
+      <w:r>
+        <w:t>customer</w:t>
+      </w:r>
+      <w:proofErr w:type="gramEnd"/>
+      <w:r>
+        <w:t>_</w:t>
+      </w:r>
+      <w:proofErr w:type="gramStart"/>
+      <w:r>
+        <w:t>name</w:t>
+      </w:r>
+      <w:proofErr w:type="spellEnd"/>
+      <w:r>
+        <w:t xml:space="preserve"> }</w:t>
+      </w:r>
+      <w:proofErr w:type="gramEnd"/>
+      <w:r>
+        <w:t>}</w:t>
       </w:r>
       <w:r>
         <w:t xml:space="preserve"> focused on assessing the security maturity </w:t>
@@ -989,8 +1226,29 @@
       <w:r>
         <w:t xml:space="preserve">of the systems, solutions and culture in place at </w:t>
       </w:r>
-      <w:r>
-        <w:t>{{ customer_name }}</w:t>
+      <w:proofErr w:type="gramStart"/>
+      <w:r>
+        <w:t xml:space="preserve">{{ </w:t>
+      </w:r>
+      <w:proofErr w:type="spellStart"/>
+      <w:r>
+        <w:t>customer</w:t>
+      </w:r>
+      <w:proofErr w:type="gramEnd"/>
+      <w:r>
+        <w:t>_</w:t>
+      </w:r>
+      <w:proofErr w:type="gramStart"/>
+      <w:r>
+        <w:t>name</w:t>
+      </w:r>
+      <w:proofErr w:type="spellEnd"/>
+      <w:r>
+        <w:t xml:space="preserve"> }</w:t>
+      </w:r>
+      <w:proofErr w:type="gramEnd"/>
+      <w:r>
+        <w:t>}</w:t>
       </w:r>
       <w:r>
         <w:t>.</w:t>
@@ -1207,8 +1465,29 @@
       <w:r>
         <w:t xml:space="preserve">estimated security maturity in place at </w:t>
       </w:r>
-      <w:r>
-        <w:t>{{ customer_name }}</w:t>
+      <w:proofErr w:type="gramStart"/>
+      <w:r>
+        <w:t xml:space="preserve">{{ </w:t>
+      </w:r>
+      <w:proofErr w:type="spellStart"/>
+      <w:r>
+        <w:t>customer</w:t>
+      </w:r>
+      <w:proofErr w:type="gramEnd"/>
+      <w:r>
+        <w:t>_</w:t>
+      </w:r>
+      <w:proofErr w:type="gramStart"/>
+      <w:r>
+        <w:t>name</w:t>
+      </w:r>
+      <w:proofErr w:type="spellEnd"/>
+      <w:r>
+        <w:t xml:space="preserve"> }</w:t>
+      </w:r>
+      <w:proofErr w:type="gramEnd"/>
+      <w:r>
+        <w:t>}</w:t>
       </w:r>
       <w:r>
         <w:t xml:space="preserve">, </w:t>
@@ -1222,8 +1501,29 @@
       <w:r>
         <w:t xml:space="preserve">and culture at </w:t>
       </w:r>
-      <w:r>
-        <w:t>{{ customer_name }}</w:t>
+      <w:proofErr w:type="gramStart"/>
+      <w:r>
+        <w:t xml:space="preserve">{{ </w:t>
+      </w:r>
+      <w:proofErr w:type="spellStart"/>
+      <w:r>
+        <w:t>customer</w:t>
+      </w:r>
+      <w:proofErr w:type="gramEnd"/>
+      <w:r>
+        <w:t>_</w:t>
+      </w:r>
+      <w:proofErr w:type="gramStart"/>
+      <w:r>
+        <w:t>name</w:t>
+      </w:r>
+      <w:proofErr w:type="spellEnd"/>
+      <w:r>
+        <w:t xml:space="preserve"> }</w:t>
+      </w:r>
+      <w:proofErr w:type="gramEnd"/>
+      <w:r>
+        <w:t>}</w:t>
       </w:r>
       <w:r>
         <w:t>.</w:t>
@@ -1242,8 +1542,53 @@
           <w:tab w:val="num" w:pos="720"/>
         </w:tabs>
       </w:pPr>
-      <w:r>
-        <w:t xml:space="preserve">{{ maturity_gauge }} {{ maturity_score }} </w:t>
+      <w:proofErr w:type="gramStart"/>
+      <w:r>
+        <w:t xml:space="preserve">{{ </w:t>
+      </w:r>
+      <w:proofErr w:type="spellStart"/>
+      <w:r>
+        <w:t>maturity</w:t>
+      </w:r>
+      <w:proofErr w:type="gramEnd"/>
+      <w:r>
+        <w:t>_</w:t>
+      </w:r>
+      <w:proofErr w:type="gramStart"/>
+      <w:r>
+        <w:t>gauge</w:t>
+      </w:r>
+      <w:proofErr w:type="spellEnd"/>
+      <w:r>
+        <w:t xml:space="preserve"> }</w:t>
+      </w:r>
+      <w:proofErr w:type="gramEnd"/>
+      <w:r>
+        <w:t xml:space="preserve">} </w:t>
+      </w:r>
+      <w:proofErr w:type="gramStart"/>
+      <w:r>
+        <w:t xml:space="preserve">{{ </w:t>
+      </w:r>
+      <w:proofErr w:type="spellStart"/>
+      <w:r>
+        <w:t>maturity</w:t>
+      </w:r>
+      <w:proofErr w:type="gramEnd"/>
+      <w:r>
+        <w:t>_</w:t>
+      </w:r>
+      <w:proofErr w:type="gramStart"/>
+      <w:r>
+        <w:t>score</w:t>
+      </w:r>
+      <w:proofErr w:type="spellEnd"/>
+      <w:r>
+        <w:t xml:space="preserve"> }</w:t>
+      </w:r>
+      <w:proofErr w:type="gramEnd"/>
+      <w:r>
+        <w:t xml:space="preserve">} </w:t>
       </w:r>
     </w:p>
     <w:p>
@@ -1252,8 +1597,29 @@
           <w:tab w:val="num" w:pos="720"/>
         </w:tabs>
       </w:pPr>
-      <w:r>
-        <w:t>{{ maturity_score_category }}</w:t>
+      <w:proofErr w:type="gramStart"/>
+      <w:r>
+        <w:t xml:space="preserve">{{ </w:t>
+      </w:r>
+      <w:proofErr w:type="spellStart"/>
+      <w:r>
+        <w:t>maturity</w:t>
+      </w:r>
+      <w:proofErr w:type="gramEnd"/>
+      <w:r>
+        <w:t>_gauge_</w:t>
+      </w:r>
+      <w:proofErr w:type="gramStart"/>
+      <w:r>
+        <w:t>caption</w:t>
+      </w:r>
+      <w:proofErr w:type="spellEnd"/>
+      <w:r>
+        <w:t xml:space="preserve"> }</w:t>
+      </w:r>
+      <w:proofErr w:type="gramEnd"/>
+      <w:r>
+        <w:t>}</w:t>
       </w:r>
     </w:p>
     <w:p>
@@ -1269,14 +1635,29 @@
           <w:tab w:val="num" w:pos="720"/>
         </w:tabs>
       </w:pPr>
+      <w:proofErr w:type="gramStart"/>
       <w:r>
         <w:t xml:space="preserve">{{ </w:t>
       </w:r>
-      <w:r>
-        <w:t>domain_ratings_bullets</w:t>
-      </w:r>
-      <w:r>
-        <w:t xml:space="preserve"> }}</w:t>
+      <w:proofErr w:type="spellStart"/>
+      <w:r>
+        <w:t>maturity</w:t>
+      </w:r>
+      <w:proofErr w:type="gramEnd"/>
+      <w:r>
+        <w:t>_pillar_</w:t>
+      </w:r>
+      <w:proofErr w:type="gramStart"/>
+      <w:r>
+        <w:t>distribution</w:t>
+      </w:r>
+      <w:proofErr w:type="spellEnd"/>
+      <w:r>
+        <w:t xml:space="preserve"> }</w:t>
+      </w:r>
+      <w:proofErr w:type="gramEnd"/>
+      <w:r>
+        <w:t>}</w:t>
       </w:r>
     </w:p>
     <w:p>
@@ -1285,30 +1666,86 @@
           <w:tab w:val="num" w:pos="720"/>
         </w:tabs>
       </w:pPr>
+      <w:proofErr w:type="gramStart"/>
+      <w:r>
+        <w:t xml:space="preserve">{{ </w:t>
+      </w:r>
+      <w:proofErr w:type="spellStart"/>
+      <w:r>
+        <w:t>domain</w:t>
+      </w:r>
+      <w:proofErr w:type="gramEnd"/>
+      <w:r>
+        <w:t>_ratings_</w:t>
+      </w:r>
+      <w:proofErr w:type="gramStart"/>
+      <w:r>
+        <w:t>bullets</w:t>
+      </w:r>
+      <w:proofErr w:type="spellEnd"/>
+      <w:r>
+        <w:t xml:space="preserve"> }</w:t>
+      </w:r>
+      <w:proofErr w:type="gramEnd"/>
+      <w:r>
+        <w:t>}</w:t>
+      </w:r>
+    </w:p>
+    <w:p>
+      <w:pPr>
+        <w:tabs>
+          <w:tab w:val="num" w:pos="720"/>
+        </w:tabs>
+      </w:pPr>
       <w:r>
         <w:t>{{</w:t>
       </w:r>
-      <w:r>
-        <w:t>domain_ratings</w:t>
-      </w:r>
-      <w:r>
-        <w:t xml:space="preserve"> }}</w:t>
+      <w:proofErr w:type="spellStart"/>
+      <w:r>
+        <w:t>domain_</w:t>
+      </w:r>
+      <w:proofErr w:type="gramStart"/>
+      <w:r>
+        <w:t>ratings</w:t>
+      </w:r>
+      <w:proofErr w:type="spellEnd"/>
+      <w:r>
+        <w:t xml:space="preserve"> }</w:t>
+      </w:r>
+      <w:proofErr w:type="gramEnd"/>
+      <w:r>
+        <w:t>}</w:t>
       </w:r>
     </w:p>
     <w:p/>
     <w:p/>
     <w:p>
+      <w:proofErr w:type="gramStart"/>
       <w:r>
         <w:t xml:space="preserve">{{ </w:t>
       </w:r>
-      <w:r>
-        <w:t>executive_summary_actions</w:t>
-      </w:r>
-      <w:r>
-        <w:t>_word</w:t>
-      </w:r>
-      <w:r>
-        <w:t xml:space="preserve"> }}</w:t>
+      <w:proofErr w:type="spellStart"/>
+      <w:r>
+        <w:t>executive</w:t>
+      </w:r>
+      <w:proofErr w:type="gramEnd"/>
+      <w:r>
+        <w:t>_summary_actions</w:t>
+      </w:r>
+      <w:r>
+        <w:t>_</w:t>
+      </w:r>
+      <w:proofErr w:type="gramStart"/>
+      <w:r>
+        <w:t>word</w:t>
+      </w:r>
+      <w:proofErr w:type="spellEnd"/>
+      <w:r>
+        <w:t xml:space="preserve"> }</w:t>
+      </w:r>
+      <w:proofErr w:type="gramEnd"/>
+      <w:r>
+        <w:t>}</w:t>
       </w:r>
     </w:p>
     <w:p/>
@@ -1322,8 +1759,29 @@
       </w:r>
     </w:p>
     <w:p>
-      <w:r>
-        <w:t>{{ exec_summary }}</w:t>
+      <w:proofErr w:type="gramStart"/>
+      <w:r>
+        <w:t xml:space="preserve">{{ </w:t>
+      </w:r>
+      <w:proofErr w:type="spellStart"/>
+      <w:r>
+        <w:t>exec</w:t>
+      </w:r>
+      <w:proofErr w:type="gramEnd"/>
+      <w:r>
+        <w:t>_</w:t>
+      </w:r>
+      <w:proofErr w:type="gramStart"/>
+      <w:r>
+        <w:t>summary</w:t>
+      </w:r>
+      <w:proofErr w:type="spellEnd"/>
+      <w:r>
+        <w:t xml:space="preserve"> }</w:t>
+      </w:r>
+      <w:proofErr w:type="gramEnd"/>
+      <w:r>
+        <w:t>}</w:t>
       </w:r>
     </w:p>
     <w:p/>
@@ -1343,14 +1801,41 @@
     <w:p/>
     <w:p/>
     <w:p>
-      <w:r>
-        <w:t>{{ radar</w:t>
-      </w:r>
+      <w:proofErr w:type="gramStart"/>
+      <w:r>
+        <w:t xml:space="preserve">{{ </w:t>
+      </w:r>
+      <w:proofErr w:type="spellStart"/>
+      <w:r>
+        <w:t>radar</w:t>
+      </w:r>
+      <w:proofErr w:type="gramEnd"/>
       <w:r>
         <w:rPr>
           <w:rStyle w:val="hljs-emphasis"/>
         </w:rPr>
-        <w:t>_chart }}</w:t>
+        <w:t>_</w:t>
+      </w:r>
+      <w:proofErr w:type="gramStart"/>
+      <w:r>
+        <w:rPr>
+          <w:rStyle w:val="hljs-emphasis"/>
+        </w:rPr>
+        <w:t>chart</w:t>
+      </w:r>
+      <w:proofErr w:type="spellEnd"/>
+      <w:r>
+        <w:rPr>
+          <w:rStyle w:val="hljs-emphasis"/>
+        </w:rPr>
+        <w:t xml:space="preserve"> }</w:t>
+      </w:r>
+      <w:proofErr w:type="gramEnd"/>
+      <w:r>
+        <w:rPr>
+          <w:rStyle w:val="hljs-emphasis"/>
+        </w:rPr>
+        <w:t>}</w:t>
       </w:r>
     </w:p>
     <w:p/>
@@ -1378,8 +1863,29 @@
       </w:r>
     </w:p>
     <w:p>
-      <w:r>
-        <w:t>{{ matrix_mapping }}</w:t>
+      <w:proofErr w:type="gramStart"/>
+      <w:r>
+        <w:t xml:space="preserve">{{ </w:t>
+      </w:r>
+      <w:proofErr w:type="spellStart"/>
+      <w:r>
+        <w:t>matrix</w:t>
+      </w:r>
+      <w:proofErr w:type="gramEnd"/>
+      <w:r>
+        <w:t>_</w:t>
+      </w:r>
+      <w:proofErr w:type="gramStart"/>
+      <w:r>
+        <w:t>mapping</w:t>
+      </w:r>
+      <w:proofErr w:type="spellEnd"/>
+      <w:r>
+        <w:t xml:space="preserve"> }</w:t>
+      </w:r>
+      <w:proofErr w:type="gramEnd"/>
+      <w:r>
+        <w:t>}</w:t>
       </w:r>
     </w:p>
     <w:p/>
@@ -1638,171 +2144,6 @@
       </w:r>
     </w:p>
     <w:p>
-      <w:r>
-        <w:t xml:space="preserve">{% for comp in compliance_alignment %} </w:t>
-      </w:r>
-      <w:r>
-        <w:rPr>
-          <w:b/>
-          <w:bCs/>
-        </w:rPr>
-        <w:t>Standard:</w:t>
-      </w:r>
-      <w:r>
-        <w:t xml:space="preserve"> {{ comp.standard }} {% if comp.gaps %} </w:t>
-      </w:r>
-      <w:r>
-        <w:rPr>
-          <w:b/>
-          <w:bCs/>
-        </w:rPr>
-        <w:t>Gaps:</w:t>
-      </w:r>
-      <w:r>
-        <w:t xml:space="preserve"> {% for gap in comp.gaps %}</w:t>
-      </w:r>
-    </w:p>
-    <w:p/>
-    <w:p>
-      <w:r>
-        <w:rPr>
-          <w:b/>
-          <w:bCs/>
-        </w:rPr>
-        <w:t>- {{</w:t>
-      </w:r>
-      <w:r>
-        <w:t xml:space="preserve"> gap }} {% endfor %} {% endif %} {% if comp.fill_plan %} </w:t>
-      </w:r>
-      <w:r>
-        <w:rPr>
-          <w:b/>
-          <w:bCs/>
-        </w:rPr>
-        <w:t>Remediation Plans:</w:t>
-      </w:r>
-      <w:r>
-        <w:t xml:space="preserve"> {% for gp in comp.fill_plan %}</w:t>
-      </w:r>
-    </w:p>
-    <w:p/>
-    <w:p>
-      <w:r>
-        <w:rPr>
-          <w:b/>
-          <w:bCs/>
-        </w:rPr>
-        <w:t>- Gap:</w:t>
-      </w:r>
-      <w:r>
-        <w:t xml:space="preserve"> {{ gp.gap_description }}</w:t>
-      </w:r>
-    </w:p>
-    <w:p/>
-    <w:p>
-      <w:r>
-        <w:t xml:space="preserve">  </w:t>
-      </w:r>
-      <w:r>
-        <w:rPr>
-          <w:b/>
-          <w:bCs/>
-        </w:rPr>
-        <w:t>- Actions:</w:t>
-      </w:r>
-      <w:r>
-        <w:t xml:space="preserve"> {% for action in gp.recommended_actions %}</w:t>
-      </w:r>
-    </w:p>
-    <w:p>
-      <w:r>
-        <w:t xml:space="preserve">    - {{ action }} {% endfor %}</w:t>
-      </w:r>
-    </w:p>
-    <w:p>
-      <w:r>
-        <w:t xml:space="preserve">  </w:t>
-      </w:r>
-      <w:r>
-        <w:rPr>
-          <w:b/>
-          <w:bCs/>
-        </w:rPr>
-        <w:t>- Owner:</w:t>
-      </w:r>
-      <w:r>
-        <w:t xml:space="preserve"> {{ gp.owner }}</w:t>
-      </w:r>
-    </w:p>
-    <w:p>
-      <w:pPr>
-        <w:rPr>
-          <w:rStyle w:val="Heading2Char"/>
-        </w:rPr>
-      </w:pPr>
-      <w:r>
-        <w:t xml:space="preserve">  </w:t>
-      </w:r>
-      <w:r>
-        <w:rPr>
-          <w:b/>
-          <w:bCs/>
-        </w:rPr>
-        <w:t>- Due By:</w:t>
-      </w:r>
-      <w:r>
-        <w:t xml:space="preserve"> {{ gp.due_by }} {% endfor %} {% endif %} {% endfor %}</w:t>
-      </w:r>
-    </w:p>
-    <w:p>
-      <w:pPr>
-        <w:rPr>
-          <w:rStyle w:val="Heading2Char"/>
-        </w:rPr>
-      </w:pPr>
-    </w:p>
-    <w:p>
-      <w:r>
-        <w:rPr>
-          <w:rStyle w:val="Heading2Char"/>
-        </w:rPr>
-        <w:t>The Cost of Inaction</w:t>
-      </w:r>
-      <w:r>
-        <w:t xml:space="preserve"> </w:t>
-      </w:r>
-    </w:p>
-    <w:p>
-      <w:r>
-        <w:t>{{ cost_of_inaction }}</w:t>
-      </w:r>
-    </w:p>
-    <w:p/>
-    <w:p>
-      <w:r>
-        <w:t>{</w:t>
-      </w:r>
-      <w:r>
-        <w:t>{ cost_of_inaction_summary }}</w:t>
-      </w:r>
-    </w:p>
-    <w:p/>
-    <w:p>
-      <w:r>
-        <w:t>{{ threat_intelligence_context }}</w:t>
-      </w:r>
-    </w:p>
-    <w:p/>
-    <w:p>
-      <w:pPr>
-        <w:pStyle w:val="Heading2"/>
-      </w:pPr>
-      <w:r>
-        <w:lastRenderedPageBreak/>
-        <w:t>Monte-Carlo Assessment</w:t>
-      </w:r>
-    </w:p>
-    <w:p>
       <w:pPr>
         <w:rPr>
           <w:rStyle w:val="Heading2Char"/>
@@ -1819,6 +2160,7 @@
           <w:szCs w:val="20"/>
         </w:rPr>
       </w:pPr>
+      <w:proofErr w:type="gramStart"/>
       <w:r>
         <w:rPr>
           <w:rStyle w:val="Heading2Char"/>
@@ -1826,12 +2168,508 @@
           <w:color w:val="auto"/>
           <w:szCs w:val="20"/>
         </w:rPr>
-        <w:t>{{ monte_carlo_section }}</w:t>
+        <w:t xml:space="preserve">{{ </w:t>
+      </w:r>
+      <w:proofErr w:type="spellStart"/>
+      <w:r>
+        <w:rPr>
+          <w:rStyle w:val="Heading2Char"/>
+          <w:rFonts w:ascii="Arial" w:hAnsi="Arial" w:cs="Arial"/>
+          <w:color w:val="auto"/>
+          <w:szCs w:val="20"/>
+        </w:rPr>
+        <w:t>compliance</w:t>
+      </w:r>
+      <w:proofErr w:type="gramEnd"/>
+      <w:r>
+        <w:rPr>
+          <w:rStyle w:val="Heading2Char"/>
+          <w:rFonts w:ascii="Arial" w:hAnsi="Arial" w:cs="Arial"/>
+          <w:color w:val="auto"/>
+          <w:szCs w:val="20"/>
+        </w:rPr>
+        <w:t>_alignment_</w:t>
+      </w:r>
+      <w:proofErr w:type="gramStart"/>
+      <w:r>
+        <w:rPr>
+          <w:rStyle w:val="Heading2Char"/>
+          <w:rFonts w:ascii="Arial" w:hAnsi="Arial" w:cs="Arial"/>
+          <w:color w:val="auto"/>
+          <w:szCs w:val="20"/>
+        </w:rPr>
+        <w:t>render</w:t>
+      </w:r>
+      <w:proofErr w:type="spellEnd"/>
+      <w:r>
+        <w:rPr>
+          <w:rStyle w:val="Heading2Char"/>
+          <w:rFonts w:ascii="Arial" w:hAnsi="Arial" w:cs="Arial"/>
+          <w:color w:val="auto"/>
+          <w:szCs w:val="20"/>
+        </w:rPr>
+        <w:t xml:space="preserve"> }</w:t>
+      </w:r>
+      <w:proofErr w:type="gramEnd"/>
+      <w:r>
+        <w:rPr>
+          <w:rStyle w:val="Heading2Char"/>
+          <w:rFonts w:ascii="Arial" w:hAnsi="Arial" w:cs="Arial"/>
+          <w:color w:val="auto"/>
+          <w:szCs w:val="20"/>
+        </w:rPr>
+        <w:t>}</w:t>
+      </w:r>
+    </w:p>
+    <w:p>
+      <w:pPr>
+        <w:rPr>
+          <w:rStyle w:val="Heading2Char"/>
+        </w:rPr>
+      </w:pPr>
+    </w:p>
+    <w:p>
+      <w:r>
+        <w:t xml:space="preserve">{% for comp in </w:t>
+      </w:r>
+      <w:proofErr w:type="spellStart"/>
+      <w:r>
+        <w:t>compliance_alignment</w:t>
+      </w:r>
+      <w:proofErr w:type="spellEnd"/>
+      <w:r>
+        <w:t xml:space="preserve"> %} </w:t>
+      </w:r>
+      <w:r>
+        <w:rPr>
+          <w:b/>
+          <w:bCs/>
+        </w:rPr>
+        <w:t>Standard:</w:t>
+      </w:r>
+      <w:r>
+        <w:t xml:space="preserve"> </w:t>
+      </w:r>
+      <w:proofErr w:type="gramStart"/>
+      <w:r>
+        <w:t xml:space="preserve">{{ </w:t>
+      </w:r>
+      <w:proofErr w:type="spellStart"/>
+      <w:r>
+        <w:t>comp</w:t>
+      </w:r>
+      <w:proofErr w:type="gramEnd"/>
+      <w:r>
+        <w:t>.</w:t>
+      </w:r>
+      <w:proofErr w:type="gramStart"/>
+      <w:r>
+        <w:t>standard</w:t>
+      </w:r>
+      <w:proofErr w:type="spellEnd"/>
+      <w:r>
+        <w:t xml:space="preserve"> }</w:t>
+      </w:r>
+      <w:proofErr w:type="gramEnd"/>
+      <w:r>
+        <w:t xml:space="preserve">} {% if </w:t>
+      </w:r>
+      <w:proofErr w:type="spellStart"/>
+      <w:proofErr w:type="gramStart"/>
+      <w:r>
+        <w:t>comp.gaps</w:t>
+      </w:r>
+      <w:proofErr w:type="spellEnd"/>
+      <w:proofErr w:type="gramEnd"/>
+      <w:r>
+        <w:t xml:space="preserve"> %} </w:t>
+      </w:r>
+      <w:r>
+        <w:rPr>
+          <w:b/>
+          <w:bCs/>
+        </w:rPr>
+        <w:t>Gaps:</w:t>
+      </w:r>
+      <w:r>
+        <w:t xml:space="preserve"> {% for gap in </w:t>
+      </w:r>
+      <w:proofErr w:type="spellStart"/>
+      <w:proofErr w:type="gramStart"/>
+      <w:r>
+        <w:t>comp.gaps</w:t>
+      </w:r>
+      <w:proofErr w:type="spellEnd"/>
+      <w:proofErr w:type="gramEnd"/>
+      <w:r>
+        <w:t xml:space="preserve"> %}</w:t>
       </w:r>
     </w:p>
     <w:p/>
+    <w:p>
+      <w:r>
+        <w:rPr>
+          <w:b/>
+          <w:bCs/>
+        </w:rPr>
+        <w:t xml:space="preserve">- </w:t>
+      </w:r>
+      <w:proofErr w:type="gramStart"/>
+      <w:r>
+        <w:rPr>
+          <w:b/>
+          <w:bCs/>
+        </w:rPr>
+        <w:t>{{</w:t>
+      </w:r>
+      <w:r>
+        <w:t xml:space="preserve"> gap</w:t>
+      </w:r>
+      <w:proofErr w:type="gramEnd"/>
+      <w:r>
+        <w:t xml:space="preserve"> }} {% </w:t>
+      </w:r>
+      <w:proofErr w:type="spellStart"/>
+      <w:r>
+        <w:t>endfor</w:t>
+      </w:r>
+      <w:proofErr w:type="spellEnd"/>
+      <w:r>
+        <w:t xml:space="preserve"> %} {% endif %} {% if </w:t>
+      </w:r>
+      <w:proofErr w:type="spellStart"/>
+      <w:proofErr w:type="gramStart"/>
+      <w:r>
+        <w:t>comp.fill</w:t>
+      </w:r>
+      <w:proofErr w:type="gramEnd"/>
+      <w:r>
+        <w:t>_plan</w:t>
+      </w:r>
+      <w:proofErr w:type="spellEnd"/>
+      <w:r>
+        <w:t xml:space="preserve"> %} </w:t>
+      </w:r>
+      <w:r>
+        <w:rPr>
+          <w:b/>
+          <w:bCs/>
+        </w:rPr>
+        <w:t>Remediation Plans:</w:t>
+      </w:r>
+      <w:r>
+        <w:t xml:space="preserve"> {% for </w:t>
+      </w:r>
+      <w:proofErr w:type="spellStart"/>
+      <w:r>
+        <w:t>gp</w:t>
+      </w:r>
+      <w:proofErr w:type="spellEnd"/>
+      <w:r>
+        <w:t xml:space="preserve"> in </w:t>
+      </w:r>
+      <w:proofErr w:type="spellStart"/>
+      <w:proofErr w:type="gramStart"/>
+      <w:r>
+        <w:t>comp.fill</w:t>
+      </w:r>
+      <w:proofErr w:type="gramEnd"/>
+      <w:r>
+        <w:t>_plan</w:t>
+      </w:r>
+      <w:proofErr w:type="spellEnd"/>
+      <w:r>
+        <w:t xml:space="preserve"> %}</w:t>
+      </w:r>
+    </w:p>
     <w:p/>
+    <w:p>
+      <w:r>
+        <w:rPr>
+          <w:b/>
+          <w:bCs/>
+        </w:rPr>
+        <w:t>- Gap:</w:t>
+      </w:r>
+      <w:r>
+        <w:t xml:space="preserve"> </w:t>
+      </w:r>
+      <w:proofErr w:type="gramStart"/>
+      <w:r>
+        <w:t xml:space="preserve">{{ </w:t>
+      </w:r>
+      <w:proofErr w:type="spellStart"/>
+      <w:r>
+        <w:t>gp.gap</w:t>
+      </w:r>
+      <w:proofErr w:type="gramEnd"/>
+      <w:r>
+        <w:t>_</w:t>
+      </w:r>
+      <w:proofErr w:type="gramStart"/>
+      <w:r>
+        <w:t>description</w:t>
+      </w:r>
+      <w:proofErr w:type="spellEnd"/>
+      <w:r>
+        <w:t xml:space="preserve"> }</w:t>
+      </w:r>
+      <w:proofErr w:type="gramEnd"/>
+      <w:r>
+        <w:t>}</w:t>
+      </w:r>
+    </w:p>
     <w:p/>
+    <w:p>
+      <w:r>
+        <w:t xml:space="preserve">  </w:t>
+      </w:r>
+      <w:r>
+        <w:rPr>
+          <w:b/>
+          <w:bCs/>
+        </w:rPr>
+        <w:t>- Actions:</w:t>
+      </w:r>
+      <w:r>
+        <w:t xml:space="preserve"> {% for action in </w:t>
+      </w:r>
+      <w:proofErr w:type="spellStart"/>
+      <w:proofErr w:type="gramStart"/>
+      <w:r>
+        <w:t>gp.recommended</w:t>
+      </w:r>
+      <w:proofErr w:type="gramEnd"/>
+      <w:r>
+        <w:t>_actions</w:t>
+      </w:r>
+      <w:proofErr w:type="spellEnd"/>
+      <w:r>
+        <w:t xml:space="preserve"> %}</w:t>
+      </w:r>
+    </w:p>
+    <w:p>
+      <w:r>
+        <w:t xml:space="preserve">    - </w:t>
+      </w:r>
+      <w:proofErr w:type="gramStart"/>
+      <w:r>
+        <w:t>{{ action</w:t>
+      </w:r>
+      <w:proofErr w:type="gramEnd"/>
+      <w:r>
+        <w:t xml:space="preserve"> }} {% </w:t>
+      </w:r>
+      <w:proofErr w:type="spellStart"/>
+      <w:r>
+        <w:t>endfor</w:t>
+      </w:r>
+      <w:proofErr w:type="spellEnd"/>
+      <w:r>
+        <w:t xml:space="preserve"> %}</w:t>
+      </w:r>
+    </w:p>
+    <w:p>
+      <w:r>
+        <w:t xml:space="preserve">  </w:t>
+      </w:r>
+      <w:r>
+        <w:rPr>
+          <w:b/>
+          <w:bCs/>
+        </w:rPr>
+        <w:t>- Owner:</w:t>
+      </w:r>
+      <w:r>
+        <w:t xml:space="preserve"> </w:t>
+      </w:r>
+      <w:proofErr w:type="gramStart"/>
+      <w:r>
+        <w:t xml:space="preserve">{{ </w:t>
+      </w:r>
+      <w:proofErr w:type="spellStart"/>
+      <w:r>
+        <w:t>gp</w:t>
+      </w:r>
+      <w:proofErr w:type="gramEnd"/>
+      <w:r>
+        <w:t>.</w:t>
+      </w:r>
+      <w:proofErr w:type="gramStart"/>
+      <w:r>
+        <w:t>owner</w:t>
+      </w:r>
+      <w:proofErr w:type="spellEnd"/>
+      <w:r>
+        <w:t xml:space="preserve"> }</w:t>
+      </w:r>
+      <w:proofErr w:type="gramEnd"/>
+      <w:r>
+        <w:t>}</w:t>
+      </w:r>
+    </w:p>
+    <w:p>
+      <w:pPr>
+        <w:rPr>
+          <w:rStyle w:val="Heading2Char"/>
+        </w:rPr>
+      </w:pPr>
+      <w:r>
+        <w:t xml:space="preserve">  </w:t>
+      </w:r>
+      <w:r>
+        <w:rPr>
+          <w:b/>
+          <w:bCs/>
+        </w:rPr>
+        <w:t>- Due By:</w:t>
+      </w:r>
+      <w:r>
+        <w:t xml:space="preserve"> </w:t>
+      </w:r>
+      <w:proofErr w:type="gramStart"/>
+      <w:r>
+        <w:t xml:space="preserve">{{ </w:t>
+      </w:r>
+      <w:proofErr w:type="spellStart"/>
+      <w:r>
+        <w:t>gp.due</w:t>
+      </w:r>
+      <w:proofErr w:type="gramEnd"/>
+      <w:r>
+        <w:t>_</w:t>
+      </w:r>
+      <w:proofErr w:type="gramStart"/>
+      <w:r>
+        <w:t>by</w:t>
+      </w:r>
+      <w:proofErr w:type="spellEnd"/>
+      <w:r>
+        <w:t xml:space="preserve"> }</w:t>
+      </w:r>
+      <w:proofErr w:type="gramEnd"/>
+      <w:r>
+        <w:t xml:space="preserve">} {% </w:t>
+      </w:r>
+      <w:proofErr w:type="spellStart"/>
+      <w:r>
+        <w:t>endfor</w:t>
+      </w:r>
+      <w:proofErr w:type="spellEnd"/>
+      <w:r>
+        <w:t xml:space="preserve"> %} {% endif %} {% </w:t>
+      </w:r>
+      <w:proofErr w:type="spellStart"/>
+      <w:r>
+        <w:t>endfor</w:t>
+      </w:r>
+      <w:proofErr w:type="spellEnd"/>
+      <w:r>
+        <w:t xml:space="preserve"> %}</w:t>
+      </w:r>
+    </w:p>
+    <w:p>
+      <w:pPr>
+        <w:rPr>
+          <w:rStyle w:val="Heading2Char"/>
+        </w:rPr>
+      </w:pPr>
+    </w:p>
+    <w:p>
+      <w:r>
+        <w:rPr>
+          <w:rStyle w:val="Heading2Char"/>
+        </w:rPr>
+        <w:t>The Cost of Inaction</w:t>
+      </w:r>
+      <w:r>
+        <w:t xml:space="preserve"> </w:t>
+      </w:r>
+    </w:p>
+    <w:p>
+      <w:proofErr w:type="gramStart"/>
+      <w:r>
+        <w:t xml:space="preserve">{{ </w:t>
+      </w:r>
+      <w:proofErr w:type="spellStart"/>
+      <w:r>
+        <w:t>cost</w:t>
+      </w:r>
+      <w:proofErr w:type="gramEnd"/>
+      <w:r>
+        <w:t>_of_</w:t>
+      </w:r>
+      <w:proofErr w:type="gramStart"/>
+      <w:r>
+        <w:t>inaction</w:t>
+      </w:r>
+      <w:proofErr w:type="spellEnd"/>
+      <w:r>
+        <w:t xml:space="preserve"> }</w:t>
+      </w:r>
+      <w:proofErr w:type="gramEnd"/>
+      <w:r>
+        <w:t>}</w:t>
+      </w:r>
+    </w:p>
+    <w:p/>
+    <w:p>
+      <w:proofErr w:type="gramStart"/>
+      <w:r>
+        <w:lastRenderedPageBreak/>
+        <w:t>{</w:t>
+      </w:r>
+      <w:r>
+        <w:t xml:space="preserve">{ </w:t>
+      </w:r>
+      <w:proofErr w:type="spellStart"/>
+      <w:r>
+        <w:t>cost</w:t>
+      </w:r>
+      <w:proofErr w:type="gramEnd"/>
+      <w:r>
+        <w:t>_of_inaction_</w:t>
+      </w:r>
+      <w:proofErr w:type="gramStart"/>
+      <w:r>
+        <w:t>summary</w:t>
+      </w:r>
+      <w:proofErr w:type="spellEnd"/>
+      <w:r>
+        <w:t xml:space="preserve"> }</w:t>
+      </w:r>
+      <w:proofErr w:type="gramEnd"/>
+      <w:r>
+        <w:t>}</w:t>
+      </w:r>
+    </w:p>
+    <w:p/>
+    <w:p>
+      <w:proofErr w:type="gramStart"/>
+      <w:r>
+        <w:t xml:space="preserve">{{ </w:t>
+      </w:r>
+      <w:proofErr w:type="spellStart"/>
+      <w:r>
+        <w:t>threat</w:t>
+      </w:r>
+      <w:proofErr w:type="gramEnd"/>
+      <w:r>
+        <w:t>_intelligence_</w:t>
+      </w:r>
+      <w:proofErr w:type="gramStart"/>
+      <w:r>
+        <w:t>context</w:t>
+      </w:r>
+      <w:proofErr w:type="spellEnd"/>
+      <w:r>
+        <w:t xml:space="preserve"> }</w:t>
+      </w:r>
+      <w:proofErr w:type="gramEnd"/>
+      <w:r>
+        <w:t>}</w:t>
+      </w:r>
+    </w:p>
     <w:p/>
     <w:p/>
     <w:p>
@@ -2031,8 +2869,13 @@
             <w:hideMark/>
           </w:tcPr>
           <w:p>
-            <w:r>
-              <w:t>{{ industry }}</w:t>
+            <w:proofErr w:type="gramStart"/>
+            <w:r>
+              <w:t>{{ industry</w:t>
+            </w:r>
+            <w:proofErr w:type="gramEnd"/>
+            <w:r>
+              <w:t xml:space="preserve"> }}</w:t>
             </w:r>
           </w:p>
         </w:tc>
@@ -2088,8 +2931,13 @@
             <w:hideMark/>
           </w:tcPr>
           <w:p>
-            <w:r>
-              <w:t>{{ users }}</w:t>
+            <w:proofErr w:type="gramStart"/>
+            <w:r>
+              <w:t>{{ users</w:t>
+            </w:r>
+            <w:proofErr w:type="gramEnd"/>
+            <w:r>
+              <w:t xml:space="preserve"> }}</w:t>
             </w:r>
           </w:p>
         </w:tc>
@@ -2145,8 +2993,21 @@
             <w:hideMark/>
           </w:tcPr>
           <w:p>
-            <w:r>
-              <w:t>{{ endpoints }} / {{ servers }}</w:t>
+            <w:proofErr w:type="gramStart"/>
+            <w:r>
+              <w:t>{{ endpoints</w:t>
+            </w:r>
+            <w:proofErr w:type="gramEnd"/>
+            <w:r>
+              <w:t xml:space="preserve"> }} / </w:t>
+            </w:r>
+            <w:proofErr w:type="gramStart"/>
+            <w:r>
+              <w:t>{{ servers</w:t>
+            </w:r>
+            <w:proofErr w:type="gramEnd"/>
+            <w:r>
+              <w:t xml:space="preserve"> }}</w:t>
             </w:r>
           </w:p>
         </w:tc>
@@ -2202,8 +3063,21 @@
             <w:hideMark/>
           </w:tcPr>
           <w:p>
-            <w:r>
-              <w:t>{{ operating_systems }}</w:t>
+            <w:proofErr w:type="gramStart"/>
+            <w:r>
+              <w:t xml:space="preserve">{{ </w:t>
+            </w:r>
+            <w:proofErr w:type="spellStart"/>
+            <w:r>
+              <w:t>operating</w:t>
+            </w:r>
+            <w:proofErr w:type="gramEnd"/>
+            <w:r>
+              <w:t>_systems</w:t>
+            </w:r>
+            <w:proofErr w:type="spellEnd"/>
+            <w:r>
+              <w:t xml:space="preserve"> }}</w:t>
             </w:r>
           </w:p>
         </w:tc>
@@ -2259,8 +3133,21 @@
             <w:hideMark/>
           </w:tcPr>
           <w:p>
-            <w:r>
-              <w:t>{{ cloud_env }}</w:t>
+            <w:proofErr w:type="gramStart"/>
+            <w:r>
+              <w:t xml:space="preserve">{{ </w:t>
+            </w:r>
+            <w:proofErr w:type="spellStart"/>
+            <w:r>
+              <w:t>cloud</w:t>
+            </w:r>
+            <w:proofErr w:type="gramEnd"/>
+            <w:r>
+              <w:t>_env</w:t>
+            </w:r>
+            <w:proofErr w:type="spellEnd"/>
+            <w:r>
+              <w:t xml:space="preserve"> }}</w:t>
             </w:r>
           </w:p>
         </w:tc>
@@ -2320,8 +3207,13 @@
             <w:vAlign w:val="center"/>
           </w:tcPr>
           <w:p>
-            <w:r>
-              <w:t>{{ m365_license }}</w:t>
+            <w:proofErr w:type="gramStart"/>
+            <w:r>
+              <w:t>{{ m</w:t>
+            </w:r>
+            <w:proofErr w:type="gramEnd"/>
+            <w:r>
+              <w:t>365_license }}</w:t>
             </w:r>
           </w:p>
         </w:tc>
@@ -2377,8 +3269,21 @@
             <w:hideMark/>
           </w:tcPr>
           <w:p>
-            <w:r>
-              <w:t>{{ in_house_team }}</w:t>
+            <w:proofErr w:type="gramStart"/>
+            <w:r>
+              <w:t xml:space="preserve">{{ </w:t>
+            </w:r>
+            <w:proofErr w:type="spellStart"/>
+            <w:r>
+              <w:t>in</w:t>
+            </w:r>
+            <w:proofErr w:type="gramEnd"/>
+            <w:r>
+              <w:t>_house_team</w:t>
+            </w:r>
+            <w:proofErr w:type="spellEnd"/>
+            <w:r>
+              <w:t xml:space="preserve"> }}</w:t>
             </w:r>
           </w:p>
         </w:tc>
@@ -2434,8 +3339,13 @@
             <w:hideMark/>
           </w:tcPr>
           <w:p>
-            <w:r>
-              <w:t>{{ compliance }}</w:t>
+            <w:proofErr w:type="gramStart"/>
+            <w:r>
+              <w:t>{{ compliance</w:t>
+            </w:r>
+            <w:proofErr w:type="gramEnd"/>
+            <w:r>
+              <w:t xml:space="preserve"> }}</w:t>
             </w:r>
           </w:p>
         </w:tc>
@@ -2468,7 +3378,7 @@
                 <w:b/>
                 <w:bCs/>
               </w:rPr>
-              <w:t>Crown Jewels</w:t>
+              <w:t>Critical Asset Profile</w:t>
             </w:r>
           </w:p>
         </w:tc>
@@ -2491,8 +3401,21 @@
             <w:hideMark/>
           </w:tcPr>
           <w:p>
-            <w:r>
-              <w:t>{{ critical_infra }}</w:t>
+            <w:proofErr w:type="gramStart"/>
+            <w:r>
+              <w:t xml:space="preserve">{{ </w:t>
+            </w:r>
+            <w:proofErr w:type="spellStart"/>
+            <w:r>
+              <w:t>cap</w:t>
+            </w:r>
+            <w:proofErr w:type="gramEnd"/>
+            <w:r>
+              <w:t>_summary</w:t>
+            </w:r>
+            <w:proofErr w:type="spellEnd"/>
+            <w:r>
+              <w:t xml:space="preserve"> }}</w:t>
             </w:r>
           </w:p>
         </w:tc>
@@ -2659,8 +3582,21 @@
             <w:hideMark/>
           </w:tcPr>
           <w:p>
-            <w:r>
-              <w:t>{{ mdr_provider }}</w:t>
+            <w:proofErr w:type="gramStart"/>
+            <w:r>
+              <w:t xml:space="preserve">{{ </w:t>
+            </w:r>
+            <w:proofErr w:type="spellStart"/>
+            <w:r>
+              <w:t>mdr</w:t>
+            </w:r>
+            <w:proofErr w:type="gramEnd"/>
+            <w:r>
+              <w:t>_provider</w:t>
+            </w:r>
+            <w:proofErr w:type="spellEnd"/>
+            <w:r>
+              <w:t xml:space="preserve"> }}</w:t>
             </w:r>
           </w:p>
         </w:tc>
@@ -2716,8 +3652,13 @@
             <w:hideMark/>
           </w:tcPr>
           <w:p>
-            <w:r>
-              <w:t>{{ endpoint }}</w:t>
+            <w:proofErr w:type="gramStart"/>
+            <w:r>
+              <w:t>{{ endpoint</w:t>
+            </w:r>
+            <w:proofErr w:type="gramEnd"/>
+            <w:r>
+              <w:t xml:space="preserve"> }}</w:t>
             </w:r>
           </w:p>
         </w:tc>
@@ -2777,8 +3718,21 @@
             <w:vAlign w:val="center"/>
           </w:tcPr>
           <w:p>
-            <w:r>
-              <w:t>{{ endpoint_posture }}</w:t>
+            <w:proofErr w:type="gramStart"/>
+            <w:r>
+              <w:t xml:space="preserve">{{ </w:t>
+            </w:r>
+            <w:proofErr w:type="spellStart"/>
+            <w:r>
+              <w:t>endpoint</w:t>
+            </w:r>
+            <w:proofErr w:type="gramEnd"/>
+            <w:r>
+              <w:t>_posture</w:t>
+            </w:r>
+            <w:proofErr w:type="spellEnd"/>
+            <w:r>
+              <w:t xml:space="preserve"> }}</w:t>
             </w:r>
           </w:p>
         </w:tc>
@@ -2834,8 +3788,13 @@
             <w:hideMark/>
           </w:tcPr>
           <w:p>
-            <w:r>
-              <w:t>{{ firewall }}</w:t>
+            <w:proofErr w:type="gramStart"/>
+            <w:r>
+              <w:t>{{ firewall</w:t>
+            </w:r>
+            <w:proofErr w:type="gramEnd"/>
+            <w:r>
+              <w:t xml:space="preserve"> }}</w:t>
             </w:r>
           </w:p>
         </w:tc>
@@ -2891,8 +3850,13 @@
             <w:hideMark/>
           </w:tcPr>
           <w:p>
-            <w:r>
-              <w:t>{{ identity }}</w:t>
+            <w:proofErr w:type="gramStart"/>
+            <w:r>
+              <w:t>{{ identity</w:t>
+            </w:r>
+            <w:proofErr w:type="gramEnd"/>
+            <w:r>
+              <w:t xml:space="preserve"> }}</w:t>
             </w:r>
           </w:p>
         </w:tc>
@@ -2948,8 +3912,13 @@
             <w:hideMark/>
           </w:tcPr>
           <w:p>
-            <w:r>
-              <w:t>{{ email }}</w:t>
+            <w:proofErr w:type="gramStart"/>
+            <w:r>
+              <w:t>{{ email</w:t>
+            </w:r>
+            <w:proofErr w:type="gramEnd"/>
+            <w:r>
+              <w:t xml:space="preserve"> }}</w:t>
             </w:r>
           </w:p>
         </w:tc>
@@ -3005,8 +3974,13 @@
             <w:hideMark/>
           </w:tcPr>
           <w:p>
-            <w:r>
-              <w:t>{{ savviness }}</w:t>
+            <w:proofErr w:type="gramStart"/>
+            <w:r>
+              <w:t>{{ savviness</w:t>
+            </w:r>
+            <w:proofErr w:type="gramEnd"/>
+            <w:r>
+              <w:t xml:space="preserve"> }}</w:t>
             </w:r>
           </w:p>
         </w:tc>
@@ -3062,8 +4036,21 @@
             <w:hideMark/>
           </w:tcPr>
           <w:p>
-            <w:r>
-              <w:t>{{ in_house_team }}</w:t>
+            <w:proofErr w:type="gramStart"/>
+            <w:r>
+              <w:t xml:space="preserve">{{ </w:t>
+            </w:r>
+            <w:proofErr w:type="spellStart"/>
+            <w:r>
+              <w:t>in</w:t>
+            </w:r>
+            <w:proofErr w:type="gramEnd"/>
+            <w:r>
+              <w:t>_house_team</w:t>
+            </w:r>
+            <w:proofErr w:type="spellEnd"/>
+            <w:r>
+              <w:t xml:space="preserve"> }}</w:t>
             </w:r>
           </w:p>
         </w:tc>
@@ -3119,8 +4106,21 @@
             <w:hideMark/>
           </w:tcPr>
           <w:p>
-            <w:r>
-              <w:t>{{ pentest_status }}</w:t>
+            <w:proofErr w:type="gramStart"/>
+            <w:r>
+              <w:t xml:space="preserve">{{ </w:t>
+            </w:r>
+            <w:proofErr w:type="spellStart"/>
+            <w:r>
+              <w:t>pentest</w:t>
+            </w:r>
+            <w:proofErr w:type="gramEnd"/>
+            <w:r>
+              <w:t>_status</w:t>
+            </w:r>
+            <w:proofErr w:type="spellEnd"/>
+            <w:r>
+              <w:t xml:space="preserve"> }}</w:t>
             </w:r>
           </w:p>
         </w:tc>
@@ -3176,8 +4176,21 @@
             <w:hideMark/>
           </w:tcPr>
           <w:p>
-            <w:r>
-              <w:t>{{ vuln_scanning }}</w:t>
+            <w:proofErr w:type="gramStart"/>
+            <w:r>
+              <w:t xml:space="preserve">{{ </w:t>
+            </w:r>
+            <w:proofErr w:type="spellStart"/>
+            <w:r>
+              <w:t>vuln</w:t>
+            </w:r>
+            <w:proofErr w:type="gramEnd"/>
+            <w:r>
+              <w:t>_scanning</w:t>
+            </w:r>
+            <w:proofErr w:type="spellEnd"/>
+            <w:r>
+              <w:t xml:space="preserve"> }}</w:t>
             </w:r>
           </w:p>
         </w:tc>
@@ -3328,8 +4341,13 @@
             <w:hideMark/>
           </w:tcPr>
           <w:p>
-            <w:r>
-              <w:t>{{ backups }}</w:t>
+            <w:proofErr w:type="gramStart"/>
+            <w:r>
+              <w:t>{{ backups</w:t>
+            </w:r>
+            <w:proofErr w:type="gramEnd"/>
+            <w:r>
+              <w:t xml:space="preserve"> }}</w:t>
             </w:r>
           </w:p>
         </w:tc>
@@ -3385,8 +4403,21 @@
             <w:hideMark/>
           </w:tcPr>
           <w:p>
-            <w:r>
-              <w:t>{{ saas_backup }}</w:t>
+            <w:proofErr w:type="gramStart"/>
+            <w:r>
+              <w:t xml:space="preserve">{{ </w:t>
+            </w:r>
+            <w:proofErr w:type="spellStart"/>
+            <w:r>
+              <w:t>saas</w:t>
+            </w:r>
+            <w:proofErr w:type="gramEnd"/>
+            <w:r>
+              <w:t>_backup</w:t>
+            </w:r>
+            <w:proofErr w:type="spellEnd"/>
+            <w:r>
+              <w:t xml:space="preserve"> }}</w:t>
             </w:r>
           </w:p>
         </w:tc>
@@ -3442,8 +4473,21 @@
             <w:hideMark/>
           </w:tcPr>
           <w:p>
-            <w:r>
-              <w:t>{{ remote_access }}</w:t>
+            <w:proofErr w:type="gramStart"/>
+            <w:r>
+              <w:t xml:space="preserve">{{ </w:t>
+            </w:r>
+            <w:proofErr w:type="spellStart"/>
+            <w:r>
+              <w:t>remote</w:t>
+            </w:r>
+            <w:proofErr w:type="gramEnd"/>
+            <w:r>
+              <w:t>_access</w:t>
+            </w:r>
+            <w:proofErr w:type="spellEnd"/>
+            <w:r>
+              <w:t xml:space="preserve"> }}</w:t>
             </w:r>
           </w:p>
         </w:tc>
@@ -3499,8 +4543,21 @@
             <w:hideMark/>
           </w:tcPr>
           <w:p>
-            <w:r>
-              <w:t>{{ ir_readiness }}</w:t>
+            <w:proofErr w:type="gramStart"/>
+            <w:r>
+              <w:t xml:space="preserve">{{ </w:t>
+            </w:r>
+            <w:proofErr w:type="spellStart"/>
+            <w:r>
+              <w:t>ir</w:t>
+            </w:r>
+            <w:proofErr w:type="gramEnd"/>
+            <w:r>
+              <w:t>_readiness</w:t>
+            </w:r>
+            <w:proofErr w:type="spellEnd"/>
+            <w:r>
+              <w:t xml:space="preserve"> }}</w:t>
             </w:r>
           </w:p>
         </w:tc>
@@ -3556,8 +4613,21 @@
             <w:hideMark/>
           </w:tcPr>
           <w:p>
-            <w:r>
-              <w:t>{{ mfa_status }}</w:t>
+            <w:proofErr w:type="gramStart"/>
+            <w:r>
+              <w:t xml:space="preserve">{{ </w:t>
+            </w:r>
+            <w:proofErr w:type="spellStart"/>
+            <w:r>
+              <w:t>mfa</w:t>
+            </w:r>
+            <w:proofErr w:type="gramEnd"/>
+            <w:r>
+              <w:t>_status</w:t>
+            </w:r>
+            <w:proofErr w:type="spellEnd"/>
+            <w:r>
+              <w:t xml:space="preserve"> }}</w:t>
             </w:r>
           </w:p>
         </w:tc>
@@ -3613,8 +4683,13 @@
             <w:hideMark/>
           </w:tcPr>
           <w:p>
-            <w:r>
-              <w:t>{{ patching }}</w:t>
+            <w:proofErr w:type="gramStart"/>
+            <w:r>
+              <w:t>{{ patching</w:t>
+            </w:r>
+            <w:proofErr w:type="gramEnd"/>
+            <w:r>
+              <w:t xml:space="preserve"> }}</w:t>
             </w:r>
           </w:p>
         </w:tc>
@@ -3670,8 +4745,13 @@
             <w:hideMark/>
           </w:tcPr>
           <w:p>
-            <w:r>
-              <w:t>{{ insurance }}</w:t>
+            <w:proofErr w:type="gramStart"/>
+            <w:r>
+              <w:t>{{ insurance</w:t>
+            </w:r>
+            <w:proofErr w:type="gramEnd"/>
+            <w:r>
+              <w:t xml:space="preserve"> }}</w:t>
             </w:r>
           </w:p>
         </w:tc>
@@ -3704,8 +4784,17 @@
                 <w:b/>
                 <w:bCs/>
               </w:rPr>
-              <w:t>Outage Tolerence</w:t>
-            </w:r>
+              <w:t xml:space="preserve">Outage </w:t>
+            </w:r>
+            <w:proofErr w:type="spellStart"/>
+            <w:r>
+              <w:rPr>
+                <w:b/>
+                <w:bCs/>
+              </w:rPr>
+              <w:t>Tolerence</w:t>
+            </w:r>
+            <w:proofErr w:type="spellEnd"/>
           </w:p>
         </w:tc>
         <w:tc>
@@ -3727,8 +4816,18 @@
             <w:hideMark/>
           </w:tcPr>
           <w:p>
-            <w:r>
-              <w:t>{{ rto }}</w:t>
+            <w:proofErr w:type="gramStart"/>
+            <w:r>
+              <w:t xml:space="preserve">{{ </w:t>
+            </w:r>
+            <w:proofErr w:type="spellStart"/>
+            <w:r>
+              <w:t>rto</w:t>
+            </w:r>
+            <w:proofErr w:type="spellEnd"/>
+            <w:proofErr w:type="gramEnd"/>
+            <w:r>
+              <w:t xml:space="preserve"> }}</w:t>
             </w:r>
           </w:p>
         </w:tc>
@@ -3768,8 +4867,29 @@
         </w:rPr>
         <w:t xml:space="preserve">Domain: </w:t>
       </w:r>
-      <w:r>
-        <w:t>{{ d.domain_name }}</w:t>
+      <w:proofErr w:type="gramStart"/>
+      <w:r>
+        <w:t xml:space="preserve">{{ </w:t>
+      </w:r>
+      <w:proofErr w:type="spellStart"/>
+      <w:r>
+        <w:t>d</w:t>
+      </w:r>
+      <w:proofErr w:type="gramEnd"/>
+      <w:r>
+        <w:t>.domain_</w:t>
+      </w:r>
+      <w:proofErr w:type="gramStart"/>
+      <w:r>
+        <w:t>name</w:t>
+      </w:r>
+      <w:proofErr w:type="spellEnd"/>
+      <w:r>
+        <w:t xml:space="preserve"> }</w:t>
+      </w:r>
+      <w:proofErr w:type="gramEnd"/>
+      <w:r>
+        <w:t>}</w:t>
       </w:r>
     </w:p>
     <w:p/>
@@ -3917,8 +5037,21 @@
             <w:hideMark/>
           </w:tcPr>
           <w:p>
-            <w:r>
-              <w:t>{{ d.current_maturity_level }}</w:t>
+            <w:proofErr w:type="gramStart"/>
+            <w:r>
+              <w:t xml:space="preserve">{{ </w:t>
+            </w:r>
+            <w:proofErr w:type="spellStart"/>
+            <w:r>
+              <w:t>d</w:t>
+            </w:r>
+            <w:proofErr w:type="gramEnd"/>
+            <w:r>
+              <w:t>.current_maturity_level</w:t>
+            </w:r>
+            <w:proofErr w:type="spellEnd"/>
+            <w:r>
+              <w:t xml:space="preserve"> }}</w:t>
             </w:r>
           </w:p>
         </w:tc>
@@ -3974,8 +5107,21 @@
             <w:hideMark/>
           </w:tcPr>
           <w:p>
-            <w:r>
-              <w:t>{{ d.current_state_analysis }}</w:t>
+            <w:proofErr w:type="gramStart"/>
+            <w:r>
+              <w:t xml:space="preserve">{{ </w:t>
+            </w:r>
+            <w:proofErr w:type="spellStart"/>
+            <w:r>
+              <w:t>d</w:t>
+            </w:r>
+            <w:proofErr w:type="gramEnd"/>
+            <w:r>
+              <w:t>.current_state_analysis</w:t>
+            </w:r>
+            <w:proofErr w:type="spellEnd"/>
+            <w:r>
+              <w:t xml:space="preserve"> }}</w:t>
             </w:r>
           </w:p>
         </w:tc>
@@ -4031,8 +5177,21 @@
             <w:hideMark/>
           </w:tcPr>
           <w:p>
-            <w:r>
-              <w:t>{{ d.business_impact_narrative }}</w:t>
+            <w:proofErr w:type="gramStart"/>
+            <w:r>
+              <w:t xml:space="preserve">{{ </w:t>
+            </w:r>
+            <w:proofErr w:type="spellStart"/>
+            <w:r>
+              <w:t>d</w:t>
+            </w:r>
+            <w:proofErr w:type="gramEnd"/>
+            <w:r>
+              <w:t>.business_impact_narrative</w:t>
+            </w:r>
+            <w:proofErr w:type="spellEnd"/>
+            <w:r>
+              <w:t xml:space="preserve"> }}</w:t>
             </w:r>
           </w:p>
         </w:tc>
@@ -4089,11 +5248,74 @@
           </w:tcPr>
           <w:p>
             <w:r>
-              <w:t>{% for gap in d.critical_gaps %}• {{ gap }}{% if not loop.last %}</w:t>
+              <w:t xml:space="preserve">{% for gap in </w:t>
+            </w:r>
+            <w:proofErr w:type="spellStart"/>
+            <w:proofErr w:type="gramStart"/>
+            <w:r>
+              <w:t>d.critical</w:t>
+            </w:r>
+            <w:proofErr w:type="gramEnd"/>
+            <w:r>
+              <w:t>_gaps</w:t>
+            </w:r>
+            <w:proofErr w:type="spellEnd"/>
+            <w:r>
+              <w:t xml:space="preserve"> </w:t>
+            </w:r>
+            <w:proofErr w:type="gramStart"/>
+            <w:r>
+              <w:t>%}•</w:t>
+            </w:r>
+            <w:proofErr w:type="gramEnd"/>
+            <w:r>
+              <w:t xml:space="preserve"> </w:t>
+            </w:r>
+            <w:proofErr w:type="gramStart"/>
+            <w:r>
+              <w:t>{{ gap</w:t>
+            </w:r>
+            <w:proofErr w:type="gramEnd"/>
+            <w:r>
+              <w:t xml:space="preserve"> </w:t>
+            </w:r>
+            <w:proofErr w:type="gramStart"/>
+            <w:r>
+              <w:t>}}{</w:t>
+            </w:r>
+            <w:proofErr w:type="gramEnd"/>
+            <w:r>
+              <w:t xml:space="preserve">% if not </w:t>
+            </w:r>
+            <w:proofErr w:type="spellStart"/>
+            <w:proofErr w:type="gramStart"/>
+            <w:r>
+              <w:t>loop.last</w:t>
+            </w:r>
+            <w:proofErr w:type="spellEnd"/>
+            <w:proofErr w:type="gramEnd"/>
+            <w:r>
+              <w:t xml:space="preserve"> %}</w:t>
             </w:r>
             <w:r>
               <w:br/>
-              <w:t>{% endif %}{% endfor %}</w:t>
+              <w:t xml:space="preserve">{% endif </w:t>
+            </w:r>
+            <w:proofErr w:type="gramStart"/>
+            <w:r>
+              <w:t>%}{</w:t>
+            </w:r>
+            <w:proofErr w:type="gramEnd"/>
+            <w:r>
+              <w:t xml:space="preserve">% </w:t>
+            </w:r>
+            <w:proofErr w:type="spellStart"/>
+            <w:r>
+              <w:t>endfor</w:t>
+            </w:r>
+            <w:proofErr w:type="spellEnd"/>
+            <w:r>
+              <w:t xml:space="preserve"> %}</w:t>
             </w:r>
           </w:p>
         </w:tc>
@@ -4150,11 +5372,74 @@
           </w:tcPr>
           <w:p>
             <w:r>
-              <w:t>{% for win in d.vendor_agnostic_quick_wins %}• {{ win }}{% if not loop.last %}</w:t>
+              <w:t xml:space="preserve">{% for win in </w:t>
+            </w:r>
+            <w:proofErr w:type="spellStart"/>
+            <w:proofErr w:type="gramStart"/>
+            <w:r>
+              <w:t>d.vendor</w:t>
+            </w:r>
+            <w:proofErr w:type="gramEnd"/>
+            <w:r>
+              <w:t>_agnostic_quick_wins</w:t>
+            </w:r>
+            <w:proofErr w:type="spellEnd"/>
+            <w:r>
+              <w:t xml:space="preserve"> </w:t>
+            </w:r>
+            <w:proofErr w:type="gramStart"/>
+            <w:r>
+              <w:t>%}•</w:t>
+            </w:r>
+            <w:proofErr w:type="gramEnd"/>
+            <w:r>
+              <w:t xml:space="preserve"> </w:t>
+            </w:r>
+            <w:proofErr w:type="gramStart"/>
+            <w:r>
+              <w:t>{{ win</w:t>
+            </w:r>
+            <w:proofErr w:type="gramEnd"/>
+            <w:r>
+              <w:t xml:space="preserve"> </w:t>
+            </w:r>
+            <w:proofErr w:type="gramStart"/>
+            <w:r>
+              <w:t>}}{</w:t>
+            </w:r>
+            <w:proofErr w:type="gramEnd"/>
+            <w:r>
+              <w:t xml:space="preserve">% if not </w:t>
+            </w:r>
+            <w:proofErr w:type="spellStart"/>
+            <w:proofErr w:type="gramStart"/>
+            <w:r>
+              <w:t>loop.last</w:t>
+            </w:r>
+            <w:proofErr w:type="spellEnd"/>
+            <w:proofErr w:type="gramEnd"/>
+            <w:r>
+              <w:t xml:space="preserve"> %}</w:t>
             </w:r>
             <w:r>
               <w:br/>
-              <w:t>{% endif %}{% endfor %}</w:t>
+              <w:t xml:space="preserve">{% endif </w:t>
+            </w:r>
+            <w:proofErr w:type="gramStart"/>
+            <w:r>
+              <w:t>%}{</w:t>
+            </w:r>
+            <w:proofErr w:type="gramEnd"/>
+            <w:r>
+              <w:t xml:space="preserve">% </w:t>
+            </w:r>
+            <w:proofErr w:type="spellStart"/>
+            <w:r>
+              <w:t>endfor</w:t>
+            </w:r>
+            <w:proofErr w:type="spellEnd"/>
+            <w:r>
+              <w:t xml:space="preserve"> %}</w:t>
             </w:r>
           </w:p>
         </w:tc>
@@ -4211,11 +5496,74 @@
           </w:tcPr>
           <w:p>
             <w:r>
-              <w:t>{% for sol in d.recommended_solutions %}• {{ sol }}{% if not loop.last %}</w:t>
+              <w:t xml:space="preserve">{% for sol in </w:t>
+            </w:r>
+            <w:proofErr w:type="spellStart"/>
+            <w:proofErr w:type="gramStart"/>
+            <w:r>
+              <w:t>d.recommended</w:t>
+            </w:r>
+            <w:proofErr w:type="gramEnd"/>
+            <w:r>
+              <w:t>_solutions</w:t>
+            </w:r>
+            <w:proofErr w:type="spellEnd"/>
+            <w:r>
+              <w:t xml:space="preserve"> </w:t>
+            </w:r>
+            <w:proofErr w:type="gramStart"/>
+            <w:r>
+              <w:t>%}•</w:t>
+            </w:r>
+            <w:proofErr w:type="gramEnd"/>
+            <w:r>
+              <w:t xml:space="preserve"> </w:t>
+            </w:r>
+            <w:proofErr w:type="gramStart"/>
+            <w:r>
+              <w:t>{{ sol</w:t>
+            </w:r>
+            <w:proofErr w:type="gramEnd"/>
+            <w:r>
+              <w:t xml:space="preserve"> </w:t>
+            </w:r>
+            <w:proofErr w:type="gramStart"/>
+            <w:r>
+              <w:t>}}{</w:t>
+            </w:r>
+            <w:proofErr w:type="gramEnd"/>
+            <w:r>
+              <w:t xml:space="preserve">% if not </w:t>
+            </w:r>
+            <w:proofErr w:type="spellStart"/>
+            <w:proofErr w:type="gramStart"/>
+            <w:r>
+              <w:t>loop.last</w:t>
+            </w:r>
+            <w:proofErr w:type="spellEnd"/>
+            <w:proofErr w:type="gramEnd"/>
+            <w:r>
+              <w:t xml:space="preserve"> %}</w:t>
             </w:r>
             <w:r>
               <w:br/>
-              <w:t>{% endif %}{% endfor %}</w:t>
+              <w:t xml:space="preserve">{% endif </w:t>
+            </w:r>
+            <w:proofErr w:type="gramStart"/>
+            <w:r>
+              <w:t>%}{</w:t>
+            </w:r>
+            <w:proofErr w:type="gramEnd"/>
+            <w:r>
+              <w:t xml:space="preserve">% </w:t>
+            </w:r>
+            <w:proofErr w:type="spellStart"/>
+            <w:r>
+              <w:t>endfor</w:t>
+            </w:r>
+            <w:proofErr w:type="spellEnd"/>
+            <w:r>
+              <w:t xml:space="preserve"> %}</w:t>
             </w:r>
           </w:p>
         </w:tc>
@@ -4271,8 +5619,21 @@
             <w:hideMark/>
           </w:tcPr>
           <w:p>
-            <w:r>
-              <w:t>{{ d.remediation_rationale }}</w:t>
+            <w:proofErr w:type="gramStart"/>
+            <w:r>
+              <w:t xml:space="preserve">{{ </w:t>
+            </w:r>
+            <w:proofErr w:type="spellStart"/>
+            <w:r>
+              <w:t>d</w:t>
+            </w:r>
+            <w:proofErr w:type="gramEnd"/>
+            <w:r>
+              <w:t>.remediation_rationale</w:t>
+            </w:r>
+            <w:proofErr w:type="spellEnd"/>
+            <w:r>
+              <w:t xml:space="preserve"> }}</w:t>
             </w:r>
           </w:p>
         </w:tc>
@@ -4332,8 +5693,21 @@
             <w:vAlign w:val="center"/>
           </w:tcPr>
           <w:p>
-            <w:r>
-              <w:t>{{ d.shared_responsibility }}</w:t>
+            <w:proofErr w:type="gramStart"/>
+            <w:r>
+              <w:t xml:space="preserve">{{ </w:t>
+            </w:r>
+            <w:proofErr w:type="spellStart"/>
+            <w:r>
+              <w:t>d</w:t>
+            </w:r>
+            <w:proofErr w:type="gramEnd"/>
+            <w:r>
+              <w:t>.shared_responsibility</w:t>
+            </w:r>
+            <w:proofErr w:type="spellEnd"/>
+            <w:r>
+              <w:t xml:space="preserve"> }}</w:t>
             </w:r>
           </w:p>
         </w:tc>
@@ -4344,7 +5718,15 @@
         <w:pStyle w:val="BodyText"/>
       </w:pPr>
       <w:r>
-        <w:t>{% endfor %}</w:t>
+        <w:t xml:space="preserve">{% </w:t>
+      </w:r>
+      <w:proofErr w:type="spellStart"/>
+      <w:r>
+        <w:t>endfor</w:t>
+      </w:r>
+      <w:proofErr w:type="spellEnd"/>
+      <w:r>
+        <w:t xml:space="preserve"> %}</w:t>
       </w:r>
     </w:p>
     <w:p>
@@ -4365,8 +5747,29 @@
       </w:r>
     </w:p>
     <w:p>
-      <w:r>
-        <w:t>{{ proactive_testing_programme }}</w:t>
+      <w:proofErr w:type="gramStart"/>
+      <w:r>
+        <w:t xml:space="preserve">{{ </w:t>
+      </w:r>
+      <w:proofErr w:type="spellStart"/>
+      <w:r>
+        <w:t>proactive</w:t>
+      </w:r>
+      <w:proofErr w:type="gramEnd"/>
+      <w:r>
+        <w:t>_testing_</w:t>
+      </w:r>
+      <w:proofErr w:type="gramStart"/>
+      <w:r>
+        <w:t>programme</w:t>
+      </w:r>
+      <w:proofErr w:type="spellEnd"/>
+      <w:r>
+        <w:t xml:space="preserve"> }</w:t>
+      </w:r>
+      <w:proofErr w:type="gramEnd"/>
+      <w:r>
+        <w:t>}</w:t>
       </w:r>
     </w:p>
     <w:p/>
@@ -4379,8 +5782,29 @@
       </w:r>
     </w:p>
     <w:p>
-      <w:r>
-        <w:t>{{ incident_response_plan_outline }}</w:t>
+      <w:proofErr w:type="gramStart"/>
+      <w:r>
+        <w:t xml:space="preserve">{{ </w:t>
+      </w:r>
+      <w:proofErr w:type="spellStart"/>
+      <w:r>
+        <w:t>incident</w:t>
+      </w:r>
+      <w:proofErr w:type="gramEnd"/>
+      <w:r>
+        <w:t>_response_plan_</w:t>
+      </w:r>
+      <w:proofErr w:type="gramStart"/>
+      <w:r>
+        <w:t>outline</w:t>
+      </w:r>
+      <w:proofErr w:type="spellEnd"/>
+      <w:r>
+        <w:t xml:space="preserve"> }</w:t>
+      </w:r>
+      <w:proofErr w:type="gramEnd"/>
+      <w:r>
+        <w:t>}</w:t>
       </w:r>
     </w:p>
     <w:p/>
@@ -4393,8 +5817,29 @@
       </w:r>
     </w:p>
     <w:p>
-      <w:r>
-        <w:t>{{ disaster_recovery_plan_outline }}</w:t>
+      <w:proofErr w:type="gramStart"/>
+      <w:r>
+        <w:t xml:space="preserve">{{ </w:t>
+      </w:r>
+      <w:proofErr w:type="spellStart"/>
+      <w:r>
+        <w:t>disaster</w:t>
+      </w:r>
+      <w:proofErr w:type="gramEnd"/>
+      <w:r>
+        <w:t>_recovery_plan_</w:t>
+      </w:r>
+      <w:proofErr w:type="gramStart"/>
+      <w:r>
+        <w:t>outline</w:t>
+      </w:r>
+      <w:proofErr w:type="spellEnd"/>
+      <w:r>
+        <w:t xml:space="preserve"> }</w:t>
+      </w:r>
+      <w:proofErr w:type="gramEnd"/>
+      <w:r>
+        <w:t>}</w:t>
       </w:r>
     </w:p>
     <w:p/>
@@ -4480,7 +5925,39 @@
     <w:p/>
     <w:p>
       <w:r>
-        <w:t>These phases delineate the strategies required to implement a robust security, goveneance and compliance solution to effectively defend {{ customer_name }} moving forward.  The phases are made up as such:</w:t>
+        <w:t xml:space="preserve">These phases delineate the strategies required to implement a robust security, </w:t>
+      </w:r>
+      <w:proofErr w:type="spellStart"/>
+      <w:r>
+        <w:t>goveneance</w:t>
+      </w:r>
+      <w:proofErr w:type="spellEnd"/>
+      <w:r>
+        <w:t xml:space="preserve"> and compliance solution to effectively defend </w:t>
+      </w:r>
+      <w:proofErr w:type="gramStart"/>
+      <w:r>
+        <w:t xml:space="preserve">{{ </w:t>
+      </w:r>
+      <w:proofErr w:type="spellStart"/>
+      <w:r>
+        <w:t>customer</w:t>
+      </w:r>
+      <w:proofErr w:type="gramEnd"/>
+      <w:r>
+        <w:t>_</w:t>
+      </w:r>
+      <w:proofErr w:type="gramStart"/>
+      <w:r>
+        <w:t>name</w:t>
+      </w:r>
+      <w:proofErr w:type="spellEnd"/>
+      <w:r>
+        <w:t xml:space="preserve"> }</w:t>
+      </w:r>
+      <w:proofErr w:type="gramEnd"/>
+      <w:r>
+        <w:t>} moving forward.  The phases are made up as such:</w:t>
       </w:r>
     </w:p>
     <w:p/>
@@ -4880,13 +6357,59 @@
         </w:rPr>
         <w:t xml:space="preserve">Please find below a bespoke roadmap of suggested improvements tailored for </w:t>
       </w:r>
+      <w:proofErr w:type="gramStart"/>
       <w:r>
         <w:rPr>
           <w:rFonts w:ascii="Roboto" w:hAnsi="Roboto"/>
           <w:sz w:val="20"/>
           <w:szCs w:val="20"/>
         </w:rPr>
-        <w:t>{{ customer_name }}</w:t>
+        <w:t xml:space="preserve">{{ </w:t>
+      </w:r>
+      <w:proofErr w:type="spellStart"/>
+      <w:r>
+        <w:rPr>
+          <w:rFonts w:ascii="Roboto" w:hAnsi="Roboto"/>
+          <w:sz w:val="20"/>
+          <w:szCs w:val="20"/>
+        </w:rPr>
+        <w:t>customer</w:t>
+      </w:r>
+      <w:proofErr w:type="gramEnd"/>
+      <w:r>
+        <w:rPr>
+          <w:rFonts w:ascii="Roboto" w:hAnsi="Roboto"/>
+          <w:sz w:val="20"/>
+          <w:szCs w:val="20"/>
+        </w:rPr>
+        <w:t>_</w:t>
+      </w:r>
+      <w:proofErr w:type="gramStart"/>
+      <w:r>
+        <w:rPr>
+          <w:rFonts w:ascii="Roboto" w:hAnsi="Roboto"/>
+          <w:sz w:val="20"/>
+          <w:szCs w:val="20"/>
+        </w:rPr>
+        <w:t>name</w:t>
+      </w:r>
+      <w:proofErr w:type="spellEnd"/>
+      <w:r>
+        <w:rPr>
+          <w:rFonts w:ascii="Roboto" w:hAnsi="Roboto"/>
+          <w:sz w:val="20"/>
+          <w:szCs w:val="20"/>
+        </w:rPr>
+        <w:t xml:space="preserve"> }</w:t>
+      </w:r>
+      <w:proofErr w:type="gramEnd"/>
+      <w:r>
+        <w:rPr>
+          <w:rFonts w:ascii="Roboto" w:hAnsi="Roboto"/>
+          <w:sz w:val="20"/>
+          <w:szCs w:val="20"/>
+        </w:rPr>
+        <w:t>}</w:t>
       </w:r>
       <w:r>
         <w:rPr>
@@ -4907,14 +6430,32 @@
     </w:p>
     <w:p/>
     <w:p>
+      <w:proofErr w:type="gramStart"/>
       <w:r>
         <w:t>{{</w:t>
       </w:r>
       <w:r>
-        <w:t xml:space="preserve"> partnership_details</w:t>
-      </w:r>
-      <w:r>
-        <w:t xml:space="preserve"> }}</w:t>
+        <w:t xml:space="preserve"> </w:t>
+      </w:r>
+      <w:proofErr w:type="spellStart"/>
+      <w:r>
+        <w:t>partnership</w:t>
+      </w:r>
+      <w:proofErr w:type="gramEnd"/>
+      <w:r>
+        <w:t>_</w:t>
+      </w:r>
+      <w:proofErr w:type="gramStart"/>
+      <w:r>
+        <w:t>details</w:t>
+      </w:r>
+      <w:proofErr w:type="spellEnd"/>
+      <w:r>
+        <w:t xml:space="preserve"> }</w:t>
+      </w:r>
+      <w:proofErr w:type="gramEnd"/>
+      <w:r>
+        <w:t>}</w:t>
       </w:r>
     </w:p>
     <w:p>
@@ -5073,11 +6614,26 @@
             <w:hideMark/>
           </w:tcPr>
           <w:p>
+            <w:proofErr w:type="gramStart"/>
             <w:r>
               <w:rPr>
                 <w:rFonts w:cs="Courier New"/>
               </w:rPr>
-              <w:t>{{ r.phase_</w:t>
+              <w:t xml:space="preserve">{{ </w:t>
+            </w:r>
+            <w:proofErr w:type="spellStart"/>
+            <w:r>
+              <w:rPr>
+                <w:rFonts w:cs="Courier New"/>
+              </w:rPr>
+              <w:t>r</w:t>
+            </w:r>
+            <w:proofErr w:type="gramEnd"/>
+            <w:r>
+              <w:rPr>
+                <w:rFonts w:cs="Courier New"/>
+              </w:rPr>
+              <w:t>.phase_</w:t>
             </w:r>
             <w:r>
               <w:rPr>
@@ -5085,6 +6641,7 @@
               </w:rPr>
               <w:t>title</w:t>
             </w:r>
+            <w:proofErr w:type="spellEnd"/>
             <w:r>
               <w:rPr>
                 <w:rFonts w:cs="Courier New"/>
@@ -5154,11 +6711,33 @@
                 <w:rFonts w:cs="Courier New"/>
               </w:rPr>
             </w:pPr>
+            <w:proofErr w:type="gramStart"/>
             <w:r>
               <w:rPr>
                 <w:rFonts w:cs="Courier New"/>
               </w:rPr>
-              <w:t>{{ r.timeline }}</w:t>
+              <w:t xml:space="preserve">{{ </w:t>
+            </w:r>
+            <w:proofErr w:type="spellStart"/>
+            <w:r>
+              <w:rPr>
+                <w:rFonts w:cs="Courier New"/>
+              </w:rPr>
+              <w:t>r</w:t>
+            </w:r>
+            <w:proofErr w:type="gramEnd"/>
+            <w:r>
+              <w:rPr>
+                <w:rFonts w:cs="Courier New"/>
+              </w:rPr>
+              <w:t>.timeline</w:t>
+            </w:r>
+            <w:proofErr w:type="spellEnd"/>
+            <w:r>
+              <w:rPr>
+                <w:rFonts w:cs="Courier New"/>
+              </w:rPr>
+              <w:t xml:space="preserve"> }}</w:t>
             </w:r>
           </w:p>
         </w:tc>
@@ -5214,11 +6793,33 @@
             <w:hideMark/>
           </w:tcPr>
           <w:p>
+            <w:proofErr w:type="gramStart"/>
             <w:r>
               <w:rPr>
                 <w:rFonts w:cs="Courier New"/>
               </w:rPr>
-              <w:t>{{ r.primary_objective }}</w:t>
+              <w:t xml:space="preserve">{{ </w:t>
+            </w:r>
+            <w:proofErr w:type="spellStart"/>
+            <w:r>
+              <w:rPr>
+                <w:rFonts w:cs="Courier New"/>
+              </w:rPr>
+              <w:t>r</w:t>
+            </w:r>
+            <w:proofErr w:type="gramEnd"/>
+            <w:r>
+              <w:rPr>
+                <w:rFonts w:cs="Courier New"/>
+              </w:rPr>
+              <w:t>.primary_objective</w:t>
+            </w:r>
+            <w:proofErr w:type="spellEnd"/>
+            <w:r>
+              <w:rPr>
+                <w:rFonts w:cs="Courier New"/>
+              </w:rPr>
+              <w:t xml:space="preserve"> }}</w:t>
             </w:r>
           </w:p>
         </w:tc>
@@ -5283,11 +6884,33 @@
                 <w:rFonts w:cs="Courier New"/>
               </w:rPr>
             </w:pPr>
+            <w:proofErr w:type="gramStart"/>
             <w:r>
               <w:rPr>
                 <w:rFonts w:cs="Courier New"/>
               </w:rPr>
-              <w:t>{{ r.key_deliverables }}</w:t>
+              <w:t xml:space="preserve">{{ </w:t>
+            </w:r>
+            <w:proofErr w:type="spellStart"/>
+            <w:r>
+              <w:rPr>
+                <w:rFonts w:cs="Courier New"/>
+              </w:rPr>
+              <w:t>r.key</w:t>
+            </w:r>
+            <w:proofErr w:type="gramEnd"/>
+            <w:r>
+              <w:rPr>
+                <w:rFonts w:cs="Courier New"/>
+              </w:rPr>
+              <w:t>_deliverables</w:t>
+            </w:r>
+            <w:proofErr w:type="spellEnd"/>
+            <w:r>
+              <w:rPr>
+                <w:rFonts w:cs="Courier New"/>
+              </w:rPr>
+              <w:t xml:space="preserve"> }}</w:t>
             </w:r>
           </w:p>
         </w:tc>
@@ -5343,11 +6966,33 @@
             <w:hideMark/>
           </w:tcPr>
           <w:p>
+            <w:proofErr w:type="gramStart"/>
             <w:r>
               <w:rPr>
                 <w:rFonts w:cs="Courier New"/>
               </w:rPr>
-              <w:t>{{ r.estimated_effort }}</w:t>
+              <w:t xml:space="preserve">{{ </w:t>
+            </w:r>
+            <w:proofErr w:type="spellStart"/>
+            <w:r>
+              <w:rPr>
+                <w:rFonts w:cs="Courier New"/>
+              </w:rPr>
+              <w:t>r</w:t>
+            </w:r>
+            <w:proofErr w:type="gramEnd"/>
+            <w:r>
+              <w:rPr>
+                <w:rFonts w:cs="Courier New"/>
+              </w:rPr>
+              <w:t>.estimated_effort</w:t>
+            </w:r>
+            <w:proofErr w:type="spellEnd"/>
+            <w:r>
+              <w:rPr>
+                <w:rFonts w:cs="Courier New"/>
+              </w:rPr>
+              <w:t xml:space="preserve"> }}</w:t>
             </w:r>
           </w:p>
         </w:tc>
@@ -5407,7 +7052,37 @@
               <w:rPr>
                 <w:rFonts w:cs="Courier New"/>
               </w:rPr>
-              <w:t>{% for m in r.milestones %}</w:t>
+              <w:t xml:space="preserve">{% </w:t>
+            </w:r>
+            <w:proofErr w:type="spellStart"/>
+            <w:r>
+              <w:rPr>
+                <w:rFonts w:cs="Courier New"/>
+              </w:rPr>
+              <w:t>for m</w:t>
+            </w:r>
+            <w:proofErr w:type="spellEnd"/>
+            <w:r>
+              <w:rPr>
+                <w:rFonts w:cs="Courier New"/>
+              </w:rPr>
+              <w:t xml:space="preserve"> in </w:t>
+            </w:r>
+            <w:proofErr w:type="spellStart"/>
+            <w:proofErr w:type="gramStart"/>
+            <w:r>
+              <w:rPr>
+                <w:rFonts w:cs="Courier New"/>
+              </w:rPr>
+              <w:t>r.milestones</w:t>
+            </w:r>
+            <w:proofErr w:type="spellEnd"/>
+            <w:proofErr w:type="gramEnd"/>
+            <w:r>
+              <w:rPr>
+                <w:rFonts w:cs="Courier New"/>
+              </w:rPr>
+              <w:t xml:space="preserve"> %}</w:t>
             </w:r>
           </w:p>
           <w:p>
@@ -5416,7 +7091,21 @@
                 <w:rFonts w:cs="Courier New"/>
               </w:rPr>
               <w:lastRenderedPageBreak/>
-              <w:t>• {{ m }}</w:t>
+              <w:t xml:space="preserve">• </w:t>
+            </w:r>
+            <w:proofErr w:type="gramStart"/>
+            <w:r>
+              <w:rPr>
+                <w:rFonts w:cs="Courier New"/>
+              </w:rPr>
+              <w:t>{{ m</w:t>
+            </w:r>
+            <w:proofErr w:type="gramEnd"/>
+            <w:r>
+              <w:rPr>
+                <w:rFonts w:cs="Courier New"/>
+              </w:rPr>
+              <w:t xml:space="preserve"> }}</w:t>
             </w:r>
           </w:p>
           <w:p>
@@ -5430,7 +7119,21 @@
               <w:rPr>
                 <w:rFonts w:cs="Courier New"/>
               </w:rPr>
-              <w:t>{% endfor %}</w:t>
+              <w:t xml:space="preserve">{% </w:t>
+            </w:r>
+            <w:proofErr w:type="spellStart"/>
+            <w:r>
+              <w:rPr>
+                <w:rFonts w:cs="Courier New"/>
+              </w:rPr>
+              <w:t>endfor</w:t>
+            </w:r>
+            <w:proofErr w:type="spellEnd"/>
+            <w:r>
+              <w:rPr>
+                <w:rFonts w:cs="Courier New"/>
+              </w:rPr>
+              <w:t xml:space="preserve"> %}</w:t>
             </w:r>
           </w:p>
         </w:tc>
@@ -5487,11 +7190,33 @@
             <w:hideMark/>
           </w:tcPr>
           <w:p>
+            <w:proofErr w:type="gramStart"/>
             <w:r>
               <w:rPr>
                 <w:rFonts w:cs="Courier New"/>
               </w:rPr>
-              <w:t>{{ r.business_value_delivered }}</w:t>
+              <w:t xml:space="preserve">{{ </w:t>
+            </w:r>
+            <w:proofErr w:type="spellStart"/>
+            <w:r>
+              <w:rPr>
+                <w:rFonts w:cs="Courier New"/>
+              </w:rPr>
+              <w:t>r</w:t>
+            </w:r>
+            <w:proofErr w:type="gramEnd"/>
+            <w:r>
+              <w:rPr>
+                <w:rFonts w:cs="Courier New"/>
+              </w:rPr>
+              <w:t>.business_value_delivered</w:t>
+            </w:r>
+            <w:proofErr w:type="spellEnd"/>
+            <w:r>
+              <w:rPr>
+                <w:rFonts w:cs="Courier New"/>
+              </w:rPr>
+              <w:t xml:space="preserve"> }}</w:t>
             </w:r>
           </w:p>
         </w:tc>
@@ -5547,11 +7272,33 @@
             <w:hideMark/>
           </w:tcPr>
           <w:p>
+            <w:proofErr w:type="gramStart"/>
             <w:r>
               <w:rPr>
                 <w:rFonts w:cs="Courier New"/>
               </w:rPr>
-              <w:t>{{ r.resource_requirements }}</w:t>
+              <w:t xml:space="preserve">{{ </w:t>
+            </w:r>
+            <w:proofErr w:type="spellStart"/>
+            <w:r>
+              <w:rPr>
+                <w:rFonts w:cs="Courier New"/>
+              </w:rPr>
+              <w:t>r</w:t>
+            </w:r>
+            <w:proofErr w:type="gramEnd"/>
+            <w:r>
+              <w:rPr>
+                <w:rFonts w:cs="Courier New"/>
+              </w:rPr>
+              <w:t>.resource_requirements</w:t>
+            </w:r>
+            <w:proofErr w:type="spellEnd"/>
+            <w:r>
+              <w:rPr>
+                <w:rFonts w:cs="Courier New"/>
+              </w:rPr>
+              <w:t xml:space="preserve"> }}</w:t>
             </w:r>
           </w:p>
         </w:tc>
@@ -5569,7 +7316,21 @@
         <w:rPr>
           <w:rStyle w:val="HTMLCode"/>
         </w:rPr>
-        <w:t>{% endfor %}</w:t>
+        <w:t xml:space="preserve">{% </w:t>
+      </w:r>
+      <w:proofErr w:type="spellStart"/>
+      <w:r>
+        <w:rPr>
+          <w:rStyle w:val="HTMLCode"/>
+        </w:rPr>
+        <w:t>endfor</w:t>
+      </w:r>
+      <w:proofErr w:type="spellEnd"/>
+      <w:r>
+        <w:rPr>
+          <w:rStyle w:val="HTMLCode"/>
+        </w:rPr>
+        <w:t xml:space="preserve"> %}</w:t>
       </w:r>
     </w:p>
     <w:p>
@@ -5617,6 +7378,7 @@
         </w:rPr>
         <w:t xml:space="preserve">Disclaimer: this is a fictional breach scenario leveraging threat intelligence and known threat actor activity mapped to the current technology stack and perceived security maturity of </w:t>
       </w:r>
+      <w:proofErr w:type="gramStart"/>
       <w:r>
         <w:rPr>
           <w:bCs/>
@@ -5625,8 +7387,9 @@
           <w:sz w:val="12"/>
           <w:szCs w:val="12"/>
         </w:rPr>
-        <w:t>{{ customer_name }</w:t>
-      </w:r>
+        <w:t xml:space="preserve">{{ </w:t>
+      </w:r>
+      <w:proofErr w:type="spellStart"/>
       <w:r>
         <w:rPr>
           <w:bCs/>
@@ -5635,8 +7398,9 @@
           <w:sz w:val="12"/>
           <w:szCs w:val="12"/>
         </w:rPr>
-        <w:t xml:space="preserve">} </w:t>
-      </w:r>
+        <w:t>customer</w:t>
+      </w:r>
+      <w:proofErr w:type="gramEnd"/>
       <w:r>
         <w:rPr>
           <w:bCs/>
@@ -5645,6 +7409,49 @@
           <w:sz w:val="12"/>
           <w:szCs w:val="12"/>
         </w:rPr>
+        <w:t>_</w:t>
+      </w:r>
+      <w:proofErr w:type="gramStart"/>
+      <w:r>
+        <w:rPr>
+          <w:bCs/>
+          <w:i/>
+          <w:iCs/>
+          <w:sz w:val="12"/>
+          <w:szCs w:val="12"/>
+        </w:rPr>
+        <w:t>name</w:t>
+      </w:r>
+      <w:proofErr w:type="spellEnd"/>
+      <w:r>
+        <w:rPr>
+          <w:bCs/>
+          <w:i/>
+          <w:iCs/>
+          <w:sz w:val="12"/>
+          <w:szCs w:val="12"/>
+        </w:rPr>
+        <w:t xml:space="preserve"> }</w:t>
+      </w:r>
+      <w:proofErr w:type="gramEnd"/>
+      <w:r>
+        <w:rPr>
+          <w:bCs/>
+          <w:i/>
+          <w:iCs/>
+          <w:sz w:val="12"/>
+          <w:szCs w:val="12"/>
+        </w:rPr>
+        <w:t xml:space="preserve">} </w:t>
+      </w:r>
+      <w:r>
+        <w:rPr>
+          <w:bCs/>
+          <w:i/>
+          <w:iCs/>
+          <w:sz w:val="12"/>
+          <w:szCs w:val="12"/>
+        </w:rPr>
         <w:t>– this is meant as an illustration of potential risks only</w:t>
       </w:r>
     </w:p>
@@ -5663,12 +7470,53 @@
           <w:rFonts w:ascii="Roboto" w:hAnsi="Roboto"/>
         </w:rPr>
       </w:pPr>
+      <w:proofErr w:type="gramStart"/>
       <w:r>
         <w:rPr>
           <w:rStyle w:val="HTMLCode"/>
           <w:rFonts w:ascii="Roboto" w:hAnsi="Roboto"/>
         </w:rPr>
-        <w:t>{{ threat_scenarios }}</w:t>
+        <w:t xml:space="preserve">{{ </w:t>
+      </w:r>
+      <w:proofErr w:type="spellStart"/>
+      <w:r>
+        <w:rPr>
+          <w:rStyle w:val="HTMLCode"/>
+          <w:rFonts w:ascii="Roboto" w:hAnsi="Roboto"/>
+        </w:rPr>
+        <w:t>threat</w:t>
+      </w:r>
+      <w:proofErr w:type="gramEnd"/>
+      <w:r>
+        <w:rPr>
+          <w:rStyle w:val="HTMLCode"/>
+          <w:rFonts w:ascii="Roboto" w:hAnsi="Roboto"/>
+        </w:rPr>
+        <w:t>_</w:t>
+      </w:r>
+      <w:proofErr w:type="gramStart"/>
+      <w:r>
+        <w:rPr>
+          <w:rStyle w:val="HTMLCode"/>
+          <w:rFonts w:ascii="Roboto" w:hAnsi="Roboto"/>
+        </w:rPr>
+        <w:t>scenarios</w:t>
+      </w:r>
+      <w:proofErr w:type="spellEnd"/>
+      <w:r>
+        <w:rPr>
+          <w:rStyle w:val="HTMLCode"/>
+          <w:rFonts w:ascii="Roboto" w:hAnsi="Roboto"/>
+        </w:rPr>
+        <w:t xml:space="preserve"> }</w:t>
+      </w:r>
+      <w:proofErr w:type="gramEnd"/>
+      <w:r>
+        <w:rPr>
+          <w:rStyle w:val="HTMLCode"/>
+          <w:rFonts w:ascii="Roboto" w:hAnsi="Roboto"/>
+        </w:rPr>
+        <w:t>}</w:t>
       </w:r>
     </w:p>
     <w:p/>
@@ -6063,7 +7911,15 @@
     <w:p>
       <w:r>
         <w:lastRenderedPageBreak/>
-        <w:t xml:space="preserve">Since the beginning, we have built our business on first-class customer service and employing the best people available. We continue that ethos today, constantly building and maintaining our </w:t>
+        <w:t xml:space="preserve">Since the beginning, we have built our business on first-class customer service and employing the best people available. We continue that ethos today, constantly building and maintaining </w:t>
+      </w:r>
+      <w:proofErr w:type="gramStart"/>
+      <w:r>
+        <w:t>our</w:t>
+      </w:r>
+      <w:proofErr w:type="gramEnd"/>
+      <w:r>
+        <w:t xml:space="preserve"> </w:t>
       </w:r>
     </w:p>
     <w:p>
@@ -6323,12 +8179,53 @@
         </w:rPr>
         <w:t>[</w:t>
       </w:r>
+      <w:proofErr w:type="gramStart"/>
       <w:r>
         <w:rPr>
           <w:sz w:val="13"/>
           <w:szCs w:val="18"/>
         </w:rPr>
-        <w:t>{{ customer_name }}</w:t>
+        <w:t xml:space="preserve">{{ </w:t>
+      </w:r>
+      <w:proofErr w:type="spellStart"/>
+      <w:r>
+        <w:rPr>
+          <w:sz w:val="13"/>
+          <w:szCs w:val="18"/>
+        </w:rPr>
+        <w:t>customer</w:t>
+      </w:r>
+      <w:proofErr w:type="gramEnd"/>
+      <w:r>
+        <w:rPr>
+          <w:sz w:val="13"/>
+          <w:szCs w:val="18"/>
+        </w:rPr>
+        <w:t>_</w:t>
+      </w:r>
+      <w:proofErr w:type="gramStart"/>
+      <w:r>
+        <w:rPr>
+          <w:sz w:val="13"/>
+          <w:szCs w:val="18"/>
+        </w:rPr>
+        <w:t>name</w:t>
+      </w:r>
+      <w:proofErr w:type="spellEnd"/>
+      <w:r>
+        <w:rPr>
+          <w:sz w:val="13"/>
+          <w:szCs w:val="18"/>
+        </w:rPr>
+        <w:t xml:space="preserve"> }</w:t>
+      </w:r>
+      <w:proofErr w:type="gramEnd"/>
+      <w:r>
+        <w:rPr>
+          <w:sz w:val="13"/>
+          <w:szCs w:val="18"/>
+        </w:rPr>
+        <w:t>}</w:t>
       </w:r>
       <w:r>
         <w:rPr>
@@ -6562,12 +8459,21 @@
                                 <w:szCs w:val="18"/>
                               </w:rPr>
                             </w:pPr>
+                            <w:proofErr w:type="gramStart"/>
                             <w:r>
                               <w:rPr>
                                 <w:sz w:val="13"/>
                                 <w:szCs w:val="18"/>
                               </w:rPr>
-                              <w:t xml:space="preserve">In order to avoid delays to the project, </w:t>
+                              <w:t>In order to</w:t>
+                            </w:r>
+                            <w:proofErr w:type="gramEnd"/>
+                            <w:r>
+                              <w:rPr>
+                                <w:sz w:val="13"/>
+                                <w:szCs w:val="18"/>
+                              </w:rPr>
+                              <w:t xml:space="preserve"> avoid delays to the project, </w:t>
                             </w:r>
                             <w:r>
                               <w:rPr>
@@ -7094,7 +9000,23 @@
                                 <w:sz w:val="13"/>
                                 <w:szCs w:val="18"/>
                               </w:rPr>
-                              <w:t xml:space="preserve"> projects is planned and met.</w:t>
+                              <w:t xml:space="preserve"> projects </w:t>
+                            </w:r>
+                            <w:proofErr w:type="gramStart"/>
+                            <w:r>
+                              <w:rPr>
+                                <w:sz w:val="13"/>
+                                <w:szCs w:val="18"/>
+                              </w:rPr>
+                              <w:t>is</w:t>
+                            </w:r>
+                            <w:proofErr w:type="gramEnd"/>
+                            <w:r>
+                              <w:rPr>
+                                <w:sz w:val="13"/>
+                                <w:szCs w:val="18"/>
+                              </w:rPr>
+                              <w:t xml:space="preserve"> planned and met.</w:t>
                             </w:r>
                           </w:p>
                           <w:p>
@@ -9869,8 +11791,21 @@
             <w:r>
               <w:t xml:space="preserve"> </w:t>
             </w:r>
-            <w:r>
-              <w:t>{{ consultant_name }}</w:t>
+            <w:proofErr w:type="gramStart"/>
+            <w:r>
+              <w:t xml:space="preserve">{{ </w:t>
+            </w:r>
+            <w:proofErr w:type="spellStart"/>
+            <w:r>
+              <w:t>consultant</w:t>
+            </w:r>
+            <w:proofErr w:type="gramEnd"/>
+            <w:r>
+              <w:t>_name</w:t>
+            </w:r>
+            <w:proofErr w:type="spellEnd"/>
+            <w:r>
+              <w:t xml:space="preserve"> }}</w:t>
             </w:r>
           </w:p>
         </w:tc>
@@ -10591,11 +12526,38 @@
             <w:tcW w:w="2173" w:type="dxa"/>
           </w:tcPr>
           <w:p>
-            <w:r>
-              <w:t>J.Dell / A.</w:t>
-            </w:r>
-            <w:r>
-              <w:t>Sweeney / J.Towle / R. McClafferty</w:t>
+            <w:proofErr w:type="spellStart"/>
+            <w:proofErr w:type="gramStart"/>
+            <w:r>
+              <w:t>J.Dell</w:t>
+            </w:r>
+            <w:proofErr w:type="spellEnd"/>
+            <w:proofErr w:type="gramEnd"/>
+            <w:r>
+              <w:t xml:space="preserve"> / </w:t>
+            </w:r>
+            <w:proofErr w:type="spellStart"/>
+            <w:proofErr w:type="gramStart"/>
+            <w:r>
+              <w:t>A.</w:t>
+            </w:r>
+            <w:r>
+              <w:t>Sweeney</w:t>
+            </w:r>
+            <w:proofErr w:type="spellEnd"/>
+            <w:proofErr w:type="gramEnd"/>
+            <w:r>
+              <w:t xml:space="preserve"> / </w:t>
+            </w:r>
+            <w:proofErr w:type="spellStart"/>
+            <w:proofErr w:type="gramStart"/>
+            <w:r>
+              <w:t>J.Towle</w:t>
+            </w:r>
+            <w:proofErr w:type="spellEnd"/>
+            <w:proofErr w:type="gramEnd"/>
+            <w:r>
+              <w:t xml:space="preserve"> / R. McClafferty</w:t>
             </w:r>
           </w:p>
         </w:tc>
@@ -10636,8 +12598,21 @@
             <w:tcW w:w="2173" w:type="dxa"/>
           </w:tcPr>
           <w:p>
-            <w:r>
-              <w:t>{{ consultant_name }}</w:t>
+            <w:proofErr w:type="gramStart"/>
+            <w:r>
+              <w:t xml:space="preserve">{{ </w:t>
+            </w:r>
+            <w:proofErr w:type="spellStart"/>
+            <w:r>
+              <w:t>consultant</w:t>
+            </w:r>
+            <w:proofErr w:type="gramEnd"/>
+            <w:r>
+              <w:t>_name</w:t>
+            </w:r>
+            <w:proofErr w:type="spellEnd"/>
+            <w:r>
+              <w:t xml:space="preserve"> }}</w:t>
             </w:r>
           </w:p>
         </w:tc>
@@ -10831,8 +12806,29 @@
             </w:tcBorders>
           </w:tcPr>
           <w:p>
-            <w:r>
-              <w:t>{{ customer_name }}</w:t>
+            <w:proofErr w:type="gramStart"/>
+            <w:r>
+              <w:t xml:space="preserve">{{ </w:t>
+            </w:r>
+            <w:proofErr w:type="spellStart"/>
+            <w:r>
+              <w:t>customer</w:t>
+            </w:r>
+            <w:proofErr w:type="gramEnd"/>
+            <w:r>
+              <w:t>_</w:t>
+            </w:r>
+            <w:proofErr w:type="gramStart"/>
+            <w:r>
+              <w:t>name</w:t>
+            </w:r>
+            <w:proofErr w:type="spellEnd"/>
+            <w:r>
+              <w:t xml:space="preserve"> }</w:t>
+            </w:r>
+            <w:proofErr w:type="gramEnd"/>
+            <w:r>
+              <w:t>}</w:t>
             </w:r>
           </w:p>
           <w:p/>
@@ -11882,7 +13878,25 @@
                                 <w:sz w:val="15"/>
                                 <w:szCs w:val="15"/>
                               </w:rPr>
-                              <w:t>Planet IT Limited makes no representations or warranties with respect to the contents or use of this document, and specifically disclaims any express or implied warranties of merchantability or fitness for any purpose. </w:t>
+                              <w:t xml:space="preserve">Planet IT Limited makes no representations or warranties with respect to the contents or use of this </w:t>
+                            </w:r>
+                            <w:proofErr w:type="gramStart"/>
+                            <w:r>
+                              <w:rPr>
+                                <w:color w:val="FFFFFF" w:themeColor="background1"/>
+                                <w:sz w:val="15"/>
+                                <w:szCs w:val="15"/>
+                              </w:rPr>
+                              <w:t>document, and</w:t>
+                            </w:r>
+                            <w:proofErr w:type="gramEnd"/>
+                            <w:r>
+                              <w:rPr>
+                                <w:color w:val="FFFFFF" w:themeColor="background1"/>
+                                <w:sz w:val="15"/>
+                                <w:szCs w:val="15"/>
+                              </w:rPr>
+                              <w:t xml:space="preserve"> specifically disclaims any express or implied warranties of merchantability or fitness for any purpose. </w:t>
                             </w:r>
                           </w:p>
                           <w:p>
@@ -14413,6 +16427,19 @@
 </file>
 
 <file path=customXml/item1.xml><?xml version="1.0" encoding="utf-8"?>
+<b:Sources xmlns:b="http://schemas.openxmlformats.org/officeDocument/2006/bibliography" xmlns="http://schemas.openxmlformats.org/officeDocument/2006/bibliography" SelectedStyle="\APASixthEditionOfficeOnline.xsl" StyleName="APA" Version="6"/>
+</file>
+
+<file path=customXml/item2.xml><?xml version="1.0" encoding="utf-8"?>
+<?mso-contentType ?>
+<FormTemplates xmlns="http://schemas.microsoft.com/sharepoint/v3/contenttype/forms">
+  <Display>DocumentLibraryForm</Display>
+  <Edit>DocumentLibraryForm</Edit>
+  <New>DocumentLibraryForm</New>
+</FormTemplates>
+</file>
+
+<file path=customXml/item3.xml><?xml version="1.0" encoding="utf-8"?>
 <p:properties xmlns:p="http://schemas.microsoft.com/office/2006/metadata/properties" xmlns:xsi="http://www.w3.org/2001/XMLSchema-instance" xmlns:pc="http://schemas.microsoft.com/office/infopath/2007/PartnerControls">
   <documentManagement>
     <_ip_UnifiedCompliancePolicyUIAction xmlns="http://schemas.microsoft.com/sharepoint/v3" xsi:nil="true"/>
@@ -14452,7 +16479,7 @@
 </p:properties>
 </file>
 
-<file path=customXml/item2.xml><?xml version="1.0" encoding="utf-8"?>
+<file path=customXml/item4.xml><?xml version="1.0" encoding="utf-8"?>
 <ct:contentTypeSchema xmlns:ct="http://schemas.microsoft.com/office/2006/metadata/contentType" xmlns:ma="http://schemas.microsoft.com/office/2006/metadata/properties/metaAttributes" ct:_="" ma:_="" ma:contentTypeName="Document" ma:contentTypeID="0x01010035785702D987474A98E5EB52BEDD3AA6" ma:contentTypeVersion="19" ma:contentTypeDescription="Create a new document." ma:contentTypeScope="" ma:versionID="7475e8a14b23e3b44613142ca3702c71">
   <xsd:schema xmlns:xsd="http://www.w3.org/2001/XMLSchema" xmlns:xs="http://www.w3.org/2001/XMLSchema" xmlns:p="http://schemas.microsoft.com/office/2006/metadata/properties" xmlns:ns1="http://schemas.microsoft.com/sharepoint/v3" xmlns:ns2="bc555557-3e8b-4e67-83dc-4a843c87bf48" xmlns:ns3="13e5e634-19bb-4da3-8eb1-d732f895062a" targetNamespace="http://schemas.microsoft.com/office/2006/metadata/properties" ma:root="true" ma:fieldsID="a0e591cb8f16aef1e2d445ad70521c76" ns1:_="" ns2:_="" ns3:_="">
     <xsd:import namespace="http://schemas.microsoft.com/sharepoint/v3"/>
@@ -14710,20 +16737,23 @@
 </ct:contentTypeSchema>
 </file>
 
-<file path=customXml/item3.xml><?xml version="1.0" encoding="utf-8"?>
-<?mso-contentType ?>
-<FormTemplates xmlns="http://schemas.microsoft.com/sharepoint/v3/contenttype/forms">
-  <Display>DocumentLibraryForm</Display>
-  <Edit>DocumentLibraryForm</Edit>
-  <New>DocumentLibraryForm</New>
-</FormTemplates>
+<file path=customXml/itemProps1.xml><?xml version="1.0" encoding="utf-8"?>
+<ds:datastoreItem xmlns:ds="http://schemas.openxmlformats.org/officeDocument/2006/customXml" ds:itemID="{41B34B53-803B-4600-951E-8C7B6ABDE6A5}">
+  <ds:schemaRefs>
+    <ds:schemaRef ds:uri="http://schemas.openxmlformats.org/officeDocument/2006/bibliography"/>
+  </ds:schemaRefs>
+</ds:datastoreItem>
 </file>
 
-<file path=customXml/item4.xml><?xml version="1.0" encoding="utf-8"?>
-<b:Sources xmlns:b="http://schemas.openxmlformats.org/officeDocument/2006/bibliography" xmlns="http://schemas.openxmlformats.org/officeDocument/2006/bibliography" SelectedStyle="\APASixthEditionOfficeOnline.xsl" StyleName="APA" Version="6"/>
+<file path=customXml/itemProps2.xml><?xml version="1.0" encoding="utf-8"?>
+<ds:datastoreItem xmlns:ds="http://schemas.openxmlformats.org/officeDocument/2006/customXml" ds:itemID="{02C30E68-946A-4504-B925-FF5230B8A4C3}">
+  <ds:schemaRefs>
+    <ds:schemaRef ds:uri="http://schemas.microsoft.com/sharepoint/v3/contenttype/forms"/>
+  </ds:schemaRefs>
+</ds:datastoreItem>
 </file>
 
-<file path=customXml/itemProps1.xml><?xml version="1.0" encoding="utf-8"?>
+<file path=customXml/itemProps3.xml><?xml version="1.0" encoding="utf-8"?>
 <ds:datastoreItem xmlns:ds="http://schemas.openxmlformats.org/officeDocument/2006/customXml" ds:itemID="{EDF12601-A8A7-4B7A-9481-1111248E774A}">
   <ds:schemaRefs>
     <ds:schemaRef ds:uri="http://schemas.microsoft.com/office/2006/metadata/properties"/>
@@ -14735,7 +16765,7 @@
 </ds:datastoreItem>
 </file>
 
-<file path=customXml/itemProps2.xml><?xml version="1.0" encoding="utf-8"?>
+<file path=customXml/itemProps4.xml><?xml version="1.0" encoding="utf-8"?>
 <ds:datastoreItem xmlns:ds="http://schemas.openxmlformats.org/officeDocument/2006/customXml" ds:itemID="{7F9D1B01-7FEE-4553-9877-3B31209422E5}">
   <ds:schemaRefs>
     <ds:schemaRef ds:uri="http://schemas.microsoft.com/office/2006/metadata/contentType"/>
@@ -14753,20 +16783,4 @@
     <ds:schemaRef ds:uri="http://schemas.microsoft.com/internal/obd"/>
   </ds:schemaRefs>
 </ds:datastoreItem>
-</file>
-
-<file path=customXml/itemProps3.xml><?xml version="1.0" encoding="utf-8"?>
-<ds:datastoreItem xmlns:ds="http://schemas.openxmlformats.org/officeDocument/2006/customXml" ds:itemID="{02C30E68-946A-4504-B925-FF5230B8A4C3}">
-  <ds:schemaRefs>
-    <ds:schemaRef ds:uri="http://schemas.microsoft.com/sharepoint/v3/contenttype/forms"/>
-  </ds:schemaRefs>
-</ds:datastoreItem>
-</file>
-
-<file path=customXml/itemProps4.xml><?xml version="1.0" encoding="utf-8"?>
-<ds:datastoreItem xmlns:ds="http://schemas.openxmlformats.org/officeDocument/2006/customXml" ds:itemID="{41B34B53-803B-4600-951E-8C7B6ABDE6A5}">
-  <ds:schemaRefs>
-    <ds:schemaRef ds:uri="http://schemas.openxmlformats.org/officeDocument/2006/bibliography"/>
-  </ds:schemaRefs>
-</ds:datastoreItem>
 </file>
</xml_diff>